<commit_message>
Add API usage and cost by volume to lead routing docs
Co-Authored-By: Claude Opus 5.5 <noreply@anthropic.com>
Claude-Session: https://claude.ai/code/session_016MSitiN4QkJHe8WqEGz9RU
</commit_message>
<xml_diff>
--- a/lead-routing/Momos Lead Routing - Technical Documentation.docx
+++ b/lead-routing/Momos Lead Routing - Technical Documentation.docx
@@ -2,7 +2,7 @@
 <file path=word/document.xml><?xml version="1.0" encoding="utf-8"?>
 <w:document xmlns:w="http://schemas.openxmlformats.org/wordprocessingml/2006/main" xmlns:m="http://schemas.openxmlformats.org/officeDocument/2006/math" xmlns:r="http://schemas.openxmlformats.org/officeDocument/2006/relationships" xmlns:o="urn:schemas-microsoft-com:office:office" xmlns:v="urn:schemas-microsoft-com:vml" xmlns:w10="urn:schemas-microsoft-com:office:word" xmlns:a="http://schemas.openxmlformats.org/drawingml/2006/main" xmlns:pic="http://schemas.openxmlformats.org/drawingml/2006/picture" xmlns:wp="http://schemas.openxmlformats.org/drawingml/2006/wordprocessingDrawing">
   <w:body>
-    <w:bookmarkStart w:id="51" w:name="Xba61053c79fb0009eef1df48de2075ca281eeac"/>
+    <w:bookmarkStart w:id="58" w:name="Xba61053c79fb0009eef1df48de2075ca281eeac"/>
     <w:p>
       <w:pPr>
         <w:pStyle w:val="Heading1"/>
@@ -253,7 +253,7 @@
               <w:jc w:val="left"/>
             </w:pPr>
             <w:r>
-              <w:t xml:space="preserve">Fractions of a cent per lead for the fit check. The research adds a few cents per real lead (web searches are billed). First day of testing: $0.01 total.</w:t>
+              <w:t xml:space="preserve">About $0.0001 per lead for the fit check and about $0.15 per real lead for the research. Roughly $13 a month at 100 submissions, $128 at 1,000. See section 17.</w:t>
             </w:r>
           </w:p>
         </w:tc>
@@ -7218,7 +7218,7 @@
         <w:t xml:space="preserve"> </w:t>
       </w:r>
       <w:r>
-        <w:t xml:space="preserve">check Console → Cost, grouped by model. Haiku should show for every lead; Opus and web search should show when research is running.</w:t>
+        <w:t xml:space="preserve">check Console → Cost, grouped by model. Haiku should show for every lead; Opus and web search should show when research is running. Estimates by volume and suggested spend limits are in section 17.</w:t>
       </w:r>
     </w:p>
     <w:p>
@@ -9635,8 +9635,2317 @@
         <w:t xml:space="preserve">After a few real leads, check the Console shows Opus and web search costs. If only Haiku shows, the research isn't running.</w:t>
       </w:r>
     </w:p>
+    <w:p>
+      <w:r>
+        <w:pict>
+          <v:rect style="width:0;height:1.5pt" o:hralign="center" o:hrstd="t" o:hr="t"/>
+        </w:pict>
+      </w:r>
+    </w:p>
     <w:bookmarkEnd w:id="50"/>
+    <w:bookmarkStart w:id="57" w:name="X0f35b783bdb3b7ab7e78ae135dee3de71f4b322"/>
+    <w:p>
+      <w:pPr>
+        <w:pStyle w:val="Heading2"/>
+      </w:pPr>
+      <w:r>
+        <w:t xml:space="preserve">17. API usage and cost by volume</w:t>
+      </w:r>
+    </w:p>
+    <w:bookmarkStart w:id="51" w:name="X5c0e2ed2640c19aabca4685311306812fc595eb"/>
+    <w:p>
+      <w:pPr>
+        <w:pStyle w:val="Heading3"/>
+      </w:pPr>
+      <w:r>
+        <w:t xml:space="preserve">Prices used (Anthropic list prices, October 2026)</w:t>
+      </w:r>
+    </w:p>
+    <w:tbl>
+      <w:tblPr>
+        <w:tblStyle w:val="Table"/>
+        <w:tblW w:type="auto" w:w="0"/>
+        <w:tblLook w:firstRow="1" w:lastRow="0" w:firstColumn="0" w:lastColumn="0" w:noHBand="0" w:noVBand="0" w:val="0020"/>
+        <w:jc w:val="start"/>
+      </w:tblPr>
+      <w:tblGrid>
+        <w:gridCol w:w="3960"/>
+        <w:gridCol w:w="3960"/>
+      </w:tblGrid>
+      <w:tr>
+        <w:trPr>
+          <w:tblHeader w:val="true"/>
+        </w:trPr>
+        <w:tc>
+          <w:tcPr/>
+          <w:p>
+            <w:pPr>
+              <w:pStyle w:val="Compact"/>
+              <w:jc w:val="left"/>
+            </w:pPr>
+            <w:r>
+              <w:t xml:space="preserve">Item</w:t>
+            </w:r>
+          </w:p>
+        </w:tc>
+        <w:tc>
+          <w:tcPr/>
+          <w:p>
+            <w:pPr>
+              <w:pStyle w:val="Compact"/>
+              <w:jc w:val="left"/>
+            </w:pPr>
+            <w:r>
+              <w:t xml:space="preserve">Price</w:t>
+            </w:r>
+          </w:p>
+        </w:tc>
+      </w:tr>
+      <w:tr>
+        <w:tc>
+          <w:tcPr/>
+          <w:p>
+            <w:pPr>
+              <w:pStyle w:val="Compact"/>
+              <w:jc w:val="left"/>
+            </w:pPr>
+            <w:r>
+              <w:t xml:space="preserve">Claude Haiku 5.5 (fit check)</w:t>
+            </w:r>
+          </w:p>
+        </w:tc>
+        <w:tc>
+          <w:tcPr/>
+          <w:p>
+            <w:pPr>
+              <w:pStyle w:val="Compact"/>
+              <w:jc w:val="left"/>
+            </w:pPr>
+            <w:r>
+              <w:t xml:space="preserve">$0.10 per million input tokens · $0.50 per million output tokens</w:t>
+            </w:r>
+          </w:p>
+        </w:tc>
+      </w:tr>
+      <w:tr>
+        <w:tc>
+          <w:tcPr/>
+          <w:p>
+            <w:pPr>
+              <w:pStyle w:val="Compact"/>
+              <w:jc w:val="left"/>
+            </w:pPr>
+            <w:r>
+              <w:t xml:space="preserve">Claude Opus 5.5 (research)</w:t>
+            </w:r>
+          </w:p>
+        </w:tc>
+        <w:tc>
+          <w:tcPr/>
+          <w:p>
+            <w:pPr>
+              <w:pStyle w:val="Compact"/>
+              <w:jc w:val="left"/>
+            </w:pPr>
+            <w:r>
+              <w:t xml:space="preserve">$4 per million input tokens · $20 per million output tokens</w:t>
+            </w:r>
+          </w:p>
+        </w:tc>
+      </w:tr>
+      <w:tr>
+        <w:tc>
+          <w:tcPr/>
+          <w:p>
+            <w:pPr>
+              <w:pStyle w:val="Compact"/>
+              <w:jc w:val="left"/>
+            </w:pPr>
+            <w:r>
+              <w:t xml:space="preserve">Web search</w:t>
+            </w:r>
+          </w:p>
+        </w:tc>
+        <w:tc>
+          <w:tcPr/>
+          <w:p>
+            <w:pPr>
+              <w:pStyle w:val="Compact"/>
+              <w:jc w:val="left"/>
+            </w:pPr>
+            <m:oMath>
+              <m:r>
+                <m:t>10</m:t>
+              </m:r>
+              <m:r>
+                <m:t>p</m:t>
+              </m:r>
+              <m:r>
+                <m:t>e</m:t>
+              </m:r>
+              <m:r>
+                <m:t>r</m:t>
+              </m:r>
+              <m:r>
+                <m:t>1</m:t>
+              </m:r>
+              <m:r>
+                <m:rPr>
+                  <m:sty m:val="p"/>
+                </m:rPr>
+                <m:t>,</m:t>
+              </m:r>
+              <m:r>
+                <m:t>000</m:t>
+              </m:r>
+              <m:r>
+                <m:t>s</m:t>
+              </m:r>
+              <m:r>
+                <m:t>e</m:t>
+              </m:r>
+              <m:r>
+                <m:t>a</m:t>
+              </m:r>
+              <m:r>
+                <m:t>r</m:t>
+              </m:r>
+              <m:r>
+                <m:t>c</m:t>
+              </m:r>
+              <m:r>
+                <m:t>h</m:t>
+              </m:r>
+              <m:r>
+                <m:t>e</m:t>
+              </m:r>
+              <m:r>
+                <m:t>s</m:t>
+              </m:r>
+              <m:r>
+                <m:rPr>
+                  <m:sty m:val="p"/>
+                </m:rPr>
+                <m:t>(</m:t>
+              </m:r>
+            </m:oMath>
+            <w:r>
+              <w:t xml:space="preserve">0.01 each)</w:t>
+            </w:r>
+          </w:p>
+        </w:tc>
+      </w:tr>
+      <w:tr>
+        <w:tc>
+          <w:tcPr/>
+          <w:p>
+            <w:pPr>
+              <w:pStyle w:val="Compact"/>
+              <w:jc w:val="left"/>
+            </w:pPr>
+            <w:r>
+              <w:t xml:space="preserve">Code execution used by web search filtering</w:t>
+            </w:r>
+          </w:p>
+        </w:tc>
+        <w:tc>
+          <w:tcPr/>
+          <w:p>
+            <w:pPr>
+              <w:pStyle w:val="Compact"/>
+              <w:jc w:val="left"/>
+            </w:pPr>
+            <w:r>
+              <w:t xml:space="preserve">Free when used with web search</w:t>
+            </w:r>
+          </w:p>
+        </w:tc>
+      </w:tr>
+    </w:tbl>
+    <w:p>
+      <w:pPr>
+        <w:pStyle w:val="BodyText"/>
+      </w:pPr>
+      <w:r>
+        <w:t xml:space="preserve">Check console.anthropic.com → Cost against these once a month. Prices can change.</w:t>
+      </w:r>
+    </w:p>
     <w:bookmarkEnd w:id="51"/>
+    <w:bookmarkStart w:id="52" w:name="what-one-lead-costs"/>
+    <w:p>
+      <w:pPr>
+        <w:pStyle w:val="Heading3"/>
+      </w:pPr>
+      <w:r>
+        <w:t xml:space="preserve">What one lead costs</w:t>
+      </w:r>
+    </w:p>
+    <w:p>
+      <w:pPr>
+        <w:pStyle w:val="FirstParagraph"/>
+      </w:pPr>
+      <w:r>
+        <w:rPr>
+          <w:bCs/>
+          <w:b/>
+        </w:rPr>
+        <w:t xml:space="preserve">Spam</w:t>
+      </w:r>
+      <w:r>
+        <w:t xml:space="preserve"> </w:t>
+      </w:r>
+      <w:r>
+        <w:t xml:space="preserve">(honeypot, too fast, disposable email, junk text) is stopped in the Worker before Claude is called.</w:t>
+      </w:r>
+      <w:r>
+        <w:t xml:space="preserve"> </w:t>
+      </w:r>
+      <w:r>
+        <w:rPr>
+          <w:bCs/>
+          <w:b/>
+        </w:rPr>
+        <w:t xml:space="preserve">Cost: $0.</w:t>
+      </w:r>
+    </w:p>
+    <w:p>
+      <w:pPr>
+        <w:pStyle w:val="BodyText"/>
+      </w:pPr>
+      <w:r>
+        <w:rPr>
+          <w:bCs/>
+          <w:b/>
+        </w:rPr>
+        <w:t xml:space="preserve">Fit check (Haiku, every non-spam lead)</w:t>
+      </w:r>
+    </w:p>
+    <w:tbl>
+      <w:tblPr>
+        <w:tblStyle w:val="Table"/>
+        <w:tblW w:type="auto" w:w="0"/>
+        <w:tblLook w:firstRow="1" w:lastRow="0" w:firstColumn="0" w:lastColumn="0" w:noHBand="0" w:noVBand="0" w:val="0020"/>
+        <w:jc w:val="start"/>
+      </w:tblPr>
+      <w:tblGrid>
+        <w:gridCol w:w="2640"/>
+        <w:gridCol w:w="2640"/>
+        <w:gridCol w:w="2640"/>
+      </w:tblGrid>
+      <w:tr>
+        <w:trPr>
+          <w:tblHeader w:val="true"/>
+        </w:trPr>
+        <w:tc>
+          <w:tcPr/>
+          <w:p>
+            <w:pPr>
+              <w:pStyle w:val="Compact"/>
+            </w:pPr>
+          </w:p>
+        </w:tc>
+        <w:tc>
+          <w:tcPr/>
+          <w:p>
+            <w:pPr>
+              <w:pStyle w:val="Compact"/>
+              <w:jc w:val="left"/>
+            </w:pPr>
+            <w:r>
+              <w:t xml:space="preserve">Tokens</w:t>
+            </w:r>
+          </w:p>
+        </w:tc>
+        <w:tc>
+          <w:tcPr/>
+          <w:p>
+            <w:pPr>
+              <w:pStyle w:val="Compact"/>
+              <w:jc w:val="left"/>
+            </w:pPr>
+            <w:r>
+              <w:t xml:space="preserve">Cost</w:t>
+            </w:r>
+          </w:p>
+        </w:tc>
+      </w:tr>
+      <w:tr>
+        <w:tc>
+          <w:tcPr/>
+          <w:p>
+            <w:pPr>
+              <w:pStyle w:val="Compact"/>
+              <w:jc w:val="left"/>
+            </w:pPr>
+            <w:r>
+              <w:t xml:space="preserve">Input: instructions + lead</w:t>
+            </w:r>
+          </w:p>
+        </w:tc>
+        <w:tc>
+          <w:tcPr/>
+          <w:p>
+            <w:pPr>
+              <w:pStyle w:val="Compact"/>
+              <w:jc w:val="left"/>
+            </w:pPr>
+            <w:r>
+              <w:t xml:space="preserve">~700</w:t>
+            </w:r>
+          </w:p>
+        </w:tc>
+        <w:tc>
+          <w:tcPr/>
+          <w:p>
+            <w:pPr>
+              <w:pStyle w:val="Compact"/>
+              <w:jc w:val="left"/>
+            </w:pPr>
+            <w:r>
+              <w:t xml:space="preserve">$0.00007</w:t>
+            </w:r>
+          </w:p>
+        </w:tc>
+      </w:tr>
+      <w:tr>
+        <w:tc>
+          <w:tcPr/>
+          <w:p>
+            <w:pPr>
+              <w:pStyle w:val="Compact"/>
+              <w:jc w:val="left"/>
+            </w:pPr>
+            <w:r>
+              <w:t xml:space="preserve">Output: verdict JSON</w:t>
+            </w:r>
+          </w:p>
+        </w:tc>
+        <w:tc>
+          <w:tcPr/>
+          <w:p>
+            <w:pPr>
+              <w:pStyle w:val="Compact"/>
+              <w:jc w:val="left"/>
+            </w:pPr>
+            <w:r>
+              <w:t xml:space="preserve">~60</w:t>
+            </w:r>
+          </w:p>
+        </w:tc>
+        <w:tc>
+          <w:tcPr/>
+          <w:p>
+            <w:pPr>
+              <w:pStyle w:val="Compact"/>
+              <w:jc w:val="left"/>
+            </w:pPr>
+            <w:r>
+              <w:t xml:space="preserve">$0.00003</w:t>
+            </w:r>
+          </w:p>
+        </w:tc>
+      </w:tr>
+      <w:tr>
+        <w:tc>
+          <w:tcPr/>
+          <w:p>
+            <w:pPr>
+              <w:pStyle w:val="Compact"/>
+              <w:jc w:val="left"/>
+            </w:pPr>
+            <w:r>
+              <w:rPr>
+                <w:bCs/>
+                <w:b/>
+              </w:rPr>
+              <w:t xml:space="preserve">Per lead</w:t>
+            </w:r>
+          </w:p>
+        </w:tc>
+        <w:tc>
+          <w:tcPr/>
+          <w:p>
+            <w:pPr>
+              <w:pStyle w:val="Compact"/>
+            </w:pPr>
+          </w:p>
+        </w:tc>
+        <w:tc>
+          <w:tcPr/>
+          <w:p>
+            <w:pPr>
+              <w:pStyle w:val="Compact"/>
+              <w:jc w:val="left"/>
+            </w:pPr>
+            <w:r>
+              <w:rPr>
+                <w:bCs/>
+                <w:b/>
+              </w:rPr>
+              <w:t xml:space="preserve">~$0.0001</w:t>
+            </w:r>
+            <w:r>
+              <w:t xml:space="preserve"> </w:t>
+            </w:r>
+            <w:r>
+              <w:t xml:space="preserve">(10,000 leads ≈ $1)</w:t>
+            </w:r>
+          </w:p>
+        </w:tc>
+      </w:tr>
+    </w:tbl>
+    <w:p>
+      <w:pPr>
+        <w:pStyle w:val="BodyText"/>
+      </w:pPr>
+      <w:r>
+        <w:rPr>
+          <w:bCs/>
+          <w:b/>
+        </w:rPr>
+        <w:t xml:space="preserve">Research (Opus + web search, every non-spam lead, including not-fits)</w:t>
+      </w:r>
+    </w:p>
+    <w:p>
+      <w:pPr>
+        <w:pStyle w:val="BodyText"/>
+      </w:pPr>
+      <w:r>
+        <w:t xml:space="preserve">Search results are added to Claude's input, which is why input tokens are the biggest part.</w:t>
+      </w:r>
+    </w:p>
+    <w:tbl>
+      <w:tblPr>
+        <w:tblStyle w:val="Table"/>
+        <w:tblW w:type="auto" w:w="0"/>
+        <w:tblLook w:firstRow="1" w:lastRow="0" w:firstColumn="0" w:lastColumn="0" w:noHBand="0" w:noVBand="0" w:val="0020"/>
+        <w:jc w:val="start"/>
+      </w:tblPr>
+      <w:tblGrid>
+        <w:gridCol w:w="1980"/>
+        <w:gridCol w:w="1980"/>
+        <w:gridCol w:w="1980"/>
+        <w:gridCol w:w="1980"/>
+      </w:tblGrid>
+      <w:tr>
+        <w:trPr>
+          <w:tblHeader w:val="true"/>
+        </w:trPr>
+        <w:tc>
+          <w:tcPr/>
+          <w:p>
+            <w:pPr>
+              <w:pStyle w:val="Compact"/>
+            </w:pPr>
+          </w:p>
+        </w:tc>
+        <w:tc>
+          <w:tcPr/>
+          <w:p>
+            <w:pPr>
+              <w:pStyle w:val="Compact"/>
+              <w:jc w:val="left"/>
+            </w:pPr>
+            <w:r>
+              <w:t xml:space="preserve">Light</w:t>
+            </w:r>
+          </w:p>
+        </w:tc>
+        <w:tc>
+          <w:tcPr/>
+          <w:p>
+            <w:pPr>
+              <w:pStyle w:val="Compact"/>
+              <w:jc w:val="left"/>
+            </w:pPr>
+            <w:r>
+              <w:t xml:space="preserve">Typical</w:t>
+            </w:r>
+          </w:p>
+        </w:tc>
+        <w:tc>
+          <w:tcPr/>
+          <w:p>
+            <w:pPr>
+              <w:pStyle w:val="Compact"/>
+              <w:jc w:val="left"/>
+            </w:pPr>
+            <w:r>
+              <w:t xml:space="preserve">Heavy</w:t>
+            </w:r>
+          </w:p>
+        </w:tc>
+      </w:tr>
+      <w:tr>
+        <w:tc>
+          <w:tcPr/>
+          <w:p>
+            <w:pPr>
+              <w:pStyle w:val="Compact"/>
+              <w:jc w:val="left"/>
+            </w:pPr>
+            <w:r>
+              <w:t xml:space="preserve">When</w:t>
+            </w:r>
+          </w:p>
+        </w:tc>
+        <w:tc>
+          <w:tcPr/>
+          <w:p>
+            <w:pPr>
+              <w:pStyle w:val="Compact"/>
+              <w:jc w:val="left"/>
+            </w:pPr>
+            <w:r>
+              <w:t xml:space="preserve">Well-known brand, found on 1st search</w:t>
+            </w:r>
+          </w:p>
+        </w:tc>
+        <w:tc>
+          <w:tcPr/>
+          <w:p>
+            <w:pPr>
+              <w:pStyle w:val="Compact"/>
+              <w:jc w:val="left"/>
+            </w:pPr>
+            <w:r>
+              <w:t xml:space="preserve">Most leads</w:t>
+            </w:r>
+          </w:p>
+        </w:tc>
+        <w:tc>
+          <w:tcPr/>
+          <w:p>
+            <w:pPr>
+              <w:pStyle w:val="Compact"/>
+              <w:jc w:val="left"/>
+            </w:pPr>
+            <w:r>
+              <w:t xml:space="preserve">Unknown or odd lead, all 3 searches, turn paused and continued</w:t>
+            </w:r>
+          </w:p>
+        </w:tc>
+      </w:tr>
+      <w:tr>
+        <w:tc>
+          <w:tcPr/>
+          <w:p>
+            <w:pPr>
+              <w:pStyle w:val="Compact"/>
+              <w:jc w:val="left"/>
+            </w:pPr>
+            <w:r>
+              <w:t xml:space="preserve">Searches</w:t>
+            </w:r>
+          </w:p>
+        </w:tc>
+        <w:tc>
+          <w:tcPr/>
+          <w:p>
+            <w:pPr>
+              <w:pStyle w:val="Compact"/>
+              <w:jc w:val="left"/>
+            </w:pPr>
+            <w:r>
+              <w:t xml:space="preserve">1 ($0.01)</w:t>
+            </w:r>
+          </w:p>
+        </w:tc>
+        <w:tc>
+          <w:tcPr/>
+          <w:p>
+            <w:pPr>
+              <w:pStyle w:val="Compact"/>
+              <w:jc w:val="left"/>
+            </w:pPr>
+            <w:r>
+              <w:t xml:space="preserve">2 ($0.02)</w:t>
+            </w:r>
+          </w:p>
+        </w:tc>
+        <w:tc>
+          <w:tcPr/>
+          <w:p>
+            <w:pPr>
+              <w:pStyle w:val="Compact"/>
+              <w:jc w:val="left"/>
+            </w:pPr>
+            <w:r>
+              <w:t xml:space="preserve">3 ($0.03)</w:t>
+            </w:r>
+          </w:p>
+        </w:tc>
+      </w:tr>
+      <w:tr>
+        <w:tc>
+          <w:tcPr/>
+          <w:p>
+            <w:pPr>
+              <w:pStyle w:val="Compact"/>
+              <w:jc w:val="left"/>
+            </w:pPr>
+            <w:r>
+              <w:t xml:space="preserve">Input tokens (incl. search results)</w:t>
+            </w:r>
+          </w:p>
+        </w:tc>
+        <w:tc>
+          <w:tcPr/>
+          <w:p>
+            <w:pPr>
+              <w:pStyle w:val="Compact"/>
+              <w:jc w:val="left"/>
+            </w:pPr>
+            <w:r>
+              <w:t xml:space="preserve">~10,000 ($0.04)</w:t>
+            </w:r>
+          </w:p>
+        </w:tc>
+        <w:tc>
+          <w:tcPr/>
+          <w:p>
+            <w:pPr>
+              <w:pStyle w:val="Compact"/>
+              <w:jc w:val="left"/>
+            </w:pPr>
+            <w:r>
+              <w:t xml:space="preserve">~25,000 ($0.10)</w:t>
+            </w:r>
+          </w:p>
+        </w:tc>
+        <w:tc>
+          <w:tcPr/>
+          <w:p>
+            <w:pPr>
+              <w:pStyle w:val="Compact"/>
+              <w:jc w:val="left"/>
+            </w:pPr>
+            <w:r>
+              <w:t xml:space="preserve">~50,000 ($0.20)</w:t>
+            </w:r>
+          </w:p>
+        </w:tc>
+      </w:tr>
+      <w:tr>
+        <w:tc>
+          <w:tcPr/>
+          <w:p>
+            <w:pPr>
+              <w:pStyle w:val="Compact"/>
+              <w:jc w:val="left"/>
+            </w:pPr>
+            <w:r>
+              <w:t xml:space="preserve">Output tokens (thinking + JSON)</w:t>
+            </w:r>
+          </w:p>
+        </w:tc>
+        <w:tc>
+          <w:tcPr/>
+          <w:p>
+            <w:pPr>
+              <w:pStyle w:val="Compact"/>
+              <w:jc w:val="left"/>
+            </w:pPr>
+            <w:r>
+              <w:t xml:space="preserve">~1,000 ($0.02)</w:t>
+            </w:r>
+          </w:p>
+        </w:tc>
+        <w:tc>
+          <w:tcPr/>
+          <w:p>
+            <w:pPr>
+              <w:pStyle w:val="Compact"/>
+              <w:jc w:val="left"/>
+            </w:pPr>
+            <w:r>
+              <w:t xml:space="preserve">~1,500 ($0.03)</w:t>
+            </w:r>
+          </w:p>
+        </w:tc>
+        <w:tc>
+          <w:tcPr/>
+          <w:p>
+            <w:pPr>
+              <w:pStyle w:val="Compact"/>
+              <w:jc w:val="left"/>
+            </w:pPr>
+            <w:r>
+              <w:t xml:space="preserve">~3,000 ($0.06)</w:t>
+            </w:r>
+          </w:p>
+        </w:tc>
+      </w:tr>
+      <w:tr>
+        <w:tc>
+          <w:tcPr/>
+          <w:p>
+            <w:pPr>
+              <w:pStyle w:val="Compact"/>
+              <w:jc w:val="left"/>
+            </w:pPr>
+            <w:r>
+              <w:rPr>
+                <w:bCs/>
+                <w:b/>
+              </w:rPr>
+              <w:t xml:space="preserve">Per lead</w:t>
+            </w:r>
+          </w:p>
+        </w:tc>
+        <w:tc>
+          <w:tcPr/>
+          <w:p>
+            <w:pPr>
+              <w:pStyle w:val="Compact"/>
+              <w:jc w:val="left"/>
+            </w:pPr>
+            <w:r>
+              <w:rPr>
+                <w:bCs/>
+                <w:b/>
+              </w:rPr>
+              <w:t xml:space="preserve">~$0.07</w:t>
+            </w:r>
+          </w:p>
+        </w:tc>
+        <w:tc>
+          <w:tcPr/>
+          <w:p>
+            <w:pPr>
+              <w:pStyle w:val="Compact"/>
+              <w:jc w:val="left"/>
+            </w:pPr>
+            <w:r>
+              <w:rPr>
+                <w:bCs/>
+                <w:b/>
+              </w:rPr>
+              <w:t xml:space="preserve">~$0.15</w:t>
+            </w:r>
+          </w:p>
+        </w:tc>
+        <w:tc>
+          <w:tcPr/>
+          <w:p>
+            <w:pPr>
+              <w:pStyle w:val="Compact"/>
+              <w:jc w:val="left"/>
+            </w:pPr>
+            <w:r>
+              <w:rPr>
+                <w:bCs/>
+                <w:b/>
+              </w:rPr>
+              <w:t xml:space="preserve">~$0.30</w:t>
+            </w:r>
+          </w:p>
+        </w:tc>
+      </w:tr>
+    </w:tbl>
+    <w:p>
+      <w:pPr>
+        <w:pStyle w:val="BodyText"/>
+      </w:pPr>
+      <w:r>
+        <w:t xml:space="preserve">The hard limits in the code keep the worst case bounded: max 3 searches, effort</w:t>
+      </w:r>
+      <w:r>
+        <w:t xml:space="preserve"> </w:t>
+      </w:r>
+      <w:r>
+        <w:rPr>
+          <w:rStyle w:val="VerbatimChar"/>
+        </w:rPr>
+        <w:t xml:space="preserve">low</w:t>
+      </w:r>
+      <w:r>
+        <w:t xml:space="preserve">, 8,000 output tokens per call, at most 2 calls, 25 seconds total.</w:t>
+      </w:r>
+    </w:p>
+    <w:bookmarkEnd w:id="52"/>
+    <w:bookmarkStart w:id="53" w:name="X1ef809496bf5defa4b0596fab8a062ea4236720"/>
+    <w:p>
+      <w:pPr>
+        <w:pStyle w:val="Heading3"/>
+      </w:pPr>
+      <w:r>
+        <w:t xml:space="preserve">Monthly cost by number of form submissions</w:t>
+      </w:r>
+    </w:p>
+    <w:p>
+      <w:pPr>
+        <w:pStyle w:val="FirstParagraph"/>
+      </w:pPr>
+      <w:r>
+        <w:t xml:space="preserve">Assumes about 15% of submissions are spam (no Claude cost). The other 85% get both the fit check and the research.</w:t>
+      </w:r>
+    </w:p>
+    <w:tbl>
+      <w:tblPr>
+        <w:tblStyle w:val="Table"/>
+        <w:tblW w:type="auto" w:w="0"/>
+        <w:tblLook w:firstRow="1" w:lastRow="0" w:firstColumn="0" w:lastColumn="0" w:noHBand="0" w:noVBand="0" w:val="0020"/>
+        <w:jc w:val="start"/>
+      </w:tblPr>
+      <w:tblGrid>
+        <w:gridCol w:w="990"/>
+        <w:gridCol w:w="990"/>
+        <w:gridCol w:w="990"/>
+        <w:gridCol w:w="990"/>
+        <w:gridCol w:w="990"/>
+        <w:gridCol w:w="990"/>
+        <w:gridCol w:w="990"/>
+        <w:gridCol w:w="990"/>
+      </w:tblGrid>
+      <w:tr>
+        <w:trPr>
+          <w:tblHeader w:val="true"/>
+        </w:trPr>
+        <w:tc>
+          <w:tcPr/>
+          <w:p>
+            <w:pPr>
+              <w:pStyle w:val="Compact"/>
+              <w:jc w:val="left"/>
+            </w:pPr>
+            <w:r>
+              <w:t xml:space="preserve">Submissions / month</w:t>
+            </w:r>
+          </w:p>
+        </w:tc>
+        <w:tc>
+          <w:tcPr/>
+          <w:p>
+            <w:pPr>
+              <w:pStyle w:val="Compact"/>
+              <w:jc w:val="left"/>
+            </w:pPr>
+            <w:r>
+              <w:t xml:space="preserve">Leads checked</w:t>
+            </w:r>
+          </w:p>
+        </w:tc>
+        <w:tc>
+          <w:tcPr/>
+          <w:p>
+            <w:pPr>
+              <w:pStyle w:val="Compact"/>
+              <w:jc w:val="left"/>
+            </w:pPr>
+            <w:r>
+              <w:t xml:space="preserve">Fit check</w:t>
+            </w:r>
+          </w:p>
+        </w:tc>
+        <w:tc>
+          <w:tcPr/>
+          <w:p>
+            <w:pPr>
+              <w:pStyle w:val="Compact"/>
+              <w:jc w:val="left"/>
+            </w:pPr>
+            <w:r>
+              <w:t xml:space="preserve">Research (light)</w:t>
+            </w:r>
+          </w:p>
+        </w:tc>
+        <w:tc>
+          <w:tcPr/>
+          <w:p>
+            <w:pPr>
+              <w:pStyle w:val="Compact"/>
+              <w:jc w:val="left"/>
+            </w:pPr>
+            <w:r>
+              <w:rPr>
+                <w:bCs/>
+                <w:b/>
+              </w:rPr>
+              <w:t xml:space="preserve">Research (typical)</w:t>
+            </w:r>
+          </w:p>
+        </w:tc>
+        <w:tc>
+          <w:tcPr/>
+          <w:p>
+            <w:pPr>
+              <w:pStyle w:val="Compact"/>
+              <w:jc w:val="left"/>
+            </w:pPr>
+            <w:r>
+              <w:t xml:space="preserve">Research (heavy)</w:t>
+            </w:r>
+          </w:p>
+        </w:tc>
+        <w:tc>
+          <w:tcPr/>
+          <w:p>
+            <w:pPr>
+              <w:pStyle w:val="Compact"/>
+              <w:jc w:val="left"/>
+            </w:pPr>
+            <w:r>
+              <w:rPr>
+                <w:bCs/>
+                <w:b/>
+              </w:rPr>
+              <w:t xml:space="preserve">Typical total</w:t>
+            </w:r>
+          </w:p>
+        </w:tc>
+        <w:tc>
+          <w:tcPr/>
+          <w:p>
+            <w:pPr>
+              <w:pStyle w:val="Compact"/>
+              <w:jc w:val="left"/>
+            </w:pPr>
+            <w:r>
+              <w:t xml:space="preserve">Suggested spend limit</w:t>
+            </w:r>
+          </w:p>
+        </w:tc>
+      </w:tr>
+      <w:tr>
+        <w:tc>
+          <w:tcPr/>
+          <w:p>
+            <w:pPr>
+              <w:pStyle w:val="Compact"/>
+              <w:jc w:val="left"/>
+            </w:pPr>
+            <w:r>
+              <w:t xml:space="preserve">50</w:t>
+            </w:r>
+          </w:p>
+        </w:tc>
+        <w:tc>
+          <w:tcPr/>
+          <w:p>
+            <w:pPr>
+              <w:pStyle w:val="Compact"/>
+              <w:jc w:val="left"/>
+            </w:pPr>
+            <w:r>
+              <w:t xml:space="preserve">~43</w:t>
+            </w:r>
+          </w:p>
+        </w:tc>
+        <w:tc>
+          <w:tcPr/>
+          <w:p>
+            <w:pPr>
+              <w:pStyle w:val="Compact"/>
+              <w:jc w:val="left"/>
+            </w:pPr>
+            <w:r>
+              <w:t xml:space="preserve">&lt;$0.01</w:t>
+            </w:r>
+          </w:p>
+        </w:tc>
+        <w:tc>
+          <w:tcPr/>
+          <w:p>
+            <w:pPr>
+              <w:pStyle w:val="Compact"/>
+              <w:jc w:val="left"/>
+            </w:pPr>
+            <w:r>
+              <w:t xml:space="preserve">$3</w:t>
+            </w:r>
+          </w:p>
+        </w:tc>
+        <w:tc>
+          <w:tcPr/>
+          <w:p>
+            <w:pPr>
+              <w:pStyle w:val="Compact"/>
+              <w:jc w:val="left"/>
+            </w:pPr>
+            <w:r>
+              <w:rPr>
+                <w:bCs/>
+                <w:b/>
+              </w:rPr>
+              <w:t xml:space="preserve">$6</w:t>
+            </w:r>
+          </w:p>
+        </w:tc>
+        <w:tc>
+          <w:tcPr/>
+          <w:p>
+            <w:pPr>
+              <w:pStyle w:val="Compact"/>
+              <w:jc w:val="left"/>
+            </w:pPr>
+            <w:r>
+              <w:t xml:space="preserve">$13</w:t>
+            </w:r>
+          </w:p>
+        </w:tc>
+        <w:tc>
+          <w:tcPr/>
+          <w:p>
+            <w:pPr>
+              <w:pStyle w:val="Compact"/>
+              <w:jc w:val="left"/>
+            </w:pPr>
+            <w:r>
+              <w:rPr>
+                <w:bCs/>
+                <w:b/>
+              </w:rPr>
+              <w:t xml:space="preserve">~$6</w:t>
+            </w:r>
+          </w:p>
+        </w:tc>
+        <w:tc>
+          <w:tcPr/>
+          <w:p>
+            <w:pPr>
+              <w:pStyle w:val="Compact"/>
+              <w:jc w:val="left"/>
+            </w:pPr>
+            <w:r>
+              <w:t xml:space="preserve">$15</w:t>
+            </w:r>
+          </w:p>
+        </w:tc>
+      </w:tr>
+      <w:tr>
+        <w:tc>
+          <w:tcPr/>
+          <w:p>
+            <w:pPr>
+              <w:pStyle w:val="Compact"/>
+              <w:jc w:val="left"/>
+            </w:pPr>
+            <w:r>
+              <w:t xml:space="preserve">100</w:t>
+            </w:r>
+          </w:p>
+        </w:tc>
+        <w:tc>
+          <w:tcPr/>
+          <w:p>
+            <w:pPr>
+              <w:pStyle w:val="Compact"/>
+              <w:jc w:val="left"/>
+            </w:pPr>
+            <w:r>
+              <w:t xml:space="preserve">85</w:t>
+            </w:r>
+          </w:p>
+        </w:tc>
+        <w:tc>
+          <w:tcPr/>
+          <w:p>
+            <w:pPr>
+              <w:pStyle w:val="Compact"/>
+              <w:jc w:val="left"/>
+            </w:pPr>
+            <w:r>
+              <w:t xml:space="preserve">$0.01</w:t>
+            </w:r>
+          </w:p>
+        </w:tc>
+        <w:tc>
+          <w:tcPr/>
+          <w:p>
+            <w:pPr>
+              <w:pStyle w:val="Compact"/>
+              <w:jc w:val="left"/>
+            </w:pPr>
+            <w:r>
+              <w:t xml:space="preserve">$6</w:t>
+            </w:r>
+          </w:p>
+        </w:tc>
+        <w:tc>
+          <w:tcPr/>
+          <w:p>
+            <w:pPr>
+              <w:pStyle w:val="Compact"/>
+              <w:jc w:val="left"/>
+            </w:pPr>
+            <w:r>
+              <w:rPr>
+                <w:bCs/>
+                <w:b/>
+              </w:rPr>
+              <w:t xml:space="preserve">$13</w:t>
+            </w:r>
+          </w:p>
+        </w:tc>
+        <w:tc>
+          <w:tcPr/>
+          <w:p>
+            <w:pPr>
+              <w:pStyle w:val="Compact"/>
+              <w:jc w:val="left"/>
+            </w:pPr>
+            <w:r>
+              <w:t xml:space="preserve">$26</w:t>
+            </w:r>
+          </w:p>
+        </w:tc>
+        <w:tc>
+          <w:tcPr/>
+          <w:p>
+            <w:pPr>
+              <w:pStyle w:val="Compact"/>
+              <w:jc w:val="left"/>
+            </w:pPr>
+            <w:r>
+              <w:rPr>
+                <w:bCs/>
+                <w:b/>
+              </w:rPr>
+              <w:t xml:space="preserve">~$13</w:t>
+            </w:r>
+          </w:p>
+        </w:tc>
+        <w:tc>
+          <w:tcPr/>
+          <w:p>
+            <w:pPr>
+              <w:pStyle w:val="Compact"/>
+              <w:jc w:val="left"/>
+            </w:pPr>
+            <w:r>
+              <w:t xml:space="preserve">$25</w:t>
+            </w:r>
+          </w:p>
+        </w:tc>
+      </w:tr>
+      <w:tr>
+        <w:tc>
+          <w:tcPr/>
+          <w:p>
+            <w:pPr>
+              <w:pStyle w:val="Compact"/>
+              <w:jc w:val="left"/>
+            </w:pPr>
+            <w:r>
+              <w:t xml:space="preserve">250</w:t>
+            </w:r>
+          </w:p>
+        </w:tc>
+        <w:tc>
+          <w:tcPr/>
+          <w:p>
+            <w:pPr>
+              <w:pStyle w:val="Compact"/>
+              <w:jc w:val="left"/>
+            </w:pPr>
+            <w:r>
+              <w:t xml:space="preserve">~213</w:t>
+            </w:r>
+          </w:p>
+        </w:tc>
+        <w:tc>
+          <w:tcPr/>
+          <w:p>
+            <w:pPr>
+              <w:pStyle w:val="Compact"/>
+              <w:jc w:val="left"/>
+            </w:pPr>
+            <w:r>
+              <w:t xml:space="preserve">$0.02</w:t>
+            </w:r>
+          </w:p>
+        </w:tc>
+        <w:tc>
+          <w:tcPr/>
+          <w:p>
+            <w:pPr>
+              <w:pStyle w:val="Compact"/>
+              <w:jc w:val="left"/>
+            </w:pPr>
+            <w:r>
+              <w:t xml:space="preserve">$15</w:t>
+            </w:r>
+          </w:p>
+        </w:tc>
+        <w:tc>
+          <w:tcPr/>
+          <w:p>
+            <w:pPr>
+              <w:pStyle w:val="Compact"/>
+              <w:jc w:val="left"/>
+            </w:pPr>
+            <w:r>
+              <w:rPr>
+                <w:bCs/>
+                <w:b/>
+              </w:rPr>
+              <w:t xml:space="preserve">$32</w:t>
+            </w:r>
+          </w:p>
+        </w:tc>
+        <w:tc>
+          <w:tcPr/>
+          <w:p>
+            <w:pPr>
+              <w:pStyle w:val="Compact"/>
+              <w:jc w:val="left"/>
+            </w:pPr>
+            <w:r>
+              <w:t xml:space="preserve">$64</w:t>
+            </w:r>
+          </w:p>
+        </w:tc>
+        <w:tc>
+          <w:tcPr/>
+          <w:p>
+            <w:pPr>
+              <w:pStyle w:val="Compact"/>
+              <w:jc w:val="left"/>
+            </w:pPr>
+            <w:r>
+              <w:rPr>
+                <w:bCs/>
+                <w:b/>
+              </w:rPr>
+              <w:t xml:space="preserve">~$32</w:t>
+            </w:r>
+          </w:p>
+        </w:tc>
+        <w:tc>
+          <w:tcPr/>
+          <w:p>
+            <w:pPr>
+              <w:pStyle w:val="Compact"/>
+              <w:jc w:val="left"/>
+            </w:pPr>
+            <w:r>
+              <w:t xml:space="preserve">$65</w:t>
+            </w:r>
+          </w:p>
+        </w:tc>
+      </w:tr>
+      <w:tr>
+        <w:tc>
+          <w:tcPr/>
+          <w:p>
+            <w:pPr>
+              <w:pStyle w:val="Compact"/>
+              <w:jc w:val="left"/>
+            </w:pPr>
+            <w:r>
+              <w:t xml:space="preserve">500</w:t>
+            </w:r>
+          </w:p>
+        </w:tc>
+        <w:tc>
+          <w:tcPr/>
+          <w:p>
+            <w:pPr>
+              <w:pStyle w:val="Compact"/>
+              <w:jc w:val="left"/>
+            </w:pPr>
+            <w:r>
+              <w:t xml:space="preserve">425</w:t>
+            </w:r>
+          </w:p>
+        </w:tc>
+        <w:tc>
+          <w:tcPr/>
+          <w:p>
+            <w:pPr>
+              <w:pStyle w:val="Compact"/>
+              <w:jc w:val="left"/>
+            </w:pPr>
+            <w:r>
+              <w:t xml:space="preserve">$0.04</w:t>
+            </w:r>
+          </w:p>
+        </w:tc>
+        <w:tc>
+          <w:tcPr/>
+          <w:p>
+            <w:pPr>
+              <w:pStyle w:val="Compact"/>
+              <w:jc w:val="left"/>
+            </w:pPr>
+            <w:r>
+              <w:t xml:space="preserve">$30</w:t>
+            </w:r>
+          </w:p>
+        </w:tc>
+        <w:tc>
+          <w:tcPr/>
+          <w:p>
+            <w:pPr>
+              <w:pStyle w:val="Compact"/>
+              <w:jc w:val="left"/>
+            </w:pPr>
+            <w:r>
+              <w:rPr>
+                <w:bCs/>
+                <w:b/>
+              </w:rPr>
+              <w:t xml:space="preserve">$64</w:t>
+            </w:r>
+          </w:p>
+        </w:tc>
+        <w:tc>
+          <w:tcPr/>
+          <w:p>
+            <w:pPr>
+              <w:pStyle w:val="Compact"/>
+              <w:jc w:val="left"/>
+            </w:pPr>
+            <w:r>
+              <w:t xml:space="preserve">$128</w:t>
+            </w:r>
+          </w:p>
+        </w:tc>
+        <w:tc>
+          <w:tcPr/>
+          <w:p>
+            <w:pPr>
+              <w:pStyle w:val="Compact"/>
+              <w:jc w:val="left"/>
+            </w:pPr>
+            <w:r>
+              <w:rPr>
+                <w:bCs/>
+                <w:b/>
+              </w:rPr>
+              <w:t xml:space="preserve">~$64</w:t>
+            </w:r>
+          </w:p>
+        </w:tc>
+        <w:tc>
+          <w:tcPr/>
+          <w:p>
+            <w:pPr>
+              <w:pStyle w:val="Compact"/>
+              <w:jc w:val="left"/>
+            </w:pPr>
+            <w:r>
+              <w:t xml:space="preserve">$130</w:t>
+            </w:r>
+          </w:p>
+        </w:tc>
+      </w:tr>
+      <w:tr>
+        <w:tc>
+          <w:tcPr/>
+          <w:p>
+            <w:pPr>
+              <w:pStyle w:val="Compact"/>
+              <w:jc w:val="left"/>
+            </w:pPr>
+            <w:r>
+              <w:t xml:space="preserve">1,000</w:t>
+            </w:r>
+          </w:p>
+        </w:tc>
+        <w:tc>
+          <w:tcPr/>
+          <w:p>
+            <w:pPr>
+              <w:pStyle w:val="Compact"/>
+              <w:jc w:val="left"/>
+            </w:pPr>
+            <w:r>
+              <w:t xml:space="preserve">850</w:t>
+            </w:r>
+          </w:p>
+        </w:tc>
+        <w:tc>
+          <w:tcPr/>
+          <w:p>
+            <w:pPr>
+              <w:pStyle w:val="Compact"/>
+              <w:jc w:val="left"/>
+            </w:pPr>
+            <w:r>
+              <w:t xml:space="preserve">$0.09</w:t>
+            </w:r>
+          </w:p>
+        </w:tc>
+        <w:tc>
+          <w:tcPr/>
+          <w:p>
+            <w:pPr>
+              <w:pStyle w:val="Compact"/>
+              <w:jc w:val="left"/>
+            </w:pPr>
+            <w:r>
+              <w:t xml:space="preserve">$60</w:t>
+            </w:r>
+          </w:p>
+        </w:tc>
+        <w:tc>
+          <w:tcPr/>
+          <w:p>
+            <w:pPr>
+              <w:pStyle w:val="Compact"/>
+              <w:jc w:val="left"/>
+            </w:pPr>
+            <w:r>
+              <w:rPr>
+                <w:bCs/>
+                <w:b/>
+              </w:rPr>
+              <w:t xml:space="preserve">$128</w:t>
+            </w:r>
+          </w:p>
+        </w:tc>
+        <w:tc>
+          <w:tcPr/>
+          <w:p>
+            <w:pPr>
+              <w:pStyle w:val="Compact"/>
+              <w:jc w:val="left"/>
+            </w:pPr>
+            <w:r>
+              <w:t xml:space="preserve">$255</w:t>
+            </w:r>
+          </w:p>
+        </w:tc>
+        <w:tc>
+          <w:tcPr/>
+          <w:p>
+            <w:pPr>
+              <w:pStyle w:val="Compact"/>
+              <w:jc w:val="left"/>
+            </w:pPr>
+            <w:r>
+              <w:rPr>
+                <w:bCs/>
+                <w:b/>
+              </w:rPr>
+              <w:t xml:space="preserve">~$128</w:t>
+            </w:r>
+          </w:p>
+        </w:tc>
+        <w:tc>
+          <w:tcPr/>
+          <w:p>
+            <w:pPr>
+              <w:pStyle w:val="Compact"/>
+              <w:jc w:val="left"/>
+            </w:pPr>
+            <w:r>
+              <w:t xml:space="preserve">$260</w:t>
+            </w:r>
+          </w:p>
+        </w:tc>
+      </w:tr>
+      <w:tr>
+        <w:tc>
+          <w:tcPr/>
+          <w:p>
+            <w:pPr>
+              <w:pStyle w:val="Compact"/>
+              <w:jc w:val="left"/>
+            </w:pPr>
+            <w:r>
+              <w:t xml:space="preserve">2,500</w:t>
+            </w:r>
+          </w:p>
+        </w:tc>
+        <w:tc>
+          <w:tcPr/>
+          <w:p>
+            <w:pPr>
+              <w:pStyle w:val="Compact"/>
+              <w:jc w:val="left"/>
+            </w:pPr>
+            <w:r>
+              <w:t xml:space="preserve">2,125</w:t>
+            </w:r>
+          </w:p>
+        </w:tc>
+        <w:tc>
+          <w:tcPr/>
+          <w:p>
+            <w:pPr>
+              <w:pStyle w:val="Compact"/>
+              <w:jc w:val="left"/>
+            </w:pPr>
+            <w:r>
+              <w:t xml:space="preserve">$0.21</w:t>
+            </w:r>
+          </w:p>
+        </w:tc>
+        <w:tc>
+          <w:tcPr/>
+          <w:p>
+            <w:pPr>
+              <w:pStyle w:val="Compact"/>
+              <w:jc w:val="left"/>
+            </w:pPr>
+            <w:r>
+              <w:t xml:space="preserve">$149</w:t>
+            </w:r>
+          </w:p>
+        </w:tc>
+        <w:tc>
+          <w:tcPr/>
+          <w:p>
+            <w:pPr>
+              <w:pStyle w:val="Compact"/>
+              <w:jc w:val="left"/>
+            </w:pPr>
+            <w:r>
+              <w:rPr>
+                <w:bCs/>
+                <w:b/>
+              </w:rPr>
+              <w:t xml:space="preserve">$319</w:t>
+            </w:r>
+          </w:p>
+        </w:tc>
+        <w:tc>
+          <w:tcPr/>
+          <w:p>
+            <w:pPr>
+              <w:pStyle w:val="Compact"/>
+              <w:jc w:val="left"/>
+            </w:pPr>
+            <w:r>
+              <w:t xml:space="preserve">$638</w:t>
+            </w:r>
+          </w:p>
+        </w:tc>
+        <w:tc>
+          <w:tcPr/>
+          <w:p>
+            <w:pPr>
+              <w:pStyle w:val="Compact"/>
+              <w:jc w:val="left"/>
+            </w:pPr>
+            <w:r>
+              <w:rPr>
+                <w:bCs/>
+                <w:b/>
+              </w:rPr>
+              <w:t xml:space="preserve">~$319</w:t>
+            </w:r>
+          </w:p>
+        </w:tc>
+        <w:tc>
+          <w:tcPr/>
+          <w:p>
+            <w:pPr>
+              <w:pStyle w:val="Compact"/>
+              <w:jc w:val="left"/>
+            </w:pPr>
+            <w:r>
+              <w:t xml:space="preserve">$650</w:t>
+            </w:r>
+          </w:p>
+        </w:tc>
+      </w:tr>
+      <w:tr>
+        <w:tc>
+          <w:tcPr/>
+          <w:p>
+            <w:pPr>
+              <w:pStyle w:val="Compact"/>
+              <w:jc w:val="left"/>
+            </w:pPr>
+            <w:r>
+              <w:t xml:space="preserve">5,000</w:t>
+            </w:r>
+          </w:p>
+        </w:tc>
+        <w:tc>
+          <w:tcPr/>
+          <w:p>
+            <w:pPr>
+              <w:pStyle w:val="Compact"/>
+              <w:jc w:val="left"/>
+            </w:pPr>
+            <w:r>
+              <w:t xml:space="preserve">4,250</w:t>
+            </w:r>
+          </w:p>
+        </w:tc>
+        <w:tc>
+          <w:tcPr/>
+          <w:p>
+            <w:pPr>
+              <w:pStyle w:val="Compact"/>
+              <w:jc w:val="left"/>
+            </w:pPr>
+            <w:r>
+              <w:t xml:space="preserve">$0.43</w:t>
+            </w:r>
+          </w:p>
+        </w:tc>
+        <w:tc>
+          <w:tcPr/>
+          <w:p>
+            <w:pPr>
+              <w:pStyle w:val="Compact"/>
+              <w:jc w:val="left"/>
+            </w:pPr>
+            <w:r>
+              <w:t xml:space="preserve">$298</w:t>
+            </w:r>
+          </w:p>
+        </w:tc>
+        <w:tc>
+          <w:tcPr/>
+          <w:p>
+            <w:pPr>
+              <w:pStyle w:val="Compact"/>
+              <w:jc w:val="left"/>
+            </w:pPr>
+            <w:r>
+              <w:rPr>
+                <w:bCs/>
+                <w:b/>
+              </w:rPr>
+              <w:t xml:space="preserve">$638</w:t>
+            </w:r>
+          </w:p>
+        </w:tc>
+        <w:tc>
+          <w:tcPr/>
+          <w:p>
+            <w:pPr>
+              <w:pStyle w:val="Compact"/>
+              <w:jc w:val="left"/>
+            </w:pPr>
+            <w:r>
+              <w:t xml:space="preserve">$1,275</w:t>
+            </w:r>
+          </w:p>
+        </w:tc>
+        <w:tc>
+          <w:tcPr/>
+          <w:p>
+            <w:pPr>
+              <w:pStyle w:val="Compact"/>
+              <w:jc w:val="left"/>
+            </w:pPr>
+            <w:r>
+              <w:rPr>
+                <w:bCs/>
+                <w:b/>
+              </w:rPr>
+              <w:t xml:space="preserve">~$638</w:t>
+            </w:r>
+          </w:p>
+        </w:tc>
+        <w:tc>
+          <w:tcPr/>
+          <w:p>
+            <w:pPr>
+              <w:pStyle w:val="Compact"/>
+              <w:jc w:val="left"/>
+            </w:pPr>
+            <w:r>
+              <w:t xml:space="preserve">$1,300</w:t>
+            </w:r>
+          </w:p>
+        </w:tc>
+      </w:tr>
+    </w:tbl>
+    <w:p>
+      <w:pPr>
+        <w:pStyle w:val="BodyText"/>
+      </w:pPr>
+      <w:r>
+        <w:t xml:space="preserve">How to read it:</w:t>
+      </w:r>
+    </w:p>
+    <w:p>
+      <w:pPr>
+        <w:numPr>
+          <w:ilvl w:val="0"/>
+          <w:numId w:val="1017"/>
+        </w:numPr>
+        <w:pStyle w:val="Compact"/>
+      </w:pPr>
+      <w:r>
+        <w:rPr>
+          <w:bCs/>
+          <w:b/>
+        </w:rPr>
+        <w:t xml:space="preserve">The fit check is basically free</w:t>
+      </w:r>
+      <w:r>
+        <w:t xml:space="preserve"> </w:t>
+      </w:r>
+      <w:r>
+        <w:t xml:space="preserve">at any volume. Even 5,000 submissions a month is under $0.50.</w:t>
+      </w:r>
+    </w:p>
+    <w:p>
+      <w:pPr>
+        <w:numPr>
+          <w:ilvl w:val="0"/>
+          <w:numId w:val="1017"/>
+        </w:numPr>
+        <w:pStyle w:val="Compact"/>
+      </w:pPr>
+      <w:r>
+        <w:rPr>
+          <w:bCs/>
+          <w:b/>
+        </w:rPr>
+        <w:t xml:space="preserve">The research is ~99% of the bill.</w:t>
+      </w:r>
+      <w:r>
+        <w:t xml:space="preserve"> </w:t>
+      </w:r>
+      <w:r>
+        <w:t xml:space="preserve">Budget about</w:t>
+      </w:r>
+      <w:r>
+        <w:t xml:space="preserve"> </w:t>
+      </w:r>
+      <w:r>
+        <w:rPr>
+          <w:bCs/>
+          <w:b/>
+        </w:rPr>
+        <w:t xml:space="preserve">$0.13 per submission</w:t>
+      </w:r>
+      <w:r>
+        <w:t xml:space="preserve"> </w:t>
+      </w:r>
+      <w:r>
+        <w:t xml:space="preserve">(typical research × 85% non-spam).</w:t>
+      </w:r>
+    </w:p>
+    <w:p>
+      <w:pPr>
+        <w:numPr>
+          <w:ilvl w:val="0"/>
+          <w:numId w:val="1017"/>
+        </w:numPr>
+        <w:pStyle w:val="Compact"/>
+      </w:pPr>
+      <w:r>
+        <w:rPr>
+          <w:bCs/>
+          <w:b/>
+        </w:rPr>
+        <w:t xml:space="preserve">Suggested spend limit</w:t>
+      </w:r>
+      <w:r>
+        <w:t xml:space="preserve"> </w:t>
+      </w:r>
+      <w:r>
+        <w:t xml:space="preserve">is about 2× the typical month (≈ the heavy column), so a spam wave or a run of hard leads doesn't stop the system mid-month. If the limit is hit, the API refuses calls: the fit check fails open (leads still reach a calendar), but research stops until the limit resets or is raised.</w:t>
+      </w:r>
+    </w:p>
+    <w:p>
+      <w:pPr>
+        <w:numPr>
+          <w:ilvl w:val="0"/>
+          <w:numId w:val="1017"/>
+        </w:numPr>
+        <w:pStyle w:val="Compact"/>
+      </w:pPr>
+      <w:r>
+        <w:t xml:space="preserve">If spam is higher than 15%, costs go down (spam is free). If the share of not-fit leads is high, costs stay the same, because not-fits are still researched.</w:t>
+      </w:r>
+    </w:p>
+    <w:bookmarkEnd w:id="53"/>
+    <w:bookmarkStart w:id="54" w:name="ways-to-cut-the-cost-if-needed"/>
+    <w:p>
+      <w:pPr>
+        <w:pStyle w:val="Heading3"/>
+      </w:pPr>
+      <w:r>
+        <w:t xml:space="preserve">Ways to cut the cost (if needed)</w:t>
+      </w:r>
+    </w:p>
+    <w:tbl>
+      <w:tblPr>
+        <w:tblStyle w:val="Table"/>
+        <w:tblW w:type="auto" w:w="0"/>
+        <w:tblLook w:firstRow="1" w:lastRow="0" w:firstColumn="0" w:lastColumn="0" w:noHBand="0" w:noVBand="0" w:val="0020"/>
+        <w:jc w:val="start"/>
+      </w:tblPr>
+      <w:tblGrid>
+        <w:gridCol w:w="2640"/>
+        <w:gridCol w:w="2640"/>
+        <w:gridCol w:w="2640"/>
+      </w:tblGrid>
+      <w:tr>
+        <w:trPr>
+          <w:tblHeader w:val="true"/>
+        </w:trPr>
+        <w:tc>
+          <w:tcPr/>
+          <w:p>
+            <w:pPr>
+              <w:pStyle w:val="Compact"/>
+              <w:jc w:val="left"/>
+            </w:pPr>
+            <w:r>
+              <w:t xml:space="preserve">Change</w:t>
+            </w:r>
+          </w:p>
+        </w:tc>
+        <w:tc>
+          <w:tcPr/>
+          <w:p>
+            <w:pPr>
+              <w:pStyle w:val="Compact"/>
+              <w:jc w:val="left"/>
+            </w:pPr>
+            <w:r>
+              <w:t xml:space="preserve">Effect on the research cost</w:t>
+            </w:r>
+          </w:p>
+        </w:tc>
+        <w:tc>
+          <w:tcPr/>
+          <w:p>
+            <w:pPr>
+              <w:pStyle w:val="Compact"/>
+              <w:jc w:val="left"/>
+            </w:pPr>
+            <w:r>
+              <w:t xml:space="preserve">Trade-off</w:t>
+            </w:r>
+          </w:p>
+        </w:tc>
+      </w:tr>
+      <w:tr>
+        <w:tc>
+          <w:tcPr/>
+          <w:p>
+            <w:pPr>
+              <w:pStyle w:val="Compact"/>
+              <w:jc w:val="left"/>
+            </w:pPr>
+            <w:r>
+              <w:t xml:space="preserve">Skip research for not-fit leads</w:t>
+            </w:r>
+          </w:p>
+        </w:tc>
+        <w:tc>
+          <w:tcPr/>
+          <w:p>
+            <w:pPr>
+              <w:pStyle w:val="Compact"/>
+              <w:jc w:val="left"/>
+            </w:pPr>
+            <w:r>
+              <w:t xml:space="preserve">Saves the not-fit share (often 10–30%)</w:t>
+            </w:r>
+          </w:p>
+        </w:tc>
+        <w:tc>
+          <w:tcPr/>
+          <w:p>
+            <w:pPr>
+              <w:pStyle w:val="Compact"/>
+              <w:jc w:val="left"/>
+            </w:pPr>
+            <w:r>
+              <w:t xml:space="preserve">No Salesforce/Slack record with research for vendors, job seekers, etc. They'd still need logging some other way.</w:t>
+            </w:r>
+          </w:p>
+        </w:tc>
+      </w:tr>
+      <w:tr>
+        <w:tc>
+          <w:tcPr/>
+          <w:p>
+            <w:pPr>
+              <w:pStyle w:val="Compact"/>
+              <w:jc w:val="left"/>
+            </w:pPr>
+            <w:r>
+              <w:t xml:space="preserve">Lower web search</w:t>
+            </w:r>
+            <w:r>
+              <w:t xml:space="preserve"> </w:t>
+            </w:r>
+            <w:r>
+              <w:rPr>
+                <w:rStyle w:val="VerbatimChar"/>
+              </w:rPr>
+              <w:t xml:space="preserve">max_uses</w:t>
+            </w:r>
+            <w:r>
+              <w:t xml:space="preserve"> </w:t>
+            </w:r>
+            <w:r>
+              <w:t xml:space="preserve">from 3 to 2</w:t>
+            </w:r>
+          </w:p>
+        </w:tc>
+        <w:tc>
+          <w:tcPr/>
+          <w:p>
+            <w:pPr>
+              <w:pStyle w:val="Compact"/>
+              <w:jc w:val="left"/>
+            </w:pPr>
+            <w:r>
+              <w:t xml:space="preserve">~10–20% less, mostly on heavy leads</w:t>
+            </w:r>
+          </w:p>
+        </w:tc>
+        <w:tc>
+          <w:tcPr/>
+          <w:p>
+            <w:pPr>
+              <w:pStyle w:val="Compact"/>
+              <w:jc w:val="left"/>
+            </w:pPr>
+            <w:r>
+              <w:t xml:space="preserve">Slightly less thorough on unknown companies</w:t>
+            </w:r>
+          </w:p>
+        </w:tc>
+      </w:tr>
+      <w:tr>
+        <w:tc>
+          <w:tcPr/>
+          <w:p>
+            <w:pPr>
+              <w:pStyle w:val="Compact"/>
+              <w:jc w:val="left"/>
+            </w:pPr>
+            <w:r>
+              <w:t xml:space="preserve">Switch research to</w:t>
+            </w:r>
+            <w:r>
+              <w:t xml:space="preserve"> </w:t>
+            </w:r>
+            <w:r>
+              <w:rPr>
+                <w:rStyle w:val="VerbatimChar"/>
+              </w:rPr>
+              <w:t xml:space="preserve">claude-sonnet-5-5</w:t>
+            </w:r>
+            <w:r>
+              <w:t xml:space="preserve"> </w:t>
+            </w:r>
+            <w:r>
+              <w:t xml:space="preserve">($2 / $10 per million)</w:t>
+            </w:r>
+          </w:p>
+        </w:tc>
+        <w:tc>
+          <w:tcPr/>
+          <w:p>
+            <w:pPr>
+              <w:pStyle w:val="Compact"/>
+              <w:jc w:val="left"/>
+            </w:pPr>
+            <w:r>
+              <w:t xml:space="preserve">~45% less (~$0.08 per lead)</w:t>
+            </w:r>
+          </w:p>
+        </w:tc>
+        <w:tc>
+          <w:tcPr/>
+          <w:p>
+            <w:pPr>
+              <w:pStyle w:val="Compact"/>
+              <w:jc w:val="left"/>
+            </w:pPr>
+            <w:r>
+              <w:t xml:space="preserve">Test on 10–20 real leads first to check summary quality</w:t>
+            </w:r>
+          </w:p>
+        </w:tc>
+      </w:tr>
+      <w:tr>
+        <w:tc>
+          <w:tcPr/>
+          <w:p>
+            <w:pPr>
+              <w:pStyle w:val="Compact"/>
+              <w:jc w:val="left"/>
+            </w:pPr>
+            <w:r>
+              <w:t xml:space="preserve">Turn research off (remove</w:t>
+            </w:r>
+            <w:r>
+              <w:t xml:space="preserve"> </w:t>
+            </w:r>
+            <w:r>
+              <w:rPr>
+                <w:rStyle w:val="VerbatimChar"/>
+              </w:rPr>
+              <w:t xml:space="preserve">ZAPIER_HOOK_URL</w:t>
+            </w:r>
+            <w:r>
+              <w:t xml:space="preserve">)</w:t>
+            </w:r>
+          </w:p>
+        </w:tc>
+        <w:tc>
+          <w:tcPr/>
+          <w:p>
+            <w:pPr>
+              <w:pStyle w:val="Compact"/>
+              <w:jc w:val="left"/>
+            </w:pPr>
+            <w:r>
+              <w:t xml:space="preserve">~100% less: fit check only (~$0.0001 per lead)</w:t>
+            </w:r>
+          </w:p>
+        </w:tc>
+        <w:tc>
+          <w:tcPr/>
+          <w:p>
+            <w:pPr>
+              <w:pStyle w:val="Compact"/>
+              <w:jc w:val="left"/>
+            </w:pPr>
+            <w:r>
+              <w:t xml:space="preserve">No Salesforce lead or Slack message from the system at all</w:t>
+            </w:r>
+          </w:p>
+        </w:tc>
+      </w:tr>
+    </w:tbl>
+    <w:p>
+      <w:pPr>
+        <w:pStyle w:val="BodyText"/>
+      </w:pPr>
+      <w:r>
+        <w:t xml:space="preserve">Each of these is a small change in</w:t>
+      </w:r>
+      <w:r>
+        <w:t xml:space="preserve"> </w:t>
+      </w:r>
+      <w:r>
+        <w:rPr>
+          <w:rStyle w:val="VerbatimChar"/>
+        </w:rPr>
+        <w:t xml:space="preserve">worker/src/index.ts</w:t>
+      </w:r>
+      <w:r>
+        <w:t xml:space="preserve"> </w:t>
+      </w:r>
+      <w:r>
+        <w:t xml:space="preserve">or</w:t>
+      </w:r>
+      <w:r>
+        <w:t xml:space="preserve"> </w:t>
+      </w:r>
+      <w:r>
+        <w:rPr>
+          <w:rStyle w:val="VerbatimChar"/>
+        </w:rPr>
+        <w:t xml:space="preserve">worker/src/verify.ts</w:t>
+      </w:r>
+      <w:r>
+        <w:t xml:space="preserve">. Ask before changing; the current setup is the agreed default.</w:t>
+      </w:r>
+    </w:p>
+    <w:bookmarkEnd w:id="54"/>
+    <w:bookmarkStart w:id="55" w:name="measuring-the-real-numbers"/>
+    <w:p>
+      <w:pPr>
+        <w:pStyle w:val="Heading3"/>
+      </w:pPr>
+      <w:r>
+        <w:t xml:space="preserve">Measuring the real numbers</w:t>
+      </w:r>
+    </w:p>
+    <w:p>
+      <w:pPr>
+        <w:pStyle w:val="FirstParagraph"/>
+      </w:pPr>
+      <w:r>
+        <w:t xml:space="preserve">The table above is an estimate from the code. To get the real cost per lead:</w:t>
+      </w:r>
+    </w:p>
+    <w:p>
+      <w:pPr>
+        <w:numPr>
+          <w:ilvl w:val="0"/>
+          <w:numId w:val="1018"/>
+        </w:numPr>
+        <w:pStyle w:val="Compact"/>
+      </w:pPr>
+      <w:r>
+        <w:t xml:space="preserve">Console → Cost, last 30 days, grouped by model. Note the Haiku, Opus and web search totals.</w:t>
+      </w:r>
+    </w:p>
+    <w:p>
+      <w:pPr>
+        <w:numPr>
+          <w:ilvl w:val="0"/>
+          <w:numId w:val="1018"/>
+        </w:numPr>
+        <w:pStyle w:val="Compact"/>
+      </w:pPr>
+      <w:r>
+        <w:t xml:space="preserve">Cloudflare → Workers →</w:t>
+      </w:r>
+      <w:r>
+        <w:t xml:space="preserve"> </w:t>
+      </w:r>
+      <w:r>
+        <w:rPr>
+          <w:rStyle w:val="VerbatimChar"/>
+        </w:rPr>
+        <w:t xml:space="preserve">momos-lead-routing</w:t>
+      </w:r>
+      <w:r>
+        <w:t xml:space="preserve"> </w:t>
+      </w:r>
+      <w:r>
+        <w:t xml:space="preserve">→ Logs (or Zapier → History) for the number of leads in the same period.</w:t>
+      </w:r>
+    </w:p>
+    <w:p>
+      <w:pPr>
+        <w:numPr>
+          <w:ilvl w:val="0"/>
+          <w:numId w:val="1018"/>
+        </w:numPr>
+        <w:pStyle w:val="Compact"/>
+      </w:pPr>
+      <w:r>
+        <w:t xml:space="preserve">Opus + web search total ÷ number of non-spam leads = your real research cost per lead. Update the "Typical" column if it's far off.</w:t>
+      </w:r>
+    </w:p>
+    <w:bookmarkEnd w:id="55"/>
+    <w:bookmarkStart w:id="56" w:name="other-services-not-anthropic"/>
+    <w:p>
+      <w:pPr>
+        <w:pStyle w:val="Heading3"/>
+      </w:pPr>
+      <w:r>
+        <w:t xml:space="preserve">Other services (not Anthropic)</w:t>
+      </w:r>
+    </w:p>
+    <w:tbl>
+      <w:tblPr>
+        <w:tblStyle w:val="Table"/>
+        <w:tblW w:type="auto" w:w="0"/>
+        <w:tblLook w:firstRow="1" w:lastRow="0" w:firstColumn="0" w:lastColumn="0" w:noHBand="0" w:noVBand="0" w:val="0020"/>
+        <w:jc w:val="start"/>
+      </w:tblPr>
+      <w:tblGrid>
+        <w:gridCol w:w="3960"/>
+        <w:gridCol w:w="3960"/>
+      </w:tblGrid>
+      <w:tr>
+        <w:trPr>
+          <w:tblHeader w:val="true"/>
+        </w:trPr>
+        <w:tc>
+          <w:tcPr/>
+          <w:p>
+            <w:pPr>
+              <w:pStyle w:val="Compact"/>
+              <w:jc w:val="left"/>
+            </w:pPr>
+            <w:r>
+              <w:t xml:space="preserve">Service</w:t>
+            </w:r>
+          </w:p>
+        </w:tc>
+        <w:tc>
+          <w:tcPr/>
+          <w:p>
+            <w:pPr>
+              <w:pStyle w:val="Compact"/>
+              <w:jc w:val="left"/>
+            </w:pPr>
+            <w:r>
+              <w:t xml:space="preserve">Cost at these volumes</w:t>
+            </w:r>
+          </w:p>
+        </w:tc>
+      </w:tr>
+      <w:tr>
+        <w:tc>
+          <w:tcPr/>
+          <w:p>
+            <w:pPr>
+              <w:pStyle w:val="Compact"/>
+              <w:jc w:val="left"/>
+            </w:pPr>
+            <w:r>
+              <w:t xml:space="preserve">Cloudflare Workers</w:t>
+            </w:r>
+          </w:p>
+        </w:tc>
+        <w:tc>
+          <w:tcPr/>
+          <w:p>
+            <w:pPr>
+              <w:pStyle w:val="Compact"/>
+              <w:jc w:val="left"/>
+            </w:pPr>
+            <w:r>
+              <w:t xml:space="preserve">Free plan covers it (100,000 requests a day). Waiting on Claude doesn't count as CPU time.</w:t>
+            </w:r>
+          </w:p>
+        </w:tc>
+      </w:tr>
+      <w:tr>
+        <w:tc>
+          <w:tcPr/>
+          <w:p>
+            <w:pPr>
+              <w:pStyle w:val="Compact"/>
+              <w:jc w:val="left"/>
+            </w:pPr>
+            <w:r>
+              <w:t xml:space="preserve">Zapier</w:t>
+            </w:r>
+          </w:p>
+        </w:tc>
+        <w:tc>
+          <w:tcPr/>
+          <w:p>
+            <w:pPr>
+              <w:pStyle w:val="Compact"/>
+              <w:jc w:val="left"/>
+            </w:pPr>
+            <w:r>
+              <w:t xml:space="preserve">Each routed lead uses a few tasks (lookup table, Salesforce, Slack). Check Zapier → History against your plan's monthly task allowance at 1,000+ leads.</w:t>
+            </w:r>
+          </w:p>
+        </w:tc>
+      </w:tr>
+      <w:tr>
+        <w:tc>
+          <w:tcPr/>
+          <w:p>
+            <w:pPr>
+              <w:pStyle w:val="Compact"/>
+              <w:jc w:val="left"/>
+            </w:pPr>
+            <w:r>
+              <w:t xml:space="preserve">Framer</w:t>
+            </w:r>
+          </w:p>
+        </w:tc>
+        <w:tc>
+          <w:tcPr/>
+          <w:p>
+            <w:pPr>
+              <w:pStyle w:val="Compact"/>
+              <w:jc w:val="left"/>
+            </w:pPr>
+            <w:r>
+              <w:t xml:space="preserve">No extra cost.</w:t>
+            </w:r>
+          </w:p>
+        </w:tc>
+      </w:tr>
+    </w:tbl>
+    <w:bookmarkEnd w:id="56"/>
+    <w:bookmarkEnd w:id="57"/>
+    <w:bookmarkEnd w:id="58"/>
     <w:sectPr/>
   </w:body>
 </w:document>
@@ -10035,6 +12344,39 @@
   </w:num>
   <w:num w:numId="1016">
     <w:abstractNumId w:val="991"/>
+  </w:num>
+  <w:num w:numId="1017">
+    <w:abstractNumId w:val="991"/>
+  </w:num>
+  <w:num w:numId="1018">
+    <w:abstractNumId w:val="99411"/>
+    <w:lvlOverride w:ilvl="0">
+      <w:startOverride w:val="1"/>
+    </w:lvlOverride>
+    <w:lvlOverride w:ilvl="1">
+      <w:startOverride w:val="1"/>
+    </w:lvlOverride>
+    <w:lvlOverride w:ilvl="2">
+      <w:startOverride w:val="1"/>
+    </w:lvlOverride>
+    <w:lvlOverride w:ilvl="3">
+      <w:startOverride w:val="1"/>
+    </w:lvlOverride>
+    <w:lvlOverride w:ilvl="4">
+      <w:startOverride w:val="1"/>
+    </w:lvlOverride>
+    <w:lvlOverride w:ilvl="5">
+      <w:startOverride w:val="1"/>
+    </w:lvlOverride>
+    <w:lvlOverride w:ilvl="6">
+      <w:startOverride w:val="1"/>
+    </w:lvlOverride>
+    <w:lvlOverride w:ilvl="7">
+      <w:startOverride w:val="1"/>
+    </w:lvlOverride>
+    <w:lvlOverride w:ilvl="8">
+      <w:startOverride w:val="1"/>
+    </w:lvlOverride>
   </w:num>
 </w:numbering>
 </file>

</xml_diff>

<commit_message>
Make clear not-fit leads get a popup, not a redirect
Co-Authored-By: Claude Opus 5.5 <noreply@anthropic.com>
Claude-Session: https://claude.ai/code/session_016MSitiN4QkJHe8WqEGz9RU
</commit_message>
<xml_diff>
--- a/lead-routing/Momos Lead Routing - Technical Documentation.docx
+++ b/lead-routing/Momos Lead Routing - Technical Documentation.docx
@@ -1374,13 +1374,22 @@
         <w:t xml:space="preserve"> </w:t>
       </w:r>
       <w:r>
+        <w:t xml:space="preserve">no redirect. The visitor stays on the page and sees the thank-you popup. (Behind the scenes the Worker replies with</w:t>
+      </w:r>
+      <w:r>
+        <w:t xml:space="preserve"> </w:t>
+      </w:r>
+      <w:r>
         <w:rPr>
           <w:rStyle w:val="VerbatimChar"/>
         </w:rPr>
         <w:t xml:space="preserve">https://www.momos.com/thank-you</w:t>
       </w:r>
       <w:r>
-        <w:t xml:space="preserve">. The form sees this URL and shows the thank-you popup instead of leaving the page.</w:t>
+        <w:t xml:space="preserve"> </w:t>
+      </w:r>
+      <w:r>
+        <w:t xml:space="preserve">as a code word. The form spots it and opens the popup instead. Nobody is ever sent to that address, and the page doesn't need to exist.)</w:t>
       </w:r>
     </w:p>
     <w:p>
@@ -6074,7 +6083,7 @@
               <w:jc w:val="left"/>
             </w:pPr>
             <w:r>
-              <w:t xml:space="preserve">If the Worker returns this, show the popup</w:t>
+              <w:t xml:space="preserve">Code word from the Worker meaning "show the popup, don't redirect"</w:t>
             </w:r>
           </w:p>
         </w:tc>
@@ -6797,7 +6806,7 @@
               <w:jc w:val="left"/>
             </w:pPr>
             <w:r>
-              <w:t xml:space="preserve">The signal for the popup</w:t>
+              <w:t xml:space="preserve">Code word telling the form to show the popup. Not a real redirect; no page needed.</w:t>
             </w:r>
           </w:p>
         </w:tc>

</xml_diff>

<commit_message>
Research leads with Haiku by default, Opus behind RESEARCH_MODEL
Haiku 5.5 with basic web search cuts research cost by about 85%.
Set RESEARCH_MODEL = "opus" in wrangler.toml to switch back.

Co-Authored-By: Claude Opus 5.5 <noreply@anthropic.com>
Claude-Session: https://claude.ai/code/session_016MSitiN4QkJHe8WqEGz9RU
</commit_message>
<xml_diff>
--- a/lead-routing/Momos Lead Routing - Technical Documentation.docx
+++ b/lead-routing/Momos Lead Routing - Technical Documentation.docx
@@ -171,7 +171,7 @@
         <w:rPr>
           <w:rStyle w:val="VerbatimChar"/>
         </w:rPr>
-        <w:t xml:space="preserve">        └─ Claude Opus 5.5 + web search ──► JSON ──► Zapier ──► Salesforce lead + Slack message</w:t>
+        <w:t xml:space="preserve">        └─ Claude Haiku 5.5 + web search ──► JSON ──► Zapier ──► Salesforce lead + Slack message</w:t>
       </w:r>
     </w:p>
     <w:tbl>
@@ -253,7 +253,7 @@
               <w:jc w:val="left"/>
             </w:pPr>
             <w:r>
-              <w:t xml:space="preserve">About $0.0001 per lead for the fit check and about $0.15 per real lead for the research. Roughly $13 a month at 100 submissions, $128 at 1,000. See section 17.</w:t>
+              <w:t xml:space="preserve">About $0.0001 per lead for the fit check and about $0.02–0.03 per real lead for the research. Roughly $2 a month at 100 submissions, $20 at 1,000. See section 17.</w:t>
             </w:r>
           </w:p>
         </w:tc>
@@ -652,7 +652,7 @@
               <w:jc w:val="left"/>
             </w:pPr>
             <w:r>
-              <w:t xml:space="preserve">Claude Haiku 5.5 (fit check) and Claude Opus 5.5 (research).</w:t>
+              <w:t xml:space="preserve">Claude Haiku 5.5 (fit check and research; research can be switched to Opus 5.5).</w:t>
             </w:r>
           </w:p>
         </w:tc>
@@ -947,7 +947,7 @@
         <w:rPr>
           <w:rStyle w:val="VerbatimChar"/>
         </w:rPr>
-        <w:t xml:space="preserve">    ├── src/verify.ts       Claude Opus research with web search (prompt lives here)</w:t>
+        <w:t xml:space="preserve">    ├── src/verify.ts       Claude research with web search (prompt lives here)</w:t>
       </w:r>
       <w:r>
         <w:br/>
@@ -1404,7 +1404,7 @@
           <w:bCs/>
           <w:b/>
         </w:rPr>
-        <w:t xml:space="preserve">Background research (Claude Opus 5.5 + web search, up to 25 s).</w:t>
+        <w:t xml:space="preserve">Background research (Claude Haiku 5.5 + web search, up to 25 s).</w:t>
       </w:r>
       <w:r>
         <w:t xml:space="preserve"> </w:t>
@@ -2608,13 +2608,13 @@
       </w:r>
     </w:p>
     <w:bookmarkEnd w:id="26"/>
-    <w:bookmarkStart w:id="27" w:name="X517f455061d39539c0b98b8d42294f4fb79919b"/>
+    <w:bookmarkStart w:id="27" w:name="X270627dec26c79ed6d6bda703be054a747bb382"/>
     <w:p>
       <w:pPr>
         <w:pStyle w:val="Heading2"/>
       </w:pPr>
       <w:r>
-        <w:t xml:space="preserve">6. Background research (Claude Opus 5.5 + web search)</w:t>
+        <w:t xml:space="preserve">6. Background research (Claude Haiku 5.5 + web search)</w:t>
       </w:r>
     </w:p>
     <w:p>
@@ -2659,13 +2659,166 @@
         <w:t xml:space="preserve"> </w:t>
       </w:r>
       <w:r>
+        <w:t xml:space="preserve">set by</w:t>
+      </w:r>
+      <w:r>
+        <w:t xml:space="preserve"> </w:t>
+      </w:r>
+      <w:r>
         <w:rPr>
           <w:rStyle w:val="VerbatimChar"/>
         </w:rPr>
+        <w:t xml:space="preserve">RESEARCH_MODEL</w:t>
+      </w:r>
+      <w:r>
+        <w:t xml:space="preserve"> </w:t>
+      </w:r>
+      <w:r>
+        <w:t xml:space="preserve">in</w:t>
+      </w:r>
+      <w:r>
+        <w:t xml:space="preserve"> </w:t>
+      </w:r>
+      <w:r>
+        <w:rPr>
+          <w:rStyle w:val="VerbatimChar"/>
+        </w:rPr>
+        <w:t xml:space="preserve">wrangler.toml</w:t>
+      </w:r>
+      <w:r>
+        <w:t xml:space="preserve">.</w:t>
+      </w:r>
+    </w:p>
+    <w:p>
+      <w:pPr>
+        <w:numPr>
+          <w:ilvl w:val="1"/>
+          <w:numId w:val="1007"/>
+        </w:numPr>
+        <w:pStyle w:val="Compact"/>
+      </w:pPr>
+      <w:r>
+        <w:rPr>
+          <w:rStyle w:val="VerbatimChar"/>
+        </w:rPr>
+        <w:t xml:space="preserve">haiku</w:t>
+      </w:r>
+      <w:r>
+        <w:t xml:space="preserve"> </w:t>
+      </w:r>
+      <w:r>
+        <w:t xml:space="preserve">(default since October 2026):</w:t>
+      </w:r>
+      <w:r>
+        <w:t xml:space="preserve"> </w:t>
+      </w:r>
+      <w:r>
+        <w:rPr>
+          <w:rStyle w:val="VerbatimChar"/>
+        </w:rPr>
+        <w:t xml:space="preserve">claude-haiku-5-5</w:t>
+      </w:r>
+      <w:r>
+        <w:t xml:space="preserve">, effort low, basic web search tool</w:t>
+      </w:r>
+      <w:r>
+        <w:t xml:space="preserve"> </w:t>
+      </w:r>
+      <w:r>
+        <w:rPr>
+          <w:rStyle w:val="VerbatimChar"/>
+        </w:rPr>
+        <w:t xml:space="preserve">web_search_20250305</w:t>
+      </w:r>
+      <w:r>
+        <w:t xml:space="preserve"> </w:t>
+      </w:r>
+      <w:r>
+        <w:t xml:space="preserve">(max 3 searches), structured JSON output. About 85% cheaper than Opus.</w:t>
+      </w:r>
+    </w:p>
+    <w:p>
+      <w:pPr>
+        <w:numPr>
+          <w:ilvl w:val="1"/>
+          <w:numId w:val="1007"/>
+        </w:numPr>
+        <w:pStyle w:val="Compact"/>
+      </w:pPr>
+      <w:r>
+        <w:rPr>
+          <w:rStyle w:val="VerbatimChar"/>
+        </w:rPr>
+        <w:t xml:space="preserve">opus</w:t>
+      </w:r>
+      <w:r>
+        <w:t xml:space="preserve">:</w:t>
+      </w:r>
+      <w:r>
+        <w:t xml:space="preserve"> </w:t>
+      </w:r>
+      <w:r>
+        <w:rPr>
+          <w:rStyle w:val="VerbatimChar"/>
+        </w:rPr>
         <w:t xml:space="preserve">claude-opus-5-5</w:t>
       </w:r>
       <w:r>
-        <w:t xml:space="preserve">, effort low, web search tool (max 3 searches), structured JSON output.</w:t>
+        <w:t xml:space="preserve">, effort low, web search with result filtering</w:t>
+      </w:r>
+      <w:r>
+        <w:t xml:space="preserve"> </w:t>
+      </w:r>
+      <w:r>
+        <w:rPr>
+          <w:rStyle w:val="VerbatimChar"/>
+        </w:rPr>
+        <w:t xml:space="preserve">web_search_20260209</w:t>
+      </w:r>
+      <w:r>
+        <w:t xml:space="preserve"> </w:t>
+      </w:r>
+      <w:r>
+        <w:t xml:space="preserve">(max 3 searches), and server-side fallback to another model if Opus declines. More thorough on unknown or tricky companies.</w:t>
+      </w:r>
+    </w:p>
+    <w:p>
+      <w:pPr>
+        <w:numPr>
+          <w:ilvl w:val="1"/>
+          <w:numId w:val="1007"/>
+        </w:numPr>
+        <w:pStyle w:val="Compact"/>
+      </w:pPr>
+      <w:r>
+        <w:t xml:space="preserve">Switching: change the value in</w:t>
+      </w:r>
+      <w:r>
+        <w:t xml:space="preserve"> </w:t>
+      </w:r>
+      <w:r>
+        <w:rPr>
+          <w:rStyle w:val="VerbatimChar"/>
+        </w:rPr>
+        <w:t xml:space="preserve">worker/wrangler.toml</w:t>
+      </w:r>
+      <w:r>
+        <w:t xml:space="preserve"> </w:t>
+      </w:r>
+      <w:r>
+        <w:t xml:space="preserve">and push to</w:t>
+      </w:r>
+      <w:r>
+        <w:t xml:space="preserve"> </w:t>
+      </w:r>
+      <w:r>
+        <w:rPr>
+          <w:rStyle w:val="VerbatimChar"/>
+        </w:rPr>
+        <w:t xml:space="preserve">main</w:t>
+      </w:r>
+      <w:r>
+        <w:t xml:space="preserve">. No other code change.</w:t>
       </w:r>
     </w:p>
     <w:p>
@@ -5041,7 +5194,7 @@
       <w:pPr>
         <w:numPr>
           <w:ilvl w:val="0"/>
-          <w:numId w:val="1007"/>
+          <w:numId w:val="1008"/>
         </w:numPr>
         <w:pStyle w:val="Compact"/>
       </w:pPr>
@@ -5057,7 +5210,7 @@
       <w:pPr>
         <w:numPr>
           <w:ilvl w:val="0"/>
-          <w:numId w:val="1007"/>
+          <w:numId w:val="1008"/>
         </w:numPr>
         <w:pStyle w:val="Compact"/>
       </w:pPr>
@@ -5103,7 +5256,7 @@
       <w:pPr>
         <w:numPr>
           <w:ilvl w:val="0"/>
-          <w:numId w:val="1007"/>
+          <w:numId w:val="1008"/>
         </w:numPr>
         <w:pStyle w:val="Compact"/>
       </w:pPr>
@@ -5170,7 +5323,7 @@
       <w:pPr>
         <w:numPr>
           <w:ilvl w:val="0"/>
-          <w:numId w:val="1007"/>
+          <w:numId w:val="1008"/>
         </w:numPr>
         <w:pStyle w:val="Compact"/>
       </w:pPr>
@@ -5192,7 +5345,7 @@
       <w:pPr>
         <w:numPr>
           <w:ilvl w:val="0"/>
-          <w:numId w:val="1007"/>
+          <w:numId w:val="1008"/>
         </w:numPr>
         <w:pStyle w:val="Compact"/>
       </w:pPr>
@@ -6167,7 +6320,7 @@
       <w:pPr>
         <w:numPr>
           <w:ilvl w:val="0"/>
-          <w:numId w:val="1008"/>
+          <w:numId w:val="1009"/>
         </w:numPr>
         <w:pStyle w:val="Compact"/>
       </w:pPr>
@@ -6183,180 +6336,6 @@
       </w:r>
       <w:r>
         <w:t xml:space="preserve">Poppins font, white card with 20px corners and a soft warm shadow.</w:t>
-      </w:r>
-    </w:p>
-    <w:p>
-      <w:pPr>
-        <w:numPr>
-          <w:ilvl w:val="0"/>
-          <w:numId w:val="1008"/>
-        </w:numPr>
-        <w:pStyle w:val="Compact"/>
-      </w:pPr>
-      <w:r>
-        <w:rPr>
-          <w:bCs/>
-          <w:b/>
-        </w:rPr>
-        <w:t xml:space="preserve">Fields:</w:t>
-      </w:r>
-      <w:r>
-        <w:t xml:space="preserve"> </w:t>
-      </w:r>
-      <w:r>
-        <w:t xml:space="preserve">50px tall, grey fill, 12px corners, red border on focus.</w:t>
-      </w:r>
-    </w:p>
-    <w:p>
-      <w:pPr>
-        <w:numPr>
-          <w:ilvl w:val="0"/>
-          <w:numId w:val="1008"/>
-        </w:numPr>
-        <w:pStyle w:val="Compact"/>
-      </w:pPr>
-      <w:r>
-        <w:rPr>
-          <w:bCs/>
-          <w:b/>
-        </w:rPr>
-        <w:t xml:space="preserve">Button:</w:t>
-      </w:r>
-      <w:r>
-        <w:t xml:space="preserve"> </w:t>
-      </w:r>
-      <w:r>
-        <w:t xml:space="preserve">red-to-coral gradient with a glow.</w:t>
-      </w:r>
-    </w:p>
-    <w:p>
-      <w:pPr>
-        <w:numPr>
-          <w:ilvl w:val="0"/>
-          <w:numId w:val="1008"/>
-        </w:numPr>
-        <w:pStyle w:val="Compact"/>
-      </w:pPr>
-      <w:r>
-        <w:rPr>
-          <w:bCs/>
-          <w:b/>
-        </w:rPr>
-        <w:t xml:space="preserve">Location buttons:</w:t>
-      </w:r>
-      <w:r>
-        <w:t xml:space="preserve"> </w:t>
-      </w:r>
-      <w:r>
-        <w:t xml:space="preserve">red and pink when picked.</w:t>
-      </w:r>
-    </w:p>
-    <w:p>
-      <w:pPr>
-        <w:numPr>
-          <w:ilvl w:val="0"/>
-          <w:numId w:val="1008"/>
-        </w:numPr>
-        <w:pStyle w:val="Compact"/>
-      </w:pPr>
-      <w:r>
-        <w:rPr>
-          <w:bCs/>
-          <w:b/>
-        </w:rPr>
-        <w:t xml:space="preserve">Smaller screens:</w:t>
-      </w:r>
-      <w:r>
-        <w:t xml:space="preserve"> </w:t>
-      </w:r>
-      <w:r>
-        <w:t xml:space="preserve">text steps down below 1200px and 810px, matching the site breakpoints.</w:t>
-      </w:r>
-    </w:p>
-    <w:p>
-      <w:pPr>
-        <w:pStyle w:val="FirstParagraph"/>
-      </w:pPr>
-      <w:r>
-        <w:rPr>
-          <w:bCs/>
-          <w:b/>
-        </w:rPr>
-        <w:t xml:space="preserve">Thank-you popup</w:t>
-      </w:r>
-      <w:r>
-        <w:t xml:space="preserve"> </w:t>
-      </w:r>
-      <w:r>
-        <w:t xml:space="preserve">(not-fit and spam): a check icon, "Thanks for reaching out!", links to Customer stories and the Blog, and an email line for real restaurants. It closes with ×, Esc or a click outside, and the form clears. It is added to</w:t>
-      </w:r>
-      <w:r>
-        <w:t xml:space="preserve"> </w:t>
-      </w:r>
-      <w:r>
-        <w:rPr>
-          <w:rStyle w:val="VerbatimChar"/>
-        </w:rPr>
-        <w:t xml:space="preserve">document.body</w:t>
-      </w:r>
-      <w:r>
-        <w:t xml:space="preserve">, so Framer layouts can't clip it.</w:t>
-      </w:r>
-    </w:p>
-    <w:p>
-      <w:pPr>
-        <w:pStyle w:val="BodyText"/>
-      </w:pPr>
-      <w:r>
-        <w:rPr>
-          <w:bCs/>
-          <w:b/>
-        </w:rPr>
-        <w:t xml:space="preserve">Framer layout:</w:t>
-      </w:r>
-      <w:r>
-        <w:t xml:space="preserve"> </w:t>
-      </w:r>
-      <w:r>
-        <w:t xml:space="preserve">the component is set to Width</w:t>
-      </w:r>
-      <w:r>
-        <w:t xml:space="preserve"> </w:t>
-      </w:r>
-      <w:r>
-        <w:rPr>
-          <w:bCs/>
-          <w:b/>
-        </w:rPr>
-        <w:t xml:space="preserve">Fill</w:t>
-      </w:r>
-      <w:r>
-        <w:t xml:space="preserve">, Height</w:t>
-      </w:r>
-      <w:r>
-        <w:t xml:space="preserve"> </w:t>
-      </w:r>
-      <w:r>
-        <w:rPr>
-          <w:bCs/>
-          <w:b/>
-        </w:rPr>
-        <w:t xml:space="preserve">Fit</w:t>
-      </w:r>
-      <w:r>
-        <w:t xml:space="preserve">, in the Hero row next to the text column.</w:t>
-      </w:r>
-    </w:p>
-    <w:p>
-      <w:pPr>
-        <w:pStyle w:val="BodyText"/>
-      </w:pPr>
-      <w:r>
-        <w:rPr>
-          <w:bCs/>
-          <w:b/>
-        </w:rPr>
-        <w:t xml:space="preserve">How to update the code in Framer</w:t>
       </w:r>
     </w:p>
     <w:p>
@@ -6368,19 +6347,17 @@
         <w:pStyle w:val="Compact"/>
       </w:pPr>
       <w:r>
-        <w:t xml:space="preserve">Assets → Code →</w:t>
-      </w:r>
-      <w:r>
-        <w:t xml:space="preserve"> </w:t>
-      </w:r>
-      <w:r>
-        <w:rPr>
-          <w:rStyle w:val="VerbatimChar"/>
-        </w:rPr>
-        <w:t xml:space="preserve">LeadForm</w:t>
-      </w:r>
-      <w:r>
-        <w:t xml:space="preserve">, then ⌘A and Delete.</w:t>
+        <w:rPr>
+          <w:bCs/>
+          <w:b/>
+        </w:rPr>
+        <w:t xml:space="preserve">Fields:</w:t>
+      </w:r>
+      <w:r>
+        <w:t xml:space="preserve"> </w:t>
+      </w:r>
+      <w:r>
+        <w:t xml:space="preserve">50px tall, grey fill, 12px corners, red border on focus.</w:t>
       </w:r>
     </w:p>
     <w:p>
@@ -6392,7 +6369,17 @@
         <w:pStyle w:val="Compact"/>
       </w:pPr>
       <w:r>
-        <w:t xml:space="preserve">Paste the file in parts of about 100 lines or fewer. Framer cuts off long pastes; click at the very end before each part.</w:t>
+        <w:rPr>
+          <w:bCs/>
+          <w:b/>
+        </w:rPr>
+        <w:t xml:space="preserve">Button:</w:t>
+      </w:r>
+      <w:r>
+        <w:t xml:space="preserve"> </w:t>
+      </w:r>
+      <w:r>
+        <w:t xml:space="preserve">red-to-coral gradient with a glow.</w:t>
       </w:r>
     </w:p>
     <w:p>
@@ -6404,22 +6391,17 @@
         <w:pStyle w:val="Compact"/>
       </w:pPr>
       <w:r>
-        <w:t xml:space="preserve">Check the last line is</w:t>
-      </w:r>
-      <w:r>
-        <w:t xml:space="preserve"> </w:t>
-      </w:r>
-      <w:r>
-        <w:rPr>
-          <w:rStyle w:val="VerbatimChar"/>
-        </w:rPr>
-        <w:t xml:space="preserve">}</w:t>
-      </w:r>
-      <w:r>
-        <w:t xml:space="preserve"> </w:t>
-      </w:r>
-      <w:r>
-        <w:t xml:space="preserve">and there are no red errors (yellow is fine), then ⌘S.</w:t>
+        <w:rPr>
+          <w:bCs/>
+          <w:b/>
+        </w:rPr>
+        <w:t xml:space="preserve">Location buttons:</w:t>
+      </w:r>
+      <w:r>
+        <w:t xml:space="preserve"> </w:t>
+      </w:r>
+      <w:r>
+        <w:t xml:space="preserve">red and pink when picked.</w:t>
       </w:r>
     </w:p>
     <w:p>
@@ -6431,24 +6413,103 @@
         <w:pStyle w:val="Compact"/>
       </w:pPr>
       <w:r>
-        <w:t xml:space="preserve">Preview, test, Publish.</w:t>
-      </w:r>
-    </w:p>
-    <w:p>
-      <w:r>
-        <w:pict>
-          <v:rect style="width:0;height:1.5pt" o:hralign="center" o:hrstd="t" o:hr="t"/>
-        </w:pict>
-      </w:r>
-    </w:p>
-    <w:bookmarkEnd w:id="30"/>
-    <w:bookmarkStart w:id="36" w:name="X497994e209e35e6e36f3d01afe525e30b3131b7"/>
-    <w:p>
-      <w:pPr>
-        <w:pStyle w:val="Heading2"/>
-      </w:pPr>
-      <w:r>
-        <w:t xml:space="preserve">9. Cloudflare Worker setup</w:t>
+        <w:rPr>
+          <w:bCs/>
+          <w:b/>
+        </w:rPr>
+        <w:t xml:space="preserve">Smaller screens:</w:t>
+      </w:r>
+      <w:r>
+        <w:t xml:space="preserve"> </w:t>
+      </w:r>
+      <w:r>
+        <w:t xml:space="preserve">text steps down below 1200px and 810px, matching the site breakpoints.</w:t>
+      </w:r>
+    </w:p>
+    <w:p>
+      <w:pPr>
+        <w:pStyle w:val="FirstParagraph"/>
+      </w:pPr>
+      <w:r>
+        <w:rPr>
+          <w:bCs/>
+          <w:b/>
+        </w:rPr>
+        <w:t xml:space="preserve">Thank-you popup</w:t>
+      </w:r>
+      <w:r>
+        <w:t xml:space="preserve"> </w:t>
+      </w:r>
+      <w:r>
+        <w:t xml:space="preserve">(not-fit and spam): a check icon, "Thanks for reaching out!", links to Customer stories and the Blog, and an email line for real restaurants. It closes with ×, Esc or a click outside, and the form clears. It is added to</w:t>
+      </w:r>
+      <w:r>
+        <w:t xml:space="preserve"> </w:t>
+      </w:r>
+      <w:r>
+        <w:rPr>
+          <w:rStyle w:val="VerbatimChar"/>
+        </w:rPr>
+        <w:t xml:space="preserve">document.body</w:t>
+      </w:r>
+      <w:r>
+        <w:t xml:space="preserve">, so Framer layouts can't clip it.</w:t>
+      </w:r>
+    </w:p>
+    <w:p>
+      <w:pPr>
+        <w:pStyle w:val="BodyText"/>
+      </w:pPr>
+      <w:r>
+        <w:rPr>
+          <w:bCs/>
+          <w:b/>
+        </w:rPr>
+        <w:t xml:space="preserve">Framer layout:</w:t>
+      </w:r>
+      <w:r>
+        <w:t xml:space="preserve"> </w:t>
+      </w:r>
+      <w:r>
+        <w:t xml:space="preserve">the component is set to Width</w:t>
+      </w:r>
+      <w:r>
+        <w:t xml:space="preserve"> </w:t>
+      </w:r>
+      <w:r>
+        <w:rPr>
+          <w:bCs/>
+          <w:b/>
+        </w:rPr>
+        <w:t xml:space="preserve">Fill</w:t>
+      </w:r>
+      <w:r>
+        <w:t xml:space="preserve">, Height</w:t>
+      </w:r>
+      <w:r>
+        <w:t xml:space="preserve"> </w:t>
+      </w:r>
+      <w:r>
+        <w:rPr>
+          <w:bCs/>
+          <w:b/>
+        </w:rPr>
+        <w:t xml:space="preserve">Fit</w:t>
+      </w:r>
+      <w:r>
+        <w:t xml:space="preserve">, in the Hero row next to the text column.</w:t>
+      </w:r>
+    </w:p>
+    <w:p>
+      <w:pPr>
+        <w:pStyle w:val="BodyText"/>
+      </w:pPr>
+      <w:r>
+        <w:rPr>
+          <w:bCs/>
+          <w:b/>
+        </w:rPr>
+        <w:t xml:space="preserve">How to update the code in Framer</w:t>
       </w:r>
     </w:p>
     <w:p>
@@ -6460,17 +6521,7 @@
         <w:pStyle w:val="Compact"/>
       </w:pPr>
       <w:r>
-        <w:rPr>
-          <w:bCs/>
-          <w:b/>
-        </w:rPr>
-        <w:t xml:space="preserve">Deploy:</w:t>
-      </w:r>
-      <w:r>
-        <w:t xml:space="preserve"> </w:t>
-      </w:r>
-      <w:r>
-        <w:t xml:space="preserve">Workers &amp; Pages → Import a repository →</w:t>
+        <w:t xml:space="preserve">Assets → Code →</w:t>
       </w:r>
       <w:r>
         <w:t xml:space="preserve"> </w:t>
@@ -6479,22 +6530,100 @@
         <w:rPr>
           <w:rStyle w:val="VerbatimChar"/>
         </w:rPr>
-        <w:t xml:space="preserve">dev-momos-marketing/mkt-automation</w:t>
-      </w:r>
-      <w:r>
-        <w:t xml:space="preserve">.</w:t>
+        <w:t xml:space="preserve">LeadForm</w:t>
+      </w:r>
+      <w:r>
+        <w:t xml:space="preserve">, then ⌘A and Delete.</w:t>
       </w:r>
     </w:p>
     <w:p>
       <w:pPr>
         <w:numPr>
-          <w:ilvl w:val="1"/>
+          <w:ilvl w:val="0"/>
+          <w:numId w:val="1010"/>
+        </w:numPr>
+        <w:pStyle w:val="Compact"/>
+      </w:pPr>
+      <w:r>
+        <w:t xml:space="preserve">Paste the file in parts of about 100 lines or fewer. Framer cuts off long pastes; click at the very end before each part.</w:t>
+      </w:r>
+    </w:p>
+    <w:p>
+      <w:pPr>
+        <w:numPr>
+          <w:ilvl w:val="0"/>
+          <w:numId w:val="1010"/>
+        </w:numPr>
+        <w:pStyle w:val="Compact"/>
+      </w:pPr>
+      <w:r>
+        <w:t xml:space="preserve">Check the last line is</w:t>
+      </w:r>
+      <w:r>
+        <w:t xml:space="preserve"> </w:t>
+      </w:r>
+      <w:r>
+        <w:rPr>
+          <w:rStyle w:val="VerbatimChar"/>
+        </w:rPr>
+        <w:t xml:space="preserve">}</w:t>
+      </w:r>
+      <w:r>
+        <w:t xml:space="preserve"> </w:t>
+      </w:r>
+      <w:r>
+        <w:t xml:space="preserve">and there are no red errors (yellow is fine), then ⌘S.</w:t>
+      </w:r>
+    </w:p>
+    <w:p>
+      <w:pPr>
+        <w:numPr>
+          <w:ilvl w:val="0"/>
+          <w:numId w:val="1010"/>
+        </w:numPr>
+        <w:pStyle w:val="Compact"/>
+      </w:pPr>
+      <w:r>
+        <w:t xml:space="preserve">Preview, test, Publish.</w:t>
+      </w:r>
+    </w:p>
+    <w:p>
+      <w:r>
+        <w:pict>
+          <v:rect style="width:0;height:1.5pt" o:hralign="center" o:hrstd="t" o:hr="t"/>
+        </w:pict>
+      </w:r>
+    </w:p>
+    <w:bookmarkEnd w:id="30"/>
+    <w:bookmarkStart w:id="36" w:name="X497994e209e35e6e36f3d01afe525e30b3131b7"/>
+    <w:p>
+      <w:pPr>
+        <w:pStyle w:val="Heading2"/>
+      </w:pPr>
+      <w:r>
+        <w:t xml:space="preserve">9. Cloudflare Worker setup</w:t>
+      </w:r>
+    </w:p>
+    <w:p>
+      <w:pPr>
+        <w:numPr>
+          <w:ilvl w:val="0"/>
           <w:numId w:val="1011"/>
         </w:numPr>
         <w:pStyle w:val="Compact"/>
       </w:pPr>
       <w:r>
-        <w:t xml:space="preserve">Root directory</w:t>
+        <w:rPr>
+          <w:bCs/>
+          <w:b/>
+        </w:rPr>
+        <w:t xml:space="preserve">Deploy:</w:t>
+      </w:r>
+      <w:r>
+        <w:t xml:space="preserve"> </w:t>
+      </w:r>
+      <w:r>
+        <w:t xml:space="preserve">Workers &amp; Pages → Import a repository →</w:t>
       </w:r>
       <w:r>
         <w:t xml:space="preserve"> </w:t>
@@ -6503,19 +6632,22 @@
         <w:rPr>
           <w:rStyle w:val="VerbatimChar"/>
         </w:rPr>
-        <w:t xml:space="preserve">lead-routing/worker</w:t>
+        <w:t xml:space="preserve">dev-momos-marketing/mkt-automation</w:t>
+      </w:r>
+      <w:r>
+        <w:t xml:space="preserve">.</w:t>
       </w:r>
     </w:p>
     <w:p>
       <w:pPr>
         <w:numPr>
           <w:ilvl w:val="1"/>
-          <w:numId w:val="1011"/>
+          <w:numId w:val="1012"/>
         </w:numPr>
         <w:pStyle w:val="Compact"/>
       </w:pPr>
       <w:r>
-        <w:t xml:space="preserve">Build command</w:t>
+        <w:t xml:space="preserve">Root directory</w:t>
       </w:r>
       <w:r>
         <w:t xml:space="preserve"> </w:t>
@@ -6524,19 +6656,19 @@
         <w:rPr>
           <w:rStyle w:val="VerbatimChar"/>
         </w:rPr>
-        <w:t xml:space="preserve">npm ci</w:t>
+        <w:t xml:space="preserve">lead-routing/worker</w:t>
       </w:r>
     </w:p>
     <w:p>
       <w:pPr>
         <w:numPr>
           <w:ilvl w:val="1"/>
-          <w:numId w:val="1011"/>
+          <w:numId w:val="1012"/>
         </w:numPr>
         <w:pStyle w:val="Compact"/>
       </w:pPr>
       <w:r>
-        <w:t xml:space="preserve">Deploy command</w:t>
+        <w:t xml:space="preserve">Build command</w:t>
       </w:r>
       <w:r>
         <w:t xml:space="preserve"> </w:t>
@@ -6545,14 +6677,35 @@
         <w:rPr>
           <w:rStyle w:val="VerbatimChar"/>
         </w:rPr>
-        <w:t xml:space="preserve">npx wrangler deploy</w:t>
+        <w:t xml:space="preserve">npm ci</w:t>
       </w:r>
     </w:p>
     <w:p>
       <w:pPr>
         <w:numPr>
           <w:ilvl w:val="1"/>
-          <w:numId w:val="1011"/>
+          <w:numId w:val="1012"/>
+        </w:numPr>
+        <w:pStyle w:val="Compact"/>
+      </w:pPr>
+      <w:r>
+        <w:t xml:space="preserve">Deploy command</w:t>
+      </w:r>
+      <w:r>
+        <w:t xml:space="preserve"> </w:t>
+      </w:r>
+      <w:r>
+        <w:rPr>
+          <w:rStyle w:val="VerbatimChar"/>
+        </w:rPr>
+        <w:t xml:space="preserve">npx wrangler deploy</w:t>
+      </w:r>
+    </w:p>
+    <w:p>
+      <w:pPr>
+        <w:numPr>
+          <w:ilvl w:val="1"/>
+          <w:numId w:val="1012"/>
         </w:numPr>
         <w:pStyle w:val="Compact"/>
       </w:pPr>
@@ -6934,6 +7087,80 @@
               <w:rPr>
                 <w:rStyle w:val="VerbatimChar"/>
               </w:rPr>
+              <w:t xml:space="preserve">RESEARCH_MODEL</w:t>
+            </w:r>
+          </w:p>
+        </w:tc>
+        <w:tc>
+          <w:tcPr/>
+          <w:p>
+            <w:pPr>
+              <w:pStyle w:val="Compact"/>
+              <w:jc w:val="left"/>
+            </w:pPr>
+            <w:r>
+              <w:rPr>
+                <w:rStyle w:val="VerbatimChar"/>
+              </w:rPr>
+              <w:t xml:space="preserve">haiku</w:t>
+            </w:r>
+          </w:p>
+        </w:tc>
+        <w:tc>
+          <w:tcPr/>
+          <w:p>
+            <w:pPr>
+              <w:pStyle w:val="Compact"/>
+              <w:jc w:val="left"/>
+            </w:pPr>
+            <w:r>
+              <w:t xml:space="preserve">Which Claude does the background research:</w:t>
+            </w:r>
+            <w:r>
+              <w:t xml:space="preserve"> </w:t>
+            </w:r>
+            <w:r>
+              <w:rPr>
+                <w:rStyle w:val="VerbatimChar"/>
+              </w:rPr>
+              <w:t xml:space="preserve">haiku</w:t>
+            </w:r>
+            <w:r>
+              <w:t xml:space="preserve"> </w:t>
+            </w:r>
+            <w:r>
+              <w:t xml:space="preserve">(cheap) or</w:t>
+            </w:r>
+            <w:r>
+              <w:t xml:space="preserve"> </w:t>
+            </w:r>
+            <w:r>
+              <w:rPr>
+                <w:rStyle w:val="VerbatimChar"/>
+              </w:rPr>
+              <w:t xml:space="preserve">opus</w:t>
+            </w:r>
+            <w:r>
+              <w:t xml:space="preserve"> </w:t>
+            </w:r>
+            <w:r>
+              <w:t xml:space="preserve">(thorough). See section 17 for costs.</w:t>
+            </w:r>
+          </w:p>
+        </w:tc>
+      </w:tr>
+      <w:tr>
+        <w:tc>
+          <w:tcPr/>
+          <w:p>
+            <w:pPr>
+              <w:pStyle w:val="Compact"/>
+              <w:jc w:val="left"/>
+            </w:pPr>
+            <w:r>
+              <w:rPr>
+                <w:rStyle w:val="VerbatimChar"/>
+              </w:rPr>
               <w:t xml:space="preserve">[observability] enabled = true</w:t>
             </w:r>
           </w:p>
@@ -7032,7 +7259,7 @@
       <w:pPr>
         <w:numPr>
           <w:ilvl w:val="0"/>
-          <w:numId w:val="1012"/>
+          <w:numId w:val="1013"/>
         </w:numPr>
         <w:pStyle w:val="Compact"/>
       </w:pPr>
@@ -7050,7 +7277,7 @@
       <w:pPr>
         <w:numPr>
           <w:ilvl w:val="0"/>
-          <w:numId w:val="1012"/>
+          <w:numId w:val="1013"/>
         </w:numPr>
         <w:pStyle w:val="Compact"/>
       </w:pPr>
@@ -7103,7 +7330,7 @@
       <w:pPr>
         <w:numPr>
           <w:ilvl w:val="0"/>
-          <w:numId w:val="1013"/>
+          <w:numId w:val="1014"/>
         </w:numPr>
         <w:pStyle w:val="Compact"/>
       </w:pPr>
@@ -7145,74 +7372,101 @@
       <w:pPr>
         <w:numPr>
           <w:ilvl w:val="0"/>
-          <w:numId w:val="1013"/>
-        </w:numPr>
-        <w:pStyle w:val="Compact"/>
-      </w:pPr>
-      <w:r>
-        <w:t xml:space="preserve">API key stored only as the Cloudflare secret.</w:t>
-      </w:r>
-    </w:p>
-    <w:p>
-      <w:pPr>
-        <w:numPr>
-          <w:ilvl w:val="0"/>
-          <w:numId w:val="1013"/>
-        </w:numPr>
-        <w:pStyle w:val="Compact"/>
-      </w:pPr>
-      <w:r>
-        <w:rPr>
-          <w:bCs/>
-          <w:b/>
-        </w:rPr>
-        <w:t xml:space="preserve">Models:</w:t>
-      </w:r>
-    </w:p>
-    <w:p>
-      <w:pPr>
-        <w:numPr>
-          <w:ilvl w:val="1"/>
           <w:numId w:val="1014"/>
         </w:numPr>
         <w:pStyle w:val="Compact"/>
       </w:pPr>
       <w:r>
-        <w:rPr>
-          <w:rStyle w:val="VerbatimChar"/>
-        </w:rPr>
-        <w:t xml:space="preserve">claude-haiku-5-5</w:t>
-      </w:r>
-      <w:r>
-        <w:t xml:space="preserve">: gate, every non-spam lead</w:t>
+        <w:t xml:space="preserve">API key stored only as the Cloudflare secret.</w:t>
       </w:r>
     </w:p>
     <w:p>
       <w:pPr>
         <w:numPr>
-          <w:ilvl w:val="1"/>
+          <w:ilvl w:val="0"/>
           <w:numId w:val="1014"/>
         </w:numPr>
         <w:pStyle w:val="Compact"/>
       </w:pPr>
       <w:r>
         <w:rPr>
+          <w:bCs/>
+          <w:b/>
+        </w:rPr>
+        <w:t xml:space="preserve">Models:</w:t>
+      </w:r>
+    </w:p>
+    <w:p>
+      <w:pPr>
+        <w:numPr>
+          <w:ilvl w:val="1"/>
+          <w:numId w:val="1015"/>
+        </w:numPr>
+        <w:pStyle w:val="Compact"/>
+      </w:pPr>
+      <w:r>
+        <w:rPr>
           <w:rStyle w:val="VerbatimChar"/>
         </w:rPr>
+        <w:t xml:space="preserve">claude-haiku-5-5</w:t>
+      </w:r>
+      <w:r>
+        <w:t xml:space="preserve">: gate, every non-spam lead</w:t>
+      </w:r>
+    </w:p>
+    <w:p>
+      <w:pPr>
+        <w:numPr>
+          <w:ilvl w:val="1"/>
+          <w:numId w:val="1015"/>
+        </w:numPr>
+        <w:pStyle w:val="Compact"/>
+      </w:pPr>
+      <w:r>
+        <w:rPr>
+          <w:rStyle w:val="VerbatimChar"/>
+        </w:rPr>
+        <w:t xml:space="preserve">claude-haiku-5-5</w:t>
+      </w:r>
+      <w:r>
+        <w:t xml:space="preserve"> </w:t>
+      </w:r>
+      <w:r>
+        <w:t xml:space="preserve">with web search: research, every non-spam lead when Zapier is on (or</w:t>
+      </w:r>
+      <w:r>
+        <w:t xml:space="preserve"> </w:t>
+      </w:r>
+      <w:r>
+        <w:rPr>
+          <w:rStyle w:val="VerbatimChar"/>
+        </w:rPr>
         <w:t xml:space="preserve">claude-opus-5-5</w:t>
       </w:r>
       <w:r>
         <w:t xml:space="preserve"> </w:t>
       </w:r>
       <w:r>
-        <w:t xml:space="preserve">with web search: research, every non-spam lead when Zapier is on</w:t>
+        <w:t xml:space="preserve">if</w:t>
+      </w:r>
+      <w:r>
+        <w:t xml:space="preserve"> </w:t>
+      </w:r>
+      <w:r>
+        <w:rPr>
+          <w:rStyle w:val="VerbatimChar"/>
+        </w:rPr>
+        <w:t xml:space="preserve">RESEARCH_MODEL = "opus"</w:t>
+      </w:r>
+      <w:r>
+        <w:t xml:space="preserve">)</w:t>
       </w:r>
     </w:p>
     <w:p>
       <w:pPr>
         <w:numPr>
           <w:ilvl w:val="0"/>
-          <w:numId w:val="1013"/>
+          <w:numId w:val="1014"/>
         </w:numPr>
         <w:pStyle w:val="Compact"/>
       </w:pPr>
@@ -7227,7 +7481,7 @@
         <w:t xml:space="preserve"> </w:t>
       </w:r>
       <w:r>
-        <w:t xml:space="preserve">check Console → Cost, grouped by model. Haiku should show for every lead; Opus and web search should show when research is running. Estimates by volume and suggested spend limits are in section 17.</w:t>
+        <w:t xml:space="preserve">check Console → Cost, grouped by model. Haiku should show for every lead (twice when research runs), and web search should show when research is running. Estimates by volume and suggested spend limits are in section 17.</w:t>
       </w:r>
     </w:p>
     <w:p>
@@ -8305,6 +8559,80 @@
                 <w:rStyle w:val="VerbatimChar"/>
               </w:rPr>
               <w:t xml:space="preserve">worker/src/route.ts</w:t>
+            </w:r>
+          </w:p>
+        </w:tc>
+      </w:tr>
+      <w:tr>
+        <w:tc>
+          <w:tcPr/>
+          <w:p>
+            <w:pPr>
+              <w:pStyle w:val="Compact"/>
+              <w:jc w:val="left"/>
+            </w:pPr>
+            <w:r>
+              <w:t xml:space="preserve">Switch research between Haiku and Opus</w:t>
+            </w:r>
+          </w:p>
+        </w:tc>
+        <w:tc>
+          <w:tcPr/>
+          <w:p>
+            <w:pPr>
+              <w:pStyle w:val="Compact"/>
+              <w:jc w:val="left"/>
+            </w:pPr>
+            <w:r>
+              <w:rPr>
+                <w:rStyle w:val="VerbatimChar"/>
+              </w:rPr>
+              <w:t xml:space="preserve">RESEARCH_MODEL</w:t>
+            </w:r>
+            <w:r>
+              <w:t xml:space="preserve"> </w:t>
+            </w:r>
+            <w:r>
+              <w:t xml:space="preserve">in</w:t>
+            </w:r>
+            <w:r>
+              <w:t xml:space="preserve"> </w:t>
+            </w:r>
+            <w:r>
+              <w:rPr>
+                <w:rStyle w:val="VerbatimChar"/>
+              </w:rPr>
+              <w:t xml:space="preserve">worker/wrangler.toml</w:t>
+            </w:r>
+            <w:r>
+              <w:t xml:space="preserve"> </w:t>
+            </w:r>
+            <w:r>
+              <w:t xml:space="preserve">(</w:t>
+            </w:r>
+            <w:r>
+              <w:rPr>
+                <w:rStyle w:val="VerbatimChar"/>
+              </w:rPr>
+              <w:t xml:space="preserve">haiku</w:t>
+            </w:r>
+            <w:r>
+              <w:t xml:space="preserve"> </w:t>
+            </w:r>
+            <w:r>
+              <w:t xml:space="preserve">or</w:t>
+            </w:r>
+            <w:r>
+              <w:t xml:space="preserve"> </w:t>
+            </w:r>
+            <w:r>
+              <w:rPr>
+                <w:rStyle w:val="VerbatimChar"/>
+              </w:rPr>
+              <w:t xml:space="preserve">opus</w:t>
+            </w:r>
+            <w:r>
+              <w:t xml:space="preserve">), then push to main</w:t>
             </w:r>
           </w:p>
         </w:tc>
@@ -8896,7 +9224,7 @@
               <w:jc w:val="left"/>
             </w:pPr>
             <w:r>
-              <w:t xml:space="preserve">No Opus or web search cost in the Console</w:t>
+              <w:t xml:space="preserve">No web search cost in the Console</w:t>
             </w:r>
           </w:p>
         </w:tc>
@@ -9062,7 +9390,7 @@
       <w:pPr>
         <w:numPr>
           <w:ilvl w:val="0"/>
-          <w:numId w:val="1015"/>
+          <w:numId w:val="1016"/>
         </w:numPr>
         <w:pStyle w:val="Compact"/>
       </w:pPr>
@@ -9085,7 +9413,7 @@
       <w:pPr>
         <w:numPr>
           <w:ilvl w:val="0"/>
-          <w:numId w:val="1015"/>
+          <w:numId w:val="1016"/>
         </w:numPr>
         <w:pStyle w:val="Compact"/>
       </w:pPr>
@@ -9097,7 +9425,7 @@
       <w:pPr>
         <w:numPr>
           <w:ilvl w:val="0"/>
-          <w:numId w:val="1015"/>
+          <w:numId w:val="1016"/>
         </w:numPr>
         <w:pStyle w:val="Compact"/>
       </w:pPr>
@@ -9109,7 +9437,7 @@
       <w:pPr>
         <w:numPr>
           <w:ilvl w:val="0"/>
-          <w:numId w:val="1015"/>
+          <w:numId w:val="1016"/>
         </w:numPr>
         <w:pStyle w:val="Compact"/>
       </w:pPr>
@@ -9121,7 +9449,7 @@
       <w:pPr>
         <w:numPr>
           <w:ilvl w:val="0"/>
-          <w:numId w:val="1015"/>
+          <w:numId w:val="1016"/>
         </w:numPr>
         <w:pStyle w:val="Compact"/>
       </w:pPr>
@@ -9133,7 +9461,7 @@
       <w:pPr>
         <w:numPr>
           <w:ilvl w:val="0"/>
-          <w:numId w:val="1015"/>
+          <w:numId w:val="1016"/>
         </w:numPr>
         <w:pStyle w:val="Compact"/>
       </w:pPr>
@@ -9145,7 +9473,7 @@
       <w:pPr>
         <w:numPr>
           <w:ilvl w:val="0"/>
-          <w:numId w:val="1015"/>
+          <w:numId w:val="1016"/>
         </w:numPr>
         <w:pStyle w:val="Compact"/>
       </w:pPr>
@@ -9444,6 +9772,32 @@
           </w:p>
         </w:tc>
       </w:tr>
+      <w:tr>
+        <w:tc>
+          <w:tcPr/>
+          <w:p>
+            <w:pPr>
+              <w:pStyle w:val="Compact"/>
+              <w:jc w:val="left"/>
+            </w:pPr>
+            <w:r>
+              <w:t xml:space="preserve">Research on Haiku instead of Opus</w:t>
+            </w:r>
+          </w:p>
+        </w:tc>
+        <w:tc>
+          <w:tcPr/>
+          <w:p>
+            <w:pPr>
+              <w:pStyle w:val="Compact"/>
+              <w:jc w:val="left"/>
+            </w:pPr>
+            <w:r>
+              <w:t xml:space="preserve">About 85% cheaper. The AE summary is a quick check, not a deep dossier. Switch back with one setting if summaries get worse.</w:t>
+            </w:r>
+          </w:p>
+        </w:tc>
+      </w:tr>
     </w:tbl>
     <w:p>
       <w:r>
@@ -9466,7 +9820,7 @@
       <w:pPr>
         <w:numPr>
           <w:ilvl w:val="0"/>
-          <w:numId w:val="1016"/>
+          <w:numId w:val="1017"/>
         </w:numPr>
         <w:pStyle w:val="Compact"/>
       </w:pPr>
@@ -9503,7 +9857,7 @@
       <w:pPr>
         <w:numPr>
           <w:ilvl w:val="0"/>
-          <w:numId w:val="1016"/>
+          <w:numId w:val="1017"/>
         </w:numPr>
         <w:pStyle w:val="Compact"/>
       </w:pPr>
@@ -9540,7 +9894,7 @@
       <w:pPr>
         <w:numPr>
           <w:ilvl w:val="0"/>
-          <w:numId w:val="1016"/>
+          <w:numId w:val="1017"/>
         </w:numPr>
         <w:pStyle w:val="Compact"/>
       </w:pPr>
@@ -9626,7 +9980,7 @@
       <w:pPr>
         <w:numPr>
           <w:ilvl w:val="0"/>
-          <w:numId w:val="1016"/>
+          <w:numId w:val="1017"/>
         </w:numPr>
         <w:pStyle w:val="Compact"/>
       </w:pPr>
@@ -9641,7 +9995,41 @@
         <w:t xml:space="preserve"> </w:t>
       </w:r>
       <w:r>
-        <w:t xml:space="preserve">After a few real leads, check the Console shows Opus and web search costs. If only Haiku shows, the research isn't running.</w:t>
+        <w:t xml:space="preserve">After a few real leads, check the Console shows web search costs. If there's no web search cost, the research isn't running.</w:t>
+      </w:r>
+    </w:p>
+    <w:p>
+      <w:pPr>
+        <w:numPr>
+          <w:ilvl w:val="0"/>
+          <w:numId w:val="1017"/>
+        </w:numPr>
+        <w:pStyle w:val="Compact"/>
+      </w:pPr>
+      <w:r>
+        <w:rPr>
+          <w:bCs/>
+          <w:b/>
+        </w:rPr>
+        <w:t xml:space="preserve">Haiku research quality.</w:t>
+      </w:r>
+      <w:r>
+        <w:t xml:space="preserve"> </w:t>
+      </w:r>
+      <w:r>
+        <w:t xml:space="preserve">After switching research to Haiku, compare a week of Slack summaries with the Opus ones. If locations or companies are often wrong, set</w:t>
+      </w:r>
+      <w:r>
+        <w:t xml:space="preserve"> </w:t>
+      </w:r>
+      <w:r>
+        <w:rPr>
+          <w:rStyle w:val="VerbatimChar"/>
+        </w:rPr>
+        <w:t xml:space="preserve">RESEARCH_MODEL = "opus"</w:t>
+      </w:r>
+      <w:r>
+        <w:t xml:space="preserve">.</w:t>
       </w:r>
     </w:p>
     <w:p>
@@ -10112,7 +10500,7 @@
           <w:bCs/>
           <w:b/>
         </w:rPr>
-        <w:t xml:space="preserve">Research (Opus + web search, every non-spam lead, including not-fits)</w:t>
+        <w:t xml:space="preserve">Research (every non-spam lead, including not-fits)</w:t>
       </w:r>
     </w:p>
     <w:p>
@@ -10120,7 +10508,40 @@
         <w:pStyle w:val="BodyText"/>
       </w:pPr>
       <w:r>
-        <w:t xml:space="preserve">Search results are added to Claude's input, which is why input tokens are the biggest part.</w:t>
+        <w:t xml:space="preserve">Search results are added to Claude's input, which is why input tokens are the biggest part of the token cost. With Haiku, the $0.01-per-search fee is most of the bill.</w:t>
+      </w:r>
+    </w:p>
+    <w:p>
+      <w:pPr>
+        <w:pStyle w:val="BodyText"/>
+      </w:pPr>
+      <w:r>
+        <w:rPr>
+          <w:iCs/>
+          <w:i/>
+        </w:rPr>
+        <w:t xml:space="preserve">Haiku (</w:t>
+      </w:r>
+      <w:r>
+        <w:rPr>
+          <w:rStyle w:val="VerbatimChar"/>
+          <w:iCs/>
+          <w:i/>
+        </w:rPr>
+        <w:t xml:space="preserve">RESEARCH_MODEL = "haiku"</w:t>
+      </w:r>
+      <w:r>
+        <w:rPr>
+          <w:iCs/>
+          <w:i/>
+        </w:rPr>
+        <w:t xml:space="preserve">, the default).</w:t>
+      </w:r>
+      <w:r>
+        <w:t xml:space="preserve"> </w:t>
+      </w:r>
+      <w:r>
+        <w:t xml:space="preserve">Haiku uses the basic search tool, which passes full results to Claude, so it reads more tokens than Opus. They're 40× cheaper per token, so it doesn't matter.</w:t>
       </w:r>
     </w:p>
     <w:tbl>
@@ -10306,31 +10727,31 @@
               <w:jc w:val="left"/>
             </w:pPr>
             <w:r>
-              <w:t xml:space="preserve">~10,000 ($0.04)</w:t>
-            </w:r>
-          </w:p>
-        </w:tc>
-        <w:tc>
-          <w:tcPr/>
-          <w:p>
-            <w:pPr>
-              <w:pStyle w:val="Compact"/>
-              <w:jc w:val="left"/>
-            </w:pPr>
-            <w:r>
-              <w:t xml:space="preserve">~25,000 ($0.10)</w:t>
-            </w:r>
-          </w:p>
-        </w:tc>
-        <w:tc>
-          <w:tcPr/>
-          <w:p>
-            <w:pPr>
-              <w:pStyle w:val="Compact"/>
-              <w:jc w:val="left"/>
-            </w:pPr>
-            <w:r>
-              <w:t xml:space="preserve">~50,000 ($0.20)</w:t>
+              <w:t xml:space="preserve">~15,000 ($0.0015)</w:t>
+            </w:r>
+          </w:p>
+        </w:tc>
+        <w:tc>
+          <w:tcPr/>
+          <w:p>
+            <w:pPr>
+              <w:pStyle w:val="Compact"/>
+              <w:jc w:val="left"/>
+            </w:pPr>
+            <w:r>
+              <w:t xml:space="preserve">~35,000 ($0.0035)</w:t>
+            </w:r>
+          </w:p>
+        </w:tc>
+        <w:tc>
+          <w:tcPr/>
+          <w:p>
+            <w:pPr>
+              <w:pStyle w:val="Compact"/>
+              <w:jc w:val="left"/>
+            </w:pPr>
+            <w:r>
+              <w:t xml:space="preserve">~70,000 ($0.007)</w:t>
             </w:r>
           </w:p>
         </w:tc>
@@ -10356,31 +10777,31 @@
               <w:jc w:val="left"/>
             </w:pPr>
             <w:r>
-              <w:t xml:space="preserve">~1,000 ($0.02)</w:t>
-            </w:r>
-          </w:p>
-        </w:tc>
-        <w:tc>
-          <w:tcPr/>
-          <w:p>
-            <w:pPr>
-              <w:pStyle w:val="Compact"/>
-              <w:jc w:val="left"/>
-            </w:pPr>
-            <w:r>
-              <w:t xml:space="preserve">~1,500 ($0.03)</w:t>
-            </w:r>
-          </w:p>
-        </w:tc>
-        <w:tc>
-          <w:tcPr/>
-          <w:p>
-            <w:pPr>
-              <w:pStyle w:val="Compact"/>
-              <w:jc w:val="left"/>
-            </w:pPr>
-            <w:r>
-              <w:t xml:space="preserve">~3,000 ($0.06)</w:t>
+              <w:t xml:space="preserve">~1,000 ($0.0005)</w:t>
+            </w:r>
+          </w:p>
+        </w:tc>
+        <w:tc>
+          <w:tcPr/>
+          <w:p>
+            <w:pPr>
+              <w:pStyle w:val="Compact"/>
+              <w:jc w:val="left"/>
+            </w:pPr>
+            <w:r>
+              <w:t xml:space="preserve">~1,500 ($0.0008)</w:t>
+            </w:r>
+          </w:p>
+        </w:tc>
+        <w:tc>
+          <w:tcPr/>
+          <w:p>
+            <w:pPr>
+              <w:pStyle w:val="Compact"/>
+              <w:jc w:val="left"/>
+            </w:pPr>
+            <w:r>
+              <w:t xml:space="preserve">~3,000 ($0.0015)</w:t>
             </w:r>
           </w:p>
         </w:tc>
@@ -10414,7 +10835,7 @@
                 <w:bCs/>
                 <w:b/>
               </w:rPr>
-              <w:t xml:space="preserve">~$0.07</w:t>
+              <w:t xml:space="preserve">~$0.012</w:t>
             </w:r>
           </w:p>
         </w:tc>
@@ -10430,7 +10851,7 @@
                 <w:bCs/>
                 <w:b/>
               </w:rPr>
-              <w:t xml:space="preserve">~$0.15</w:t>
+              <w:t xml:space="preserve">~$0.024</w:t>
             </w:r>
           </w:p>
         </w:tc>
@@ -10446,7 +10867,7 @@
                 <w:bCs/>
                 <w:b/>
               </w:rPr>
-              <w:t xml:space="preserve">~$0.30</w:t>
+              <w:t xml:space="preserve">~$0.04</w:t>
             </w:r>
           </w:p>
         </w:tc>
@@ -10457,37 +10878,26 @@
         <w:pStyle w:val="BodyText"/>
       </w:pPr>
       <w:r>
-        <w:t xml:space="preserve">The hard limits in the code keep the worst case bounded: max 3 searches, effort</w:t>
-      </w:r>
-      <w:r>
-        <w:t xml:space="preserve"> </w:t>
+        <w:rPr>
+          <w:iCs/>
+          <w:i/>
+        </w:rPr>
+        <w:t xml:space="preserve">Opus (</w:t>
       </w:r>
       <w:r>
         <w:rPr>
           <w:rStyle w:val="VerbatimChar"/>
-        </w:rPr>
-        <w:t xml:space="preserve">low</w:t>
-      </w:r>
-      <w:r>
-        <w:t xml:space="preserve">, 8,000 output tokens per call, at most 2 calls, 25 seconds total.</w:t>
-      </w:r>
-    </w:p>
-    <w:bookmarkEnd w:id="52"/>
-    <w:bookmarkStart w:id="53" w:name="X1ef809496bf5defa4b0596fab8a062ea4236720"/>
-    <w:p>
-      <w:pPr>
-        <w:pStyle w:val="Heading3"/>
-      </w:pPr>
-      <w:r>
-        <w:t xml:space="preserve">Monthly cost by number of form submissions</w:t>
-      </w:r>
-    </w:p>
-    <w:p>
-      <w:pPr>
-        <w:pStyle w:val="FirstParagraph"/>
-      </w:pPr>
-      <w:r>
-        <w:t xml:space="preserve">Assumes about 15% of submissions are spam (no Claude cost). The other 85% get both the fit check and the research.</w:t>
+          <w:iCs/>
+          <w:i/>
+        </w:rPr>
+        <w:t xml:space="preserve">RESEARCH_MODEL = "opus"</w:t>
+      </w:r>
+      <w:r>
+        <w:rPr>
+          <w:iCs/>
+          <w:i/>
+        </w:rPr>
+        <w:t xml:space="preserve">).</w:t>
       </w:r>
     </w:p>
     <w:tbl>
@@ -10498,14 +10908,10 @@
         <w:jc w:val="start"/>
       </w:tblPr>
       <w:tblGrid>
-        <w:gridCol w:w="990"/>
-        <w:gridCol w:w="990"/>
-        <w:gridCol w:w="990"/>
-        <w:gridCol w:w="990"/>
-        <w:gridCol w:w="990"/>
-        <w:gridCol w:w="990"/>
-        <w:gridCol w:w="990"/>
-        <w:gridCol w:w="990"/>
+        <w:gridCol w:w="1980"/>
+        <w:gridCol w:w="1980"/>
+        <w:gridCol w:w="1980"/>
+        <w:gridCol w:w="1980"/>
       </w:tblGrid>
       <w:tr>
         <w:trPr>
@@ -10516,49 +10922,197 @@
           <w:p>
             <w:pPr>
               <w:pStyle w:val="Compact"/>
-              <w:jc w:val="left"/>
-            </w:pPr>
-            <w:r>
-              <w:t xml:space="preserve">Submissions / month</w:t>
-            </w:r>
-          </w:p>
-        </w:tc>
-        <w:tc>
-          <w:tcPr/>
-          <w:p>
-            <w:pPr>
-              <w:pStyle w:val="Compact"/>
-              <w:jc w:val="left"/>
-            </w:pPr>
-            <w:r>
-              <w:t xml:space="preserve">Leads checked</w:t>
-            </w:r>
-          </w:p>
-        </w:tc>
-        <w:tc>
-          <w:tcPr/>
-          <w:p>
-            <w:pPr>
-              <w:pStyle w:val="Compact"/>
-              <w:jc w:val="left"/>
-            </w:pPr>
-            <w:r>
-              <w:t xml:space="preserve">Fit check</w:t>
-            </w:r>
-          </w:p>
-        </w:tc>
-        <w:tc>
-          <w:tcPr/>
-          <w:p>
-            <w:pPr>
-              <w:pStyle w:val="Compact"/>
-              <w:jc w:val="left"/>
-            </w:pPr>
-            <w:r>
-              <w:t xml:space="preserve">Research (light)</w:t>
-            </w:r>
-          </w:p>
-        </w:tc>
+            </w:pPr>
+          </w:p>
+        </w:tc>
+        <w:tc>
+          <w:tcPr/>
+          <w:p>
+            <w:pPr>
+              <w:pStyle w:val="Compact"/>
+              <w:jc w:val="left"/>
+            </w:pPr>
+            <w:r>
+              <w:t xml:space="preserve">Light</w:t>
+            </w:r>
+          </w:p>
+        </w:tc>
+        <w:tc>
+          <w:tcPr/>
+          <w:p>
+            <w:pPr>
+              <w:pStyle w:val="Compact"/>
+              <w:jc w:val="left"/>
+            </w:pPr>
+            <w:r>
+              <w:t xml:space="preserve">Typical</w:t>
+            </w:r>
+          </w:p>
+        </w:tc>
+        <w:tc>
+          <w:tcPr/>
+          <w:p>
+            <w:pPr>
+              <w:pStyle w:val="Compact"/>
+              <w:jc w:val="left"/>
+            </w:pPr>
+            <w:r>
+              <w:t xml:space="preserve">Heavy</w:t>
+            </w:r>
+          </w:p>
+        </w:tc>
+      </w:tr>
+      <w:tr>
+        <w:tc>
+          <w:tcPr/>
+          <w:p>
+            <w:pPr>
+              <w:pStyle w:val="Compact"/>
+              <w:jc w:val="left"/>
+            </w:pPr>
+            <w:r>
+              <w:t xml:space="preserve">Searches</w:t>
+            </w:r>
+          </w:p>
+        </w:tc>
+        <w:tc>
+          <w:tcPr/>
+          <w:p>
+            <w:pPr>
+              <w:pStyle w:val="Compact"/>
+              <w:jc w:val="left"/>
+            </w:pPr>
+            <w:r>
+              <w:t xml:space="preserve">1 ($0.01)</w:t>
+            </w:r>
+          </w:p>
+        </w:tc>
+        <w:tc>
+          <w:tcPr/>
+          <w:p>
+            <w:pPr>
+              <w:pStyle w:val="Compact"/>
+              <w:jc w:val="left"/>
+            </w:pPr>
+            <w:r>
+              <w:t xml:space="preserve">2 ($0.02)</w:t>
+            </w:r>
+          </w:p>
+        </w:tc>
+        <w:tc>
+          <w:tcPr/>
+          <w:p>
+            <w:pPr>
+              <w:pStyle w:val="Compact"/>
+              <w:jc w:val="left"/>
+            </w:pPr>
+            <w:r>
+              <w:t xml:space="preserve">3 ($0.03)</w:t>
+            </w:r>
+          </w:p>
+        </w:tc>
+      </w:tr>
+      <w:tr>
+        <w:tc>
+          <w:tcPr/>
+          <w:p>
+            <w:pPr>
+              <w:pStyle w:val="Compact"/>
+              <w:jc w:val="left"/>
+            </w:pPr>
+            <w:r>
+              <w:t xml:space="preserve">Input tokens (incl. filtered search results)</w:t>
+            </w:r>
+          </w:p>
+        </w:tc>
+        <w:tc>
+          <w:tcPr/>
+          <w:p>
+            <w:pPr>
+              <w:pStyle w:val="Compact"/>
+              <w:jc w:val="left"/>
+            </w:pPr>
+            <w:r>
+              <w:t xml:space="preserve">~10,000 ($0.04)</w:t>
+            </w:r>
+          </w:p>
+        </w:tc>
+        <w:tc>
+          <w:tcPr/>
+          <w:p>
+            <w:pPr>
+              <w:pStyle w:val="Compact"/>
+              <w:jc w:val="left"/>
+            </w:pPr>
+            <w:r>
+              <w:t xml:space="preserve">~25,000 ($0.10)</w:t>
+            </w:r>
+          </w:p>
+        </w:tc>
+        <w:tc>
+          <w:tcPr/>
+          <w:p>
+            <w:pPr>
+              <w:pStyle w:val="Compact"/>
+              <w:jc w:val="left"/>
+            </w:pPr>
+            <w:r>
+              <w:t xml:space="preserve">~50,000 ($0.20)</w:t>
+            </w:r>
+          </w:p>
+        </w:tc>
+      </w:tr>
+      <w:tr>
+        <w:tc>
+          <w:tcPr/>
+          <w:p>
+            <w:pPr>
+              <w:pStyle w:val="Compact"/>
+              <w:jc w:val="left"/>
+            </w:pPr>
+            <w:r>
+              <w:t xml:space="preserve">Output tokens (thinking + JSON)</w:t>
+            </w:r>
+          </w:p>
+        </w:tc>
+        <w:tc>
+          <w:tcPr/>
+          <w:p>
+            <w:pPr>
+              <w:pStyle w:val="Compact"/>
+              <w:jc w:val="left"/>
+            </w:pPr>
+            <w:r>
+              <w:t xml:space="preserve">~1,000 ($0.02)</w:t>
+            </w:r>
+          </w:p>
+        </w:tc>
+        <w:tc>
+          <w:tcPr/>
+          <w:p>
+            <w:pPr>
+              <w:pStyle w:val="Compact"/>
+              <w:jc w:val="left"/>
+            </w:pPr>
+            <w:r>
+              <w:t xml:space="preserve">~1,500 ($0.03)</w:t>
+            </w:r>
+          </w:p>
+        </w:tc>
+        <w:tc>
+          <w:tcPr/>
+          <w:p>
+            <w:pPr>
+              <w:pStyle w:val="Compact"/>
+              <w:jc w:val="left"/>
+            </w:pPr>
+            <w:r>
+              <w:t xml:space="preserve">~3,000 ($0.06)</w:t>
+            </w:r>
+          </w:p>
+        </w:tc>
+      </w:tr>
+      <w:tr>
         <w:tc>
           <w:tcPr/>
           <w:p>
@@ -10571,19 +11125,7 @@
                 <w:bCs/>
                 <w:b/>
               </w:rPr>
-              <w:t xml:space="preserve">Research (typical)</w:t>
-            </w:r>
-          </w:p>
-        </w:tc>
-        <w:tc>
-          <w:tcPr/>
-          <w:p>
-            <w:pPr>
-              <w:pStyle w:val="Compact"/>
-              <w:jc w:val="left"/>
-            </w:pPr>
-            <w:r>
-              <w:t xml:space="preserve">Research (heavy)</w:t>
+              <w:t xml:space="preserve">Per lead</w:t>
             </w:r>
           </w:p>
         </w:tc>
@@ -10599,69 +11141,7 @@
                 <w:bCs/>
                 <w:b/>
               </w:rPr>
-              <w:t xml:space="preserve">Typical total</w:t>
-            </w:r>
-          </w:p>
-        </w:tc>
-        <w:tc>
-          <w:tcPr/>
-          <w:p>
-            <w:pPr>
-              <w:pStyle w:val="Compact"/>
-              <w:jc w:val="left"/>
-            </w:pPr>
-            <w:r>
-              <w:t xml:space="preserve">Suggested spend limit</w:t>
-            </w:r>
-          </w:p>
-        </w:tc>
-      </w:tr>
-      <w:tr>
-        <w:tc>
-          <w:tcPr/>
-          <w:p>
-            <w:pPr>
-              <w:pStyle w:val="Compact"/>
-              <w:jc w:val="left"/>
-            </w:pPr>
-            <w:r>
-              <w:t xml:space="preserve">50</w:t>
-            </w:r>
-          </w:p>
-        </w:tc>
-        <w:tc>
-          <w:tcPr/>
-          <w:p>
-            <w:pPr>
-              <w:pStyle w:val="Compact"/>
-              <w:jc w:val="left"/>
-            </w:pPr>
-            <w:r>
-              <w:t xml:space="preserve">~43</w:t>
-            </w:r>
-          </w:p>
-        </w:tc>
-        <w:tc>
-          <w:tcPr/>
-          <w:p>
-            <w:pPr>
-              <w:pStyle w:val="Compact"/>
-              <w:jc w:val="left"/>
-            </w:pPr>
-            <w:r>
-              <w:t xml:space="preserve">&lt;$0.01</w:t>
-            </w:r>
-          </w:p>
-        </w:tc>
-        <w:tc>
-          <w:tcPr/>
-          <w:p>
-            <w:pPr>
-              <w:pStyle w:val="Compact"/>
-              <w:jc w:val="left"/>
-            </w:pPr>
-            <w:r>
-              <w:t xml:space="preserve">$3</w:t>
+              <w:t xml:space="preserve">~$0.07</w:t>
             </w:r>
           </w:p>
         </w:tc>
@@ -10677,19 +11157,7 @@
                 <w:bCs/>
                 <w:b/>
               </w:rPr>
-              <w:t xml:space="preserve">$6</w:t>
-            </w:r>
-          </w:p>
-        </w:tc>
-        <w:tc>
-          <w:tcPr/>
-          <w:p>
-            <w:pPr>
-              <w:pStyle w:val="Compact"/>
-              <w:jc w:val="left"/>
-            </w:pPr>
-            <w:r>
-              <w:t xml:space="preserve">$13</w:t>
+              <w:t xml:space="preserve">~$0.15</w:t>
             </w:r>
           </w:p>
         </w:tc>
@@ -10705,69 +11173,91 @@
                 <w:bCs/>
                 <w:b/>
               </w:rPr>
-              <w:t xml:space="preserve">~$6</w:t>
-            </w:r>
-          </w:p>
-        </w:tc>
-        <w:tc>
-          <w:tcPr/>
-          <w:p>
-            <w:pPr>
-              <w:pStyle w:val="Compact"/>
-              <w:jc w:val="left"/>
-            </w:pPr>
-            <w:r>
-              <w:t xml:space="preserve">$15</w:t>
-            </w:r>
-          </w:p>
-        </w:tc>
-      </w:tr>
-      <w:tr>
-        <w:tc>
-          <w:tcPr/>
-          <w:p>
-            <w:pPr>
-              <w:pStyle w:val="Compact"/>
-              <w:jc w:val="left"/>
-            </w:pPr>
-            <w:r>
-              <w:t xml:space="preserve">100</w:t>
-            </w:r>
-          </w:p>
-        </w:tc>
-        <w:tc>
-          <w:tcPr/>
-          <w:p>
-            <w:pPr>
-              <w:pStyle w:val="Compact"/>
-              <w:jc w:val="left"/>
-            </w:pPr>
-            <w:r>
-              <w:t xml:space="preserve">85</w:t>
-            </w:r>
-          </w:p>
-        </w:tc>
-        <w:tc>
-          <w:tcPr/>
-          <w:p>
-            <w:pPr>
-              <w:pStyle w:val="Compact"/>
-              <w:jc w:val="left"/>
-            </w:pPr>
-            <w:r>
-              <w:t xml:space="preserve">$0.01</w:t>
-            </w:r>
-          </w:p>
-        </w:tc>
-        <w:tc>
-          <w:tcPr/>
-          <w:p>
-            <w:pPr>
-              <w:pStyle w:val="Compact"/>
-              <w:jc w:val="left"/>
-            </w:pPr>
-            <w:r>
-              <w:t xml:space="preserve">$6</w:t>
+              <w:t xml:space="preserve">~$0.30</w:t>
+            </w:r>
+          </w:p>
+        </w:tc>
+      </w:tr>
+    </w:tbl>
+    <w:p>
+      <w:pPr>
+        <w:pStyle w:val="BodyText"/>
+      </w:pPr>
+      <w:r>
+        <w:t xml:space="preserve">The hard limits in the code keep the worst case bounded on either model: max 3 searches, effort</w:t>
+      </w:r>
+      <w:r>
+        <w:t xml:space="preserve"> </w:t>
+      </w:r>
+      <w:r>
+        <w:rPr>
+          <w:rStyle w:val="VerbatimChar"/>
+        </w:rPr>
+        <w:t xml:space="preserve">low</w:t>
+      </w:r>
+      <w:r>
+        <w:t xml:space="preserve">, 8,000 output tokens per call, at most 2 calls, 25 seconds total.</w:t>
+      </w:r>
+    </w:p>
+    <w:bookmarkEnd w:id="52"/>
+    <w:bookmarkStart w:id="53" w:name="X1ef809496bf5defa4b0596fab8a062ea4236720"/>
+    <w:p>
+      <w:pPr>
+        <w:pStyle w:val="Heading3"/>
+      </w:pPr>
+      <w:r>
+        <w:t xml:space="preserve">Monthly cost by number of form submissions</w:t>
+      </w:r>
+    </w:p>
+    <w:p>
+      <w:pPr>
+        <w:pStyle w:val="FirstParagraph"/>
+      </w:pPr>
+      <w:r>
+        <w:t xml:space="preserve">Assumes about 15% of submissions are spam (no Claude cost). The other 85% get both the fit check and the research. The fit check adds under $0.50 a month even at 5,000 submissions, so it's left out of the totals.</w:t>
+      </w:r>
+    </w:p>
+    <w:tbl>
+      <w:tblPr>
+        <w:tblStyle w:val="Table"/>
+        <w:tblW w:type="auto" w:w="0"/>
+        <w:tblLook w:firstRow="1" w:lastRow="0" w:firstColumn="0" w:lastColumn="0" w:noHBand="0" w:noVBand="0" w:val="0020"/>
+        <w:jc w:val="start"/>
+      </w:tblPr>
+      <w:tblGrid>
+        <w:gridCol w:w="1131"/>
+        <w:gridCol w:w="1131"/>
+        <w:gridCol w:w="1131"/>
+        <w:gridCol w:w="1131"/>
+        <w:gridCol w:w="1131"/>
+        <w:gridCol w:w="1131"/>
+        <w:gridCol w:w="1131"/>
+      </w:tblGrid>
+      <w:tr>
+        <w:trPr>
+          <w:tblHeader w:val="true"/>
+        </w:trPr>
+        <w:tc>
+          <w:tcPr/>
+          <w:p>
+            <w:pPr>
+              <w:pStyle w:val="Compact"/>
+              <w:jc w:val="left"/>
+            </w:pPr>
+            <w:r>
+              <w:t xml:space="preserve">Submissions / month</w:t>
+            </w:r>
+          </w:p>
+        </w:tc>
+        <w:tc>
+          <w:tcPr/>
+          <w:p>
+            <w:pPr>
+              <w:pStyle w:val="Compact"/>
+              <w:jc w:val="left"/>
+            </w:pPr>
+            <w:r>
+              <w:t xml:space="preserve">Leads checked</w:t>
             </w:r>
           </w:p>
         </w:tc>
@@ -10783,19 +11273,81 @@
                 <w:bCs/>
                 <w:b/>
               </w:rPr>
-              <w:t xml:space="preserve">$13</w:t>
-            </w:r>
-          </w:p>
-        </w:tc>
-        <w:tc>
-          <w:tcPr/>
-          <w:p>
-            <w:pPr>
-              <w:pStyle w:val="Compact"/>
-              <w:jc w:val="left"/>
-            </w:pPr>
-            <w:r>
-              <w:t xml:space="preserve">$26</w:t>
+              <w:t xml:space="preserve">Haiku research, typical</w:t>
+            </w:r>
+          </w:p>
+        </w:tc>
+        <w:tc>
+          <w:tcPr/>
+          <w:p>
+            <w:pPr>
+              <w:pStyle w:val="Compact"/>
+              <w:jc w:val="left"/>
+            </w:pPr>
+            <w:r>
+              <w:t xml:space="preserve">Haiku, heavy</w:t>
+            </w:r>
+          </w:p>
+        </w:tc>
+        <w:tc>
+          <w:tcPr/>
+          <w:p>
+            <w:pPr>
+              <w:pStyle w:val="Compact"/>
+              <w:jc w:val="left"/>
+            </w:pPr>
+            <w:r>
+              <w:t xml:space="preserve">Opus research, typical</w:t>
+            </w:r>
+          </w:p>
+        </w:tc>
+        <w:tc>
+          <w:tcPr/>
+          <w:p>
+            <w:pPr>
+              <w:pStyle w:val="Compact"/>
+              <w:jc w:val="left"/>
+            </w:pPr>
+            <w:r>
+              <w:t xml:space="preserve">Opus, heavy</w:t>
+            </w:r>
+          </w:p>
+        </w:tc>
+        <w:tc>
+          <w:tcPr/>
+          <w:p>
+            <w:pPr>
+              <w:pStyle w:val="Compact"/>
+              <w:jc w:val="left"/>
+            </w:pPr>
+            <w:r>
+              <w:t xml:space="preserve">Suggested spend limit (Haiku)</w:t>
+            </w:r>
+          </w:p>
+        </w:tc>
+      </w:tr>
+      <w:tr>
+        <w:tc>
+          <w:tcPr/>
+          <w:p>
+            <w:pPr>
+              <w:pStyle w:val="Compact"/>
+              <w:jc w:val="left"/>
+            </w:pPr>
+            <w:r>
+              <w:t xml:space="preserve">50</w:t>
+            </w:r>
+          </w:p>
+        </w:tc>
+        <w:tc>
+          <w:tcPr/>
+          <w:p>
+            <w:pPr>
+              <w:pStyle w:val="Compact"/>
+              <w:jc w:val="left"/>
+            </w:pPr>
+            <w:r>
+              <w:t xml:space="preserve">~43</w:t>
             </w:r>
           </w:p>
         </w:tc>
@@ -10811,69 +11363,81 @@
                 <w:bCs/>
                 <w:b/>
               </w:rPr>
-              <w:t xml:space="preserve">~$13</w:t>
-            </w:r>
-          </w:p>
-        </w:tc>
-        <w:tc>
-          <w:tcPr/>
-          <w:p>
-            <w:pPr>
-              <w:pStyle w:val="Compact"/>
-              <w:jc w:val="left"/>
-            </w:pPr>
-            <w:r>
-              <w:t xml:space="preserve">$25</w:t>
-            </w:r>
-          </w:p>
-        </w:tc>
-      </w:tr>
-      <w:tr>
-        <w:tc>
-          <w:tcPr/>
-          <w:p>
-            <w:pPr>
-              <w:pStyle w:val="Compact"/>
-              <w:jc w:val="left"/>
-            </w:pPr>
-            <w:r>
-              <w:t xml:space="preserve">250</w:t>
-            </w:r>
-          </w:p>
-        </w:tc>
-        <w:tc>
-          <w:tcPr/>
-          <w:p>
-            <w:pPr>
-              <w:pStyle w:val="Compact"/>
-              <w:jc w:val="left"/>
-            </w:pPr>
-            <w:r>
-              <w:t xml:space="preserve">~213</w:t>
-            </w:r>
-          </w:p>
-        </w:tc>
-        <w:tc>
-          <w:tcPr/>
-          <w:p>
-            <w:pPr>
-              <w:pStyle w:val="Compact"/>
-              <w:jc w:val="left"/>
-            </w:pPr>
-            <w:r>
-              <w:t xml:space="preserve">$0.02</w:t>
-            </w:r>
-          </w:p>
-        </w:tc>
-        <w:tc>
-          <w:tcPr/>
-          <w:p>
-            <w:pPr>
-              <w:pStyle w:val="Compact"/>
-              <w:jc w:val="left"/>
-            </w:pPr>
-            <w:r>
-              <w:t xml:space="preserve">$15</w:t>
+              <w:t xml:space="preserve">~$1</w:t>
+            </w:r>
+          </w:p>
+        </w:tc>
+        <w:tc>
+          <w:tcPr/>
+          <w:p>
+            <w:pPr>
+              <w:pStyle w:val="Compact"/>
+              <w:jc w:val="left"/>
+            </w:pPr>
+            <w:r>
+              <w:t xml:space="preserve">$2</w:t>
+            </w:r>
+          </w:p>
+        </w:tc>
+        <w:tc>
+          <w:tcPr/>
+          <w:p>
+            <w:pPr>
+              <w:pStyle w:val="Compact"/>
+              <w:jc w:val="left"/>
+            </w:pPr>
+            <w:r>
+              <w:t xml:space="preserve">$6</w:t>
+            </w:r>
+          </w:p>
+        </w:tc>
+        <w:tc>
+          <w:tcPr/>
+          <w:p>
+            <w:pPr>
+              <w:pStyle w:val="Compact"/>
+              <w:jc w:val="left"/>
+            </w:pPr>
+            <w:r>
+              <w:t xml:space="preserve">$13</w:t>
+            </w:r>
+          </w:p>
+        </w:tc>
+        <w:tc>
+          <w:tcPr/>
+          <w:p>
+            <w:pPr>
+              <w:pStyle w:val="Compact"/>
+              <w:jc w:val="left"/>
+            </w:pPr>
+            <w:r>
+              <w:t xml:space="preserve">$5</w:t>
+            </w:r>
+          </w:p>
+        </w:tc>
+      </w:tr>
+      <w:tr>
+        <w:tc>
+          <w:tcPr/>
+          <w:p>
+            <w:pPr>
+              <w:pStyle w:val="Compact"/>
+              <w:jc w:val="left"/>
+            </w:pPr>
+            <w:r>
+              <w:t xml:space="preserve">100</w:t>
+            </w:r>
+          </w:p>
+        </w:tc>
+        <w:tc>
+          <w:tcPr/>
+          <w:p>
+            <w:pPr>
+              <w:pStyle w:val="Compact"/>
+              <w:jc w:val="left"/>
+            </w:pPr>
+            <w:r>
+              <w:t xml:space="preserve">85</w:t>
             </w:r>
           </w:p>
         </w:tc>
@@ -10889,19 +11453,81 @@
                 <w:bCs/>
                 <w:b/>
               </w:rPr>
-              <w:t xml:space="preserve">$32</w:t>
-            </w:r>
-          </w:p>
-        </w:tc>
-        <w:tc>
-          <w:tcPr/>
-          <w:p>
-            <w:pPr>
-              <w:pStyle w:val="Compact"/>
-              <w:jc w:val="left"/>
-            </w:pPr>
-            <w:r>
-              <w:t xml:space="preserve">$64</w:t>
+              <w:t xml:space="preserve">~$2</w:t>
+            </w:r>
+          </w:p>
+        </w:tc>
+        <w:tc>
+          <w:tcPr/>
+          <w:p>
+            <w:pPr>
+              <w:pStyle w:val="Compact"/>
+              <w:jc w:val="left"/>
+            </w:pPr>
+            <w:r>
+              <w:t xml:space="preserve">$3</w:t>
+            </w:r>
+          </w:p>
+        </w:tc>
+        <w:tc>
+          <w:tcPr/>
+          <w:p>
+            <w:pPr>
+              <w:pStyle w:val="Compact"/>
+              <w:jc w:val="left"/>
+            </w:pPr>
+            <w:r>
+              <w:t xml:space="preserve">$13</w:t>
+            </w:r>
+          </w:p>
+        </w:tc>
+        <w:tc>
+          <w:tcPr/>
+          <w:p>
+            <w:pPr>
+              <w:pStyle w:val="Compact"/>
+              <w:jc w:val="left"/>
+            </w:pPr>
+            <w:r>
+              <w:t xml:space="preserve">$26</w:t>
+            </w:r>
+          </w:p>
+        </w:tc>
+        <w:tc>
+          <w:tcPr/>
+          <w:p>
+            <w:pPr>
+              <w:pStyle w:val="Compact"/>
+              <w:jc w:val="left"/>
+            </w:pPr>
+            <w:r>
+              <w:t xml:space="preserve">$5</w:t>
+            </w:r>
+          </w:p>
+        </w:tc>
+      </w:tr>
+      <w:tr>
+        <w:tc>
+          <w:tcPr/>
+          <w:p>
+            <w:pPr>
+              <w:pStyle w:val="Compact"/>
+              <w:jc w:val="left"/>
+            </w:pPr>
+            <w:r>
+              <w:t xml:space="preserve">250</w:t>
+            </w:r>
+          </w:p>
+        </w:tc>
+        <w:tc>
+          <w:tcPr/>
+          <w:p>
+            <w:pPr>
+              <w:pStyle w:val="Compact"/>
+              <w:jc w:val="left"/>
+            </w:pPr>
+            <w:r>
+              <w:t xml:space="preserve">~213</w:t>
             </w:r>
           </w:p>
         </w:tc>
@@ -10917,19 +11543,55 @@
                 <w:bCs/>
                 <w:b/>
               </w:rPr>
-              <w:t xml:space="preserve">~$32</w:t>
-            </w:r>
-          </w:p>
-        </w:tc>
-        <w:tc>
-          <w:tcPr/>
-          <w:p>
-            <w:pPr>
-              <w:pStyle w:val="Compact"/>
-              <w:jc w:val="left"/>
-            </w:pPr>
-            <w:r>
-              <w:t xml:space="preserve">$65</w:t>
+              <w:t xml:space="preserve">~$5</w:t>
+            </w:r>
+          </w:p>
+        </w:tc>
+        <w:tc>
+          <w:tcPr/>
+          <w:p>
+            <w:pPr>
+              <w:pStyle w:val="Compact"/>
+              <w:jc w:val="left"/>
+            </w:pPr>
+            <w:r>
+              <w:t xml:space="preserve">$9</w:t>
+            </w:r>
+          </w:p>
+        </w:tc>
+        <w:tc>
+          <w:tcPr/>
+          <w:p>
+            <w:pPr>
+              <w:pStyle w:val="Compact"/>
+              <w:jc w:val="left"/>
+            </w:pPr>
+            <w:r>
+              <w:t xml:space="preserve">$32</w:t>
+            </w:r>
+          </w:p>
+        </w:tc>
+        <w:tc>
+          <w:tcPr/>
+          <w:p>
+            <w:pPr>
+              <w:pStyle w:val="Compact"/>
+              <w:jc w:val="left"/>
+            </w:pPr>
+            <w:r>
+              <w:t xml:space="preserve">$64</w:t>
+            </w:r>
+          </w:p>
+        </w:tc>
+        <w:tc>
+          <w:tcPr/>
+          <w:p>
+            <w:pPr>
+              <w:pStyle w:val="Compact"/>
+              <w:jc w:val="left"/>
+            </w:pPr>
+            <w:r>
+              <w:t xml:space="preserve">$10</w:t>
             </w:r>
           </w:p>
         </w:tc>
@@ -10956,30 +11618,6 @@
             </w:pPr>
             <w:r>
               <w:t xml:space="preserve">425</w:t>
-            </w:r>
-          </w:p>
-        </w:tc>
-        <w:tc>
-          <w:tcPr/>
-          <w:p>
-            <w:pPr>
-              <w:pStyle w:val="Compact"/>
-              <w:jc w:val="left"/>
-            </w:pPr>
-            <w:r>
-              <w:t xml:space="preserve">$0.04</w:t>
-            </w:r>
-          </w:p>
-        </w:tc>
-        <w:tc>
-          <w:tcPr/>
-          <w:p>
-            <w:pPr>
-              <w:pStyle w:val="Compact"/>
-              <w:jc w:val="left"/>
-            </w:pPr>
-            <w:r>
-              <w:t xml:space="preserve">$30</w:t>
             </w:r>
           </w:p>
         </w:tc>
@@ -10995,6 +11633,30 @@
                 <w:bCs/>
                 <w:b/>
               </w:rPr>
+              <w:t xml:space="preserve">~$10</w:t>
+            </w:r>
+          </w:p>
+        </w:tc>
+        <w:tc>
+          <w:tcPr/>
+          <w:p>
+            <w:pPr>
+              <w:pStyle w:val="Compact"/>
+              <w:jc w:val="left"/>
+            </w:pPr>
+            <w:r>
+              <w:t xml:space="preserve">$17</w:t>
+            </w:r>
+          </w:p>
+        </w:tc>
+        <w:tc>
+          <w:tcPr/>
+          <w:p>
+            <w:pPr>
+              <w:pStyle w:val="Compact"/>
+              <w:jc w:val="left"/>
+            </w:pPr>
+            <w:r>
               <w:t xml:space="preserve">$64</w:t>
             </w:r>
           </w:p>
@@ -11008,6 +11670,44 @@
             </w:pPr>
             <w:r>
               <w:t xml:space="preserve">$128</w:t>
+            </w:r>
+          </w:p>
+        </w:tc>
+        <w:tc>
+          <w:tcPr/>
+          <w:p>
+            <w:pPr>
+              <w:pStyle w:val="Compact"/>
+              <w:jc w:val="left"/>
+            </w:pPr>
+            <w:r>
+              <w:t xml:space="preserve">$20</w:t>
+            </w:r>
+          </w:p>
+        </w:tc>
+      </w:tr>
+      <w:tr>
+        <w:tc>
+          <w:tcPr/>
+          <w:p>
+            <w:pPr>
+              <w:pStyle w:val="Compact"/>
+              <w:jc w:val="left"/>
+            </w:pPr>
+            <w:r>
+              <w:t xml:space="preserve">1,000</w:t>
+            </w:r>
+          </w:p>
+        </w:tc>
+        <w:tc>
+          <w:tcPr/>
+          <w:p>
+            <w:pPr>
+              <w:pStyle w:val="Compact"/>
+              <w:jc w:val="left"/>
+            </w:pPr>
+            <w:r>
+              <w:t xml:space="preserve">850</w:t>
             </w:r>
           </w:p>
         </w:tc>
@@ -11023,69 +11723,81 @@
                 <w:bCs/>
                 <w:b/>
               </w:rPr>
-              <w:t xml:space="preserve">~$64</w:t>
-            </w:r>
-          </w:p>
-        </w:tc>
-        <w:tc>
-          <w:tcPr/>
-          <w:p>
-            <w:pPr>
-              <w:pStyle w:val="Compact"/>
-              <w:jc w:val="left"/>
-            </w:pPr>
-            <w:r>
-              <w:t xml:space="preserve">$130</w:t>
-            </w:r>
-          </w:p>
-        </w:tc>
-      </w:tr>
-      <w:tr>
-        <w:tc>
-          <w:tcPr/>
-          <w:p>
-            <w:pPr>
-              <w:pStyle w:val="Compact"/>
-              <w:jc w:val="left"/>
-            </w:pPr>
-            <w:r>
-              <w:t xml:space="preserve">1,000</w:t>
-            </w:r>
-          </w:p>
-        </w:tc>
-        <w:tc>
-          <w:tcPr/>
-          <w:p>
-            <w:pPr>
-              <w:pStyle w:val="Compact"/>
-              <w:jc w:val="left"/>
-            </w:pPr>
-            <w:r>
-              <w:t xml:space="preserve">850</w:t>
-            </w:r>
-          </w:p>
-        </w:tc>
-        <w:tc>
-          <w:tcPr/>
-          <w:p>
-            <w:pPr>
-              <w:pStyle w:val="Compact"/>
-              <w:jc w:val="left"/>
-            </w:pPr>
-            <w:r>
-              <w:t xml:space="preserve">$0.09</w:t>
-            </w:r>
-          </w:p>
-        </w:tc>
-        <w:tc>
-          <w:tcPr/>
-          <w:p>
-            <w:pPr>
-              <w:pStyle w:val="Compact"/>
-              <w:jc w:val="left"/>
-            </w:pPr>
-            <w:r>
-              <w:t xml:space="preserve">$60</w:t>
+              <w:t xml:space="preserve">~$20</w:t>
+            </w:r>
+          </w:p>
+        </w:tc>
+        <w:tc>
+          <w:tcPr/>
+          <w:p>
+            <w:pPr>
+              <w:pStyle w:val="Compact"/>
+              <w:jc w:val="left"/>
+            </w:pPr>
+            <w:r>
+              <w:t xml:space="preserve">$34</w:t>
+            </w:r>
+          </w:p>
+        </w:tc>
+        <w:tc>
+          <w:tcPr/>
+          <w:p>
+            <w:pPr>
+              <w:pStyle w:val="Compact"/>
+              <w:jc w:val="left"/>
+            </w:pPr>
+            <w:r>
+              <w:t xml:space="preserve">$128</w:t>
+            </w:r>
+          </w:p>
+        </w:tc>
+        <w:tc>
+          <w:tcPr/>
+          <w:p>
+            <w:pPr>
+              <w:pStyle w:val="Compact"/>
+              <w:jc w:val="left"/>
+            </w:pPr>
+            <w:r>
+              <w:t xml:space="preserve">$255</w:t>
+            </w:r>
+          </w:p>
+        </w:tc>
+        <w:tc>
+          <w:tcPr/>
+          <w:p>
+            <w:pPr>
+              <w:pStyle w:val="Compact"/>
+              <w:jc w:val="left"/>
+            </w:pPr>
+            <w:r>
+              <w:t xml:space="preserve">$40</w:t>
+            </w:r>
+          </w:p>
+        </w:tc>
+      </w:tr>
+      <w:tr>
+        <w:tc>
+          <w:tcPr/>
+          <w:p>
+            <w:pPr>
+              <w:pStyle w:val="Compact"/>
+              <w:jc w:val="left"/>
+            </w:pPr>
+            <w:r>
+              <w:t xml:space="preserve">2,500</w:t>
+            </w:r>
+          </w:p>
+        </w:tc>
+        <w:tc>
+          <w:tcPr/>
+          <w:p>
+            <w:pPr>
+              <w:pStyle w:val="Compact"/>
+              <w:jc w:val="left"/>
+            </w:pPr>
+            <w:r>
+              <w:t xml:space="preserve">2,125</w:t>
             </w:r>
           </w:p>
         </w:tc>
@@ -11101,19 +11813,81 @@
                 <w:bCs/>
                 <w:b/>
               </w:rPr>
-              <w:t xml:space="preserve">$128</w:t>
-            </w:r>
-          </w:p>
-        </w:tc>
-        <w:tc>
-          <w:tcPr/>
-          <w:p>
-            <w:pPr>
-              <w:pStyle w:val="Compact"/>
-              <w:jc w:val="left"/>
-            </w:pPr>
-            <w:r>
-              <w:t xml:space="preserve">$255</w:t>
+              <w:t xml:space="preserve">~$51</w:t>
+            </w:r>
+          </w:p>
+        </w:tc>
+        <w:tc>
+          <w:tcPr/>
+          <w:p>
+            <w:pPr>
+              <w:pStyle w:val="Compact"/>
+              <w:jc w:val="left"/>
+            </w:pPr>
+            <w:r>
+              <w:t xml:space="preserve">$85</w:t>
+            </w:r>
+          </w:p>
+        </w:tc>
+        <w:tc>
+          <w:tcPr/>
+          <w:p>
+            <w:pPr>
+              <w:pStyle w:val="Compact"/>
+              <w:jc w:val="left"/>
+            </w:pPr>
+            <w:r>
+              <w:t xml:space="preserve">$319</w:t>
+            </w:r>
+          </w:p>
+        </w:tc>
+        <w:tc>
+          <w:tcPr/>
+          <w:p>
+            <w:pPr>
+              <w:pStyle w:val="Compact"/>
+              <w:jc w:val="left"/>
+            </w:pPr>
+            <w:r>
+              <w:t xml:space="preserve">$638</w:t>
+            </w:r>
+          </w:p>
+        </w:tc>
+        <w:tc>
+          <w:tcPr/>
+          <w:p>
+            <w:pPr>
+              <w:pStyle w:val="Compact"/>
+              <w:jc w:val="left"/>
+            </w:pPr>
+            <w:r>
+              <w:t xml:space="preserve">$100</w:t>
+            </w:r>
+          </w:p>
+        </w:tc>
+      </w:tr>
+      <w:tr>
+        <w:tc>
+          <w:tcPr/>
+          <w:p>
+            <w:pPr>
+              <w:pStyle w:val="Compact"/>
+              <w:jc w:val="left"/>
+            </w:pPr>
+            <w:r>
+              <w:t xml:space="preserve">5,000</w:t>
+            </w:r>
+          </w:p>
+        </w:tc>
+        <w:tc>
+          <w:tcPr/>
+          <w:p>
+            <w:pPr>
+              <w:pStyle w:val="Compact"/>
+              <w:jc w:val="left"/>
+            </w:pPr>
+            <w:r>
+              <w:t xml:space="preserve">4,250</w:t>
             </w:r>
           </w:p>
         </w:tc>
@@ -11129,85 +11903,19 @@
                 <w:bCs/>
                 <w:b/>
               </w:rPr>
-              <w:t xml:space="preserve">~$128</w:t>
-            </w:r>
-          </w:p>
-        </w:tc>
-        <w:tc>
-          <w:tcPr/>
-          <w:p>
-            <w:pPr>
-              <w:pStyle w:val="Compact"/>
-              <w:jc w:val="left"/>
-            </w:pPr>
-            <w:r>
-              <w:t xml:space="preserve">$260</w:t>
-            </w:r>
-          </w:p>
-        </w:tc>
-      </w:tr>
-      <w:tr>
-        <w:tc>
-          <w:tcPr/>
-          <w:p>
-            <w:pPr>
-              <w:pStyle w:val="Compact"/>
-              <w:jc w:val="left"/>
-            </w:pPr>
-            <w:r>
-              <w:t xml:space="preserve">2,500</w:t>
-            </w:r>
-          </w:p>
-        </w:tc>
-        <w:tc>
-          <w:tcPr/>
-          <w:p>
-            <w:pPr>
-              <w:pStyle w:val="Compact"/>
-              <w:jc w:val="left"/>
-            </w:pPr>
-            <w:r>
-              <w:t xml:space="preserve">2,125</w:t>
-            </w:r>
-          </w:p>
-        </w:tc>
-        <w:tc>
-          <w:tcPr/>
-          <w:p>
-            <w:pPr>
-              <w:pStyle w:val="Compact"/>
-              <w:jc w:val="left"/>
-            </w:pPr>
-            <w:r>
-              <w:t xml:space="preserve">$0.21</w:t>
-            </w:r>
-          </w:p>
-        </w:tc>
-        <w:tc>
-          <w:tcPr/>
-          <w:p>
-            <w:pPr>
-              <w:pStyle w:val="Compact"/>
-              <w:jc w:val="left"/>
-            </w:pPr>
-            <w:r>
-              <w:t xml:space="preserve">$149</w:t>
-            </w:r>
-          </w:p>
-        </w:tc>
-        <w:tc>
-          <w:tcPr/>
-          <w:p>
-            <w:pPr>
-              <w:pStyle w:val="Compact"/>
-              <w:jc w:val="left"/>
-            </w:pPr>
-            <w:r>
-              <w:rPr>
-                <w:bCs/>
-                <w:b/>
-              </w:rPr>
-              <w:t xml:space="preserve">$319</w:t>
+              <w:t xml:space="preserve">~$102</w:t>
+            </w:r>
+          </w:p>
+        </w:tc>
+        <w:tc>
+          <w:tcPr/>
+          <w:p>
+            <w:pPr>
+              <w:pStyle w:val="Compact"/>
+              <w:jc w:val="left"/>
+            </w:pPr>
+            <w:r>
+              <w:t xml:space="preserve">$170</w:t>
             </w:r>
           </w:p>
         </w:tc>
@@ -11231,100 +11939,6 @@
               <w:jc w:val="left"/>
             </w:pPr>
             <w:r>
-              <w:rPr>
-                <w:bCs/>
-                <w:b/>
-              </w:rPr>
-              <w:t xml:space="preserve">~$319</w:t>
-            </w:r>
-          </w:p>
-        </w:tc>
-        <w:tc>
-          <w:tcPr/>
-          <w:p>
-            <w:pPr>
-              <w:pStyle w:val="Compact"/>
-              <w:jc w:val="left"/>
-            </w:pPr>
-            <w:r>
-              <w:t xml:space="preserve">$650</w:t>
-            </w:r>
-          </w:p>
-        </w:tc>
-      </w:tr>
-      <w:tr>
-        <w:tc>
-          <w:tcPr/>
-          <w:p>
-            <w:pPr>
-              <w:pStyle w:val="Compact"/>
-              <w:jc w:val="left"/>
-            </w:pPr>
-            <w:r>
-              <w:t xml:space="preserve">5,000</w:t>
-            </w:r>
-          </w:p>
-        </w:tc>
-        <w:tc>
-          <w:tcPr/>
-          <w:p>
-            <w:pPr>
-              <w:pStyle w:val="Compact"/>
-              <w:jc w:val="left"/>
-            </w:pPr>
-            <w:r>
-              <w:t xml:space="preserve">4,250</w:t>
-            </w:r>
-          </w:p>
-        </w:tc>
-        <w:tc>
-          <w:tcPr/>
-          <w:p>
-            <w:pPr>
-              <w:pStyle w:val="Compact"/>
-              <w:jc w:val="left"/>
-            </w:pPr>
-            <w:r>
-              <w:t xml:space="preserve">$0.43</w:t>
-            </w:r>
-          </w:p>
-        </w:tc>
-        <w:tc>
-          <w:tcPr/>
-          <w:p>
-            <w:pPr>
-              <w:pStyle w:val="Compact"/>
-              <w:jc w:val="left"/>
-            </w:pPr>
-            <w:r>
-              <w:t xml:space="preserve">$298</w:t>
-            </w:r>
-          </w:p>
-        </w:tc>
-        <w:tc>
-          <w:tcPr/>
-          <w:p>
-            <w:pPr>
-              <w:pStyle w:val="Compact"/>
-              <w:jc w:val="left"/>
-            </w:pPr>
-            <w:r>
-              <w:rPr>
-                <w:bCs/>
-                <w:b/>
-              </w:rPr>
-              <w:t xml:space="preserve">$638</w:t>
-            </w:r>
-          </w:p>
-        </w:tc>
-        <w:tc>
-          <w:tcPr/>
-          <w:p>
-            <w:pPr>
-              <w:pStyle w:val="Compact"/>
-              <w:jc w:val="left"/>
-            </w:pPr>
-            <w:r>
               <w:t xml:space="preserve">$1,275</w:t>
             </w:r>
           </w:p>
@@ -11337,23 +11951,7 @@
               <w:jc w:val="left"/>
             </w:pPr>
             <w:r>
-              <w:rPr>
-                <w:bCs/>
-                <w:b/>
-              </w:rPr>
-              <w:t xml:space="preserve">~$638</w:t>
-            </w:r>
-          </w:p>
-        </w:tc>
-        <w:tc>
-          <w:tcPr/>
-          <w:p>
-            <w:pPr>
-              <w:pStyle w:val="Compact"/>
-              <w:jc w:val="left"/>
-            </w:pPr>
-            <w:r>
-              <w:t xml:space="preserve">$1,300</w:t>
+              <w:t xml:space="preserve">$200</w:t>
             </w:r>
           </w:p>
         </w:tc>
@@ -11371,7 +11969,7 @@
       <w:pPr>
         <w:numPr>
           <w:ilvl w:val="0"/>
-          <w:numId w:val="1017"/>
+          <w:numId w:val="1018"/>
         </w:numPr>
         <w:pStyle w:val="Compact"/>
       </w:pPr>
@@ -11386,14 +11984,14 @@
         <w:t xml:space="preserve"> </w:t>
       </w:r>
       <w:r>
-        <w:t xml:space="preserve">at any volume. Even 5,000 submissions a month is under $0.50.</w:t>
+        <w:t xml:space="preserve">at any volume.</w:t>
       </w:r>
     </w:p>
     <w:p>
       <w:pPr>
         <w:numPr>
           <w:ilvl w:val="0"/>
-          <w:numId w:val="1017"/>
+          <w:numId w:val="1018"/>
         </w:numPr>
         <w:pStyle w:val="Compact"/>
       </w:pPr>
@@ -11402,73 +12000,57 @@
           <w:bCs/>
           <w:b/>
         </w:rPr>
-        <w:t xml:space="preserve">The research is ~99% of the bill.</w:t>
-      </w:r>
-      <w:r>
-        <w:t xml:space="preserve"> </w:t>
-      </w:r>
-      <w:r>
-        <w:t xml:space="preserve">Budget about</w:t>
-      </w:r>
-      <w:r>
-        <w:t xml:space="preserve"> </w:t>
-      </w:r>
+        <w:t xml:space="preserve">On Haiku, budget about $0.02 per submission.</w:t>
+      </w:r>
+      <w:r>
+        <w:t xml:space="preserve"> </w:t>
+      </w:r>
+      <w:r>
+        <w:t xml:space="preserve">On Opus it's about $0.13.</w:t>
+      </w:r>
+    </w:p>
+    <w:p>
+      <w:pPr>
+        <w:numPr>
+          <w:ilvl w:val="0"/>
+          <w:numId w:val="1018"/>
+        </w:numPr>
+        <w:pStyle w:val="Compact"/>
+      </w:pPr>
       <w:r>
         <w:rPr>
           <w:bCs/>
           <w:b/>
         </w:rPr>
-        <w:t xml:space="preserve">$0.13 per submission</w:t>
-      </w:r>
-      <w:r>
-        <w:t xml:space="preserve"> </w:t>
-      </w:r>
-      <w:r>
-        <w:t xml:space="preserve">(typical research × 85% non-spam).</w:t>
+        <w:t xml:space="preserve">Suggested spend limit</w:t>
+      </w:r>
+      <w:r>
+        <w:t xml:space="preserve"> </w:t>
+      </w:r>
+      <w:r>
+        <w:t xml:space="preserve">is about 2× the typical month (a bit over the heavy column), so a spam wave or a run of hard leads doesn't stop the system mid-month. If you switch research to Opus, raise the limit to about the Opus heavy column. If the limit is hit, the API refuses calls: the fit check fails open (leads still reach a calendar), but research stops until the limit resets or is raised.</w:t>
       </w:r>
     </w:p>
     <w:p>
       <w:pPr>
         <w:numPr>
           <w:ilvl w:val="0"/>
-          <w:numId w:val="1017"/>
+          <w:numId w:val="1018"/>
         </w:numPr>
         <w:pStyle w:val="Compact"/>
       </w:pPr>
       <w:r>
-        <w:rPr>
-          <w:bCs/>
-          <w:b/>
-        </w:rPr>
-        <w:t xml:space="preserve">Suggested spend limit</w:t>
-      </w:r>
-      <w:r>
-        <w:t xml:space="preserve"> </w:t>
-      </w:r>
-      <w:r>
-        <w:t xml:space="preserve">is about 2× the typical month (≈ the heavy column), so a spam wave or a run of hard leads doesn't stop the system mid-month. If the limit is hit, the API refuses calls: the fit check fails open (leads still reach a calendar), but research stops until the limit resets or is raised.</w:t>
-      </w:r>
-    </w:p>
-    <w:p>
-      <w:pPr>
-        <w:numPr>
-          <w:ilvl w:val="0"/>
-          <w:numId w:val="1017"/>
-        </w:numPr>
-        <w:pStyle w:val="Compact"/>
-      </w:pPr>
-      <w:r>
         <w:t xml:space="preserve">If spam is higher than 15%, costs go down (spam is free). If the share of not-fit leads is high, costs stay the same, because not-fits are still researched.</w:t>
       </w:r>
     </w:p>
     <w:bookmarkEnd w:id="53"/>
-    <w:bookmarkStart w:id="54" w:name="ways-to-cut-the-cost-if-needed"/>
+    <w:bookmarkStart w:id="54" w:name="ways-to-cut-the-cost-further-if-needed"/>
     <w:p>
       <w:pPr>
         <w:pStyle w:val="Heading3"/>
       </w:pPr>
       <w:r>
-        <w:t xml:space="preserve">Ways to cut the cost (if needed)</w:t>
+        <w:t xml:space="preserve">Ways to cut the cost further (if needed)</w:t>
       </w:r>
     </w:p>
     <w:tbl>
@@ -11598,7 +12180,7 @@
               <w:jc w:val="left"/>
             </w:pPr>
             <w:r>
-              <w:t xml:space="preserve">~10–20% less, mostly on heavy leads</w:t>
+              <w:t xml:space="preserve">~10–25% less on Haiku (searches are most of its cost)</w:t>
             </w:r>
           </w:p>
         </w:tc>
@@ -11611,59 +12193,6 @@
             </w:pPr>
             <w:r>
               <w:t xml:space="preserve">Slightly less thorough on unknown companies</w:t>
-            </w:r>
-          </w:p>
-        </w:tc>
-      </w:tr>
-      <w:tr>
-        <w:tc>
-          <w:tcPr/>
-          <w:p>
-            <w:pPr>
-              <w:pStyle w:val="Compact"/>
-              <w:jc w:val="left"/>
-            </w:pPr>
-            <w:r>
-              <w:t xml:space="preserve">Switch research to</w:t>
-            </w:r>
-            <w:r>
-              <w:t xml:space="preserve"> </w:t>
-            </w:r>
-            <w:r>
-              <w:rPr>
-                <w:rStyle w:val="VerbatimChar"/>
-              </w:rPr>
-              <w:t xml:space="preserve">claude-sonnet-5-5</w:t>
-            </w:r>
-            <w:r>
-              <w:t xml:space="preserve"> </w:t>
-            </w:r>
-            <w:r>
-              <w:t xml:space="preserve">($2 / $10 per million)</w:t>
-            </w:r>
-          </w:p>
-        </w:tc>
-        <w:tc>
-          <w:tcPr/>
-          <w:p>
-            <w:pPr>
-              <w:pStyle w:val="Compact"/>
-              <w:jc w:val="left"/>
-            </w:pPr>
-            <w:r>
-              <w:t xml:space="preserve">~45% less (~$0.08 per lead)</w:t>
-            </w:r>
-          </w:p>
-        </w:tc>
-        <w:tc>
-          <w:tcPr/>
-          <w:p>
-            <w:pPr>
-              <w:pStyle w:val="Compact"/>
-              <w:jc w:val="left"/>
-            </w:pPr>
-            <w:r>
-              <w:t xml:space="preserve">Test on 10–20 real leads first to check summary quality</w:t>
             </w:r>
           </w:p>
         </w:tc>
@@ -11776,19 +12305,19 @@
       <w:pPr>
         <w:numPr>
           <w:ilvl w:val="0"/>
-          <w:numId w:val="1018"/>
+          <w:numId w:val="1019"/>
         </w:numPr>
         <w:pStyle w:val="Compact"/>
       </w:pPr>
       <w:r>
-        <w:t xml:space="preserve">Console → Cost, last 30 days, grouped by model. Note the Haiku, Opus and web search totals.</w:t>
+        <w:t xml:space="preserve">Console → Cost, last 30 days, grouped by model. Note the Haiku, Opus (if used) and web search totals.</w:t>
       </w:r>
     </w:p>
     <w:p>
       <w:pPr>
         <w:numPr>
           <w:ilvl w:val="0"/>
-          <w:numId w:val="1018"/>
+          <w:numId w:val="1019"/>
         </w:numPr>
         <w:pStyle w:val="Compact"/>
       </w:pPr>
@@ -11815,12 +12344,12 @@
       <w:pPr>
         <w:numPr>
           <w:ilvl w:val="0"/>
-          <w:numId w:val="1018"/>
+          <w:numId w:val="1019"/>
         </w:numPr>
         <w:pStyle w:val="Compact"/>
       </w:pPr>
       <w:r>
-        <w:t xml:space="preserve">Opus + web search total ÷ number of non-spam leads = your real research cost per lead. Update the "Typical" column if it's far off.</w:t>
+        <w:t xml:space="preserve">Haiku (or Opus) + web search total ÷ number of non-spam leads = your real cost per lead. Haiku runs twice per lead (fit check + research), but almost all of its cost is the research. Update the "Typical" column if it's far off.</w:t>
       </w:r>
     </w:p>
     <w:bookmarkEnd w:id="55"/>
@@ -12271,6 +12800,9 @@
     <w:abstractNumId w:val="991"/>
   </w:num>
   <w:num w:numId="1007">
+    <w:abstractNumId w:val="991"/>
+  </w:num>
+  <w:num w:numId="1008">
     <w:abstractNumId w:val="99411"/>
     <w:lvlOverride w:ilvl="0">
       <w:startOverride w:val="1"/>
@@ -12300,10 +12832,10 @@
       <w:startOverride w:val="1"/>
     </w:lvlOverride>
   </w:num>
-  <w:num w:numId="1008">
+  <w:num w:numId="1009">
     <w:abstractNumId w:val="991"/>
   </w:num>
-  <w:num w:numId="1009">
+  <w:num w:numId="1010">
     <w:abstractNumId w:val="99411"/>
     <w:lvlOverride w:ilvl="0">
       <w:startOverride w:val="1"/>
@@ -12333,9 +12865,6 @@
       <w:startOverride w:val="1"/>
     </w:lvlOverride>
   </w:num>
-  <w:num w:numId="1010">
-    <w:abstractNumId w:val="991"/>
-  </w:num>
   <w:num w:numId="1011">
     <w:abstractNumId w:val="991"/>
   </w:num>
@@ -12358,6 +12887,9 @@
     <w:abstractNumId w:val="991"/>
   </w:num>
   <w:num w:numId="1018">
+    <w:abstractNumId w:val="991"/>
+  </w:num>
+  <w:num w:numId="1019">
     <w:abstractNumId w:val="99411"/>
     <w:lvlOverride w:ilvl="0">
       <w:startOverride w:val="1"/>

</xml_diff>

<commit_message>
Show typical monthly cost at realistic lead volumes
Co-Authored-By: Claude Opus 5.5 <noreply@anthropic.com>
Claude-Session: https://claude.ai/code/session_016MSitiN4QkJHe8WqEGz9RU
</commit_message>
<xml_diff>
--- a/lead-routing/Momos Lead Routing - Technical Documentation.docx
+++ b/lead-routing/Momos Lead Routing - Technical Documentation.docx
@@ -253,7 +253,7 @@
               <w:jc w:val="left"/>
             </w:pPr>
             <w:r>
-              <w:t xml:space="preserve">About $0.0001 per lead for the fit check and about $0.02–0.03 per real lead for the research. Roughly $2 a month at 100 submissions, $20 at 1,000. See section 17.</w:t>
+              <w:t xml:space="preserve">About $0.025 per real lead (fit check + research). Spam costs nothing. Typical month: about $2.50 at 100 submissions, $12.50 at 500. See section 17.</w:t>
             </w:r>
           </w:p>
         </w:tc>
@@ -11200,13 +11200,13 @@
       </w:r>
     </w:p>
     <w:bookmarkEnd w:id="52"/>
-    <w:bookmarkStart w:id="53" w:name="X1ef809496bf5defa4b0596fab8a062ea4236720"/>
+    <w:bookmarkStart w:id="53" w:name="typical-monthly-cost"/>
     <w:p>
       <w:pPr>
         <w:pStyle w:val="Heading3"/>
       </w:pPr>
       <w:r>
-        <w:t xml:space="preserve">Monthly cost by number of form submissions</w:t>
+        <w:t xml:space="preserve">Typical monthly cost</w:t>
       </w:r>
     </w:p>
     <w:p>
@@ -11214,7 +11214,79 @@
         <w:pStyle w:val="FirstParagraph"/>
       </w:pPr>
       <w:r>
-        <w:t xml:space="preserve">Assumes about 15% of submissions are spam (no Claude cost). The other 85% get both the fit check and the research. The fit check adds under $0.50 a month even at 5,000 submissions, so it's left out of the totals.</w:t>
+        <w:rPr>
+          <w:bCs/>
+          <w:b/>
+        </w:rPr>
+        <w:t xml:space="preserve">Spam costs nothing.</w:t>
+      </w:r>
+      <w:r>
+        <w:t xml:space="preserve"> </w:t>
+      </w:r>
+      <w:r>
+        <w:t xml:space="preserve">It's caught in the Worker before Claude is called. So the table below counts every submission as a real lead. That's the most it can cost; any spam in the month only brings it down.</w:t>
+      </w:r>
+    </w:p>
+    <w:p>
+      <w:pPr>
+        <w:pStyle w:val="BodyText"/>
+      </w:pPr>
+      <w:r>
+        <w:t xml:space="preserve">Cost per real lead: fit check ~</w:t>
+      </w:r>
+      <m:oMath>
+        <m:r>
+          <m:t>0.0001</m:t>
+        </m:r>
+        <m:r>
+          <m:rPr>
+            <m:sty m:val="p"/>
+          </m:rPr>
+          <m:t>+</m:t>
+        </m:r>
+        <m:r>
+          <m:t>r</m:t>
+        </m:r>
+        <m:r>
+          <m:t>e</m:t>
+        </m:r>
+        <m:r>
+          <m:t>s</m:t>
+        </m:r>
+        <m:r>
+          <m:t>e</m:t>
+        </m:r>
+        <m:r>
+          <m:t>a</m:t>
+        </m:r>
+        <m:r>
+          <m:t>r</m:t>
+        </m:r>
+        <m:r>
+          <m:t>c</m:t>
+        </m:r>
+        <m:r>
+          <m:t>h</m:t>
+        </m:r>
+        <m:r>
+          <m:t> </m:t>
+        </m:r>
+      </m:oMath>
+      <w:r>
+        <w:t xml:space="preserve">0.024 (Haiku) =</w:t>
+      </w:r>
+      <w:r>
+        <w:t xml:space="preserve"> </w:t>
+      </w:r>
+      <w:r>
+        <w:rPr>
+          <w:bCs/>
+          <w:b/>
+        </w:rPr>
+        <w:t xml:space="preserve">about $0.025</w:t>
+      </w:r>
+      <w:r>
+        <w:t xml:space="preserve">. On Opus it's about $0.15.</w:t>
       </w:r>
     </w:p>
     <w:tbl>
@@ -11225,13 +11297,10 @@
         <w:jc w:val="start"/>
       </w:tblPr>
       <w:tblGrid>
-        <w:gridCol w:w="1131"/>
-        <w:gridCol w:w="1131"/>
-        <w:gridCol w:w="1131"/>
-        <w:gridCol w:w="1131"/>
-        <w:gridCol w:w="1131"/>
-        <w:gridCol w:w="1131"/>
-        <w:gridCol w:w="1131"/>
+        <w:gridCol w:w="1980"/>
+        <w:gridCol w:w="1980"/>
+        <w:gridCol w:w="1980"/>
+        <w:gridCol w:w="1980"/>
       </w:tblGrid>
       <w:tr>
         <w:trPr>
@@ -11246,18 +11315,6 @@
             </w:pPr>
             <w:r>
               <w:t xml:space="preserve">Submissions / month</w:t>
-            </w:r>
-          </w:p>
-        </w:tc>
-        <w:tc>
-          <w:tcPr/>
-          <w:p>
-            <w:pPr>
-              <w:pStyle w:val="Compact"/>
-              <w:jc w:val="left"/>
-            </w:pPr>
-            <w:r>
-              <w:t xml:space="preserve">Leads checked</w:t>
             </w:r>
           </w:p>
         </w:tc>
@@ -11273,81 +11330,45 @@
                 <w:bCs/>
                 <w:b/>
               </w:rPr>
-              <w:t xml:space="preserve">Haiku research, typical</w:t>
-            </w:r>
-          </w:p>
-        </w:tc>
-        <w:tc>
-          <w:tcPr/>
-          <w:p>
-            <w:pPr>
-              <w:pStyle w:val="Compact"/>
-              <w:jc w:val="left"/>
-            </w:pPr>
-            <w:r>
-              <w:t xml:space="preserve">Haiku, heavy</w:t>
-            </w:r>
-          </w:p>
-        </w:tc>
-        <w:tc>
-          <w:tcPr/>
-          <w:p>
-            <w:pPr>
-              <w:pStyle w:val="Compact"/>
-              <w:jc w:val="left"/>
-            </w:pPr>
-            <w:r>
-              <w:t xml:space="preserve">Opus research, typical</w:t>
-            </w:r>
-          </w:p>
-        </w:tc>
-        <w:tc>
-          <w:tcPr/>
-          <w:p>
-            <w:pPr>
-              <w:pStyle w:val="Compact"/>
-              <w:jc w:val="left"/>
-            </w:pPr>
-            <w:r>
-              <w:t xml:space="preserve">Opus, heavy</w:t>
-            </w:r>
-          </w:p>
-        </w:tc>
-        <w:tc>
-          <w:tcPr/>
-          <w:p>
-            <w:pPr>
-              <w:pStyle w:val="Compact"/>
-              <w:jc w:val="left"/>
-            </w:pPr>
-            <w:r>
-              <w:t xml:space="preserve">Suggested spend limit (Haiku)</w:t>
-            </w:r>
-          </w:p>
-        </w:tc>
-      </w:tr>
-      <w:tr>
-        <w:tc>
-          <w:tcPr/>
-          <w:p>
-            <w:pPr>
-              <w:pStyle w:val="Compact"/>
-              <w:jc w:val="left"/>
-            </w:pPr>
-            <w:r>
-              <w:t xml:space="preserve">50</w:t>
-            </w:r>
-          </w:p>
-        </w:tc>
-        <w:tc>
-          <w:tcPr/>
-          <w:p>
-            <w:pPr>
-              <w:pStyle w:val="Compact"/>
-              <w:jc w:val="left"/>
-            </w:pPr>
-            <w:r>
-              <w:t xml:space="preserve">~43</w:t>
+              <w:t xml:space="preserve">Typical, Haiku (current)</w:t>
+            </w:r>
+          </w:p>
+        </w:tc>
+        <w:tc>
+          <w:tcPr/>
+          <w:p>
+            <w:pPr>
+              <w:pStyle w:val="Compact"/>
+              <w:jc w:val="left"/>
+            </w:pPr>
+            <w:r>
+              <w:t xml:space="preserve">Busy month, Haiku (every lead needs 3 searches)</w:t>
+            </w:r>
+          </w:p>
+        </w:tc>
+        <w:tc>
+          <w:tcPr/>
+          <w:p>
+            <w:pPr>
+              <w:pStyle w:val="Compact"/>
+              <w:jc w:val="left"/>
+            </w:pPr>
+            <w:r>
+              <w:t xml:space="preserve">Typical, if switched to Opus</w:t>
+            </w:r>
+          </w:p>
+        </w:tc>
+      </w:tr>
+      <w:tr>
+        <w:tc>
+          <w:tcPr/>
+          <w:p>
+            <w:pPr>
+              <w:pStyle w:val="Compact"/>
+              <w:jc w:val="left"/>
+            </w:pPr>
+            <w:r>
+              <w:t xml:space="preserve">25</w:t>
             </w:r>
           </w:p>
         </w:tc>
@@ -11363,81 +11384,45 @@
                 <w:bCs/>
                 <w:b/>
               </w:rPr>
-              <w:t xml:space="preserve">~$1</w:t>
-            </w:r>
-          </w:p>
-        </w:tc>
-        <w:tc>
-          <w:tcPr/>
-          <w:p>
-            <w:pPr>
-              <w:pStyle w:val="Compact"/>
-              <w:jc w:val="left"/>
-            </w:pPr>
-            <w:r>
-              <w:t xml:space="preserve">$2</w:t>
-            </w:r>
-          </w:p>
-        </w:tc>
-        <w:tc>
-          <w:tcPr/>
-          <w:p>
-            <w:pPr>
-              <w:pStyle w:val="Compact"/>
-              <w:jc w:val="left"/>
-            </w:pPr>
-            <w:r>
-              <w:t xml:space="preserve">$6</w:t>
-            </w:r>
-          </w:p>
-        </w:tc>
-        <w:tc>
-          <w:tcPr/>
-          <w:p>
-            <w:pPr>
-              <w:pStyle w:val="Compact"/>
-              <w:jc w:val="left"/>
-            </w:pPr>
-            <w:r>
-              <w:t xml:space="preserve">$13</w:t>
-            </w:r>
-          </w:p>
-        </w:tc>
-        <w:tc>
-          <w:tcPr/>
-          <w:p>
-            <w:pPr>
-              <w:pStyle w:val="Compact"/>
-              <w:jc w:val="left"/>
-            </w:pPr>
-            <w:r>
-              <w:t xml:space="preserve">$5</w:t>
-            </w:r>
-          </w:p>
-        </w:tc>
-      </w:tr>
-      <w:tr>
-        <w:tc>
-          <w:tcPr/>
-          <w:p>
-            <w:pPr>
-              <w:pStyle w:val="Compact"/>
-              <w:jc w:val="left"/>
-            </w:pPr>
-            <w:r>
-              <w:t xml:space="preserve">100</w:t>
-            </w:r>
-          </w:p>
-        </w:tc>
-        <w:tc>
-          <w:tcPr/>
-          <w:p>
-            <w:pPr>
-              <w:pStyle w:val="Compact"/>
-              <w:jc w:val="left"/>
-            </w:pPr>
-            <w:r>
-              <w:t xml:space="preserve">85</w:t>
+              <w:t xml:space="preserve">~$0.60</w:t>
+            </w:r>
+          </w:p>
+        </w:tc>
+        <w:tc>
+          <w:tcPr/>
+          <w:p>
+            <w:pPr>
+              <w:pStyle w:val="Compact"/>
+              <w:jc w:val="left"/>
+            </w:pPr>
+            <w:r>
+              <w:t xml:space="preserve">$1</w:t>
+            </w:r>
+          </w:p>
+        </w:tc>
+        <w:tc>
+          <w:tcPr/>
+          <w:p>
+            <w:pPr>
+              <w:pStyle w:val="Compact"/>
+              <w:jc w:val="left"/>
+            </w:pPr>
+            <w:r>
+              <w:t xml:space="preserve">$4</w:t>
+            </w:r>
+          </w:p>
+        </w:tc>
+      </w:tr>
+      <w:tr>
+        <w:tc>
+          <w:tcPr/>
+          <w:p>
+            <w:pPr>
+              <w:pStyle w:val="Compact"/>
+              <w:jc w:val="left"/>
+            </w:pPr>
+            <w:r>
+              <w:t xml:space="preserve">50</w:t>
             </w:r>
           </w:p>
         </w:tc>
@@ -11453,81 +11438,153 @@
                 <w:bCs/>
                 <w:b/>
               </w:rPr>
-              <w:t xml:space="preserve">~$2</w:t>
-            </w:r>
-          </w:p>
-        </w:tc>
-        <w:tc>
-          <w:tcPr/>
-          <w:p>
-            <w:pPr>
-              <w:pStyle w:val="Compact"/>
-              <w:jc w:val="left"/>
-            </w:pPr>
-            <w:r>
-              <w:t xml:space="preserve">$3</w:t>
-            </w:r>
-          </w:p>
-        </w:tc>
-        <w:tc>
-          <w:tcPr/>
-          <w:p>
-            <w:pPr>
-              <w:pStyle w:val="Compact"/>
-              <w:jc w:val="left"/>
-            </w:pPr>
-            <w:r>
-              <w:t xml:space="preserve">$13</w:t>
-            </w:r>
-          </w:p>
-        </w:tc>
-        <w:tc>
-          <w:tcPr/>
-          <w:p>
-            <w:pPr>
-              <w:pStyle w:val="Compact"/>
-              <w:jc w:val="left"/>
-            </w:pPr>
-            <w:r>
-              <w:t xml:space="preserve">$26</w:t>
-            </w:r>
-          </w:p>
-        </w:tc>
-        <w:tc>
-          <w:tcPr/>
-          <w:p>
-            <w:pPr>
-              <w:pStyle w:val="Compact"/>
-              <w:jc w:val="left"/>
-            </w:pPr>
-            <w:r>
-              <w:t xml:space="preserve">$5</w:t>
-            </w:r>
-          </w:p>
-        </w:tc>
-      </w:tr>
-      <w:tr>
-        <w:tc>
-          <w:tcPr/>
-          <w:p>
-            <w:pPr>
-              <w:pStyle w:val="Compact"/>
-              <w:jc w:val="left"/>
-            </w:pPr>
-            <w:r>
-              <w:t xml:space="preserve">250</w:t>
-            </w:r>
-          </w:p>
-        </w:tc>
-        <w:tc>
-          <w:tcPr/>
-          <w:p>
-            <w:pPr>
-              <w:pStyle w:val="Compact"/>
-              <w:jc w:val="left"/>
-            </w:pPr>
-            <w:r>
-              <w:t xml:space="preserve">~213</w:t>
+              <w:t xml:space="preserve">~$1.25</w:t>
+            </w:r>
+          </w:p>
+        </w:tc>
+        <w:tc>
+          <w:tcPr/>
+          <w:p>
+            <w:pPr>
+              <w:pStyle w:val="Compact"/>
+              <w:jc w:val="left"/>
+            </w:pPr>
+            <w:r>
+              <w:t xml:space="preserve">$2</w:t>
+            </w:r>
+          </w:p>
+        </w:tc>
+        <w:tc>
+          <w:tcPr/>
+          <w:p>
+            <w:pPr>
+              <w:pStyle w:val="Compact"/>
+              <w:jc w:val="left"/>
+            </w:pPr>
+            <w:r>
+              <w:t xml:space="preserve">$8</w:t>
+            </w:r>
+          </w:p>
+        </w:tc>
+      </w:tr>
+      <w:tr>
+        <w:tc>
+          <w:tcPr/>
+          <w:p>
+            <w:pPr>
+              <w:pStyle w:val="Compact"/>
+              <w:jc w:val="left"/>
+            </w:pPr>
+            <w:r>
+              <w:t xml:space="preserve">100</w:t>
+            </w:r>
+          </w:p>
+        </w:tc>
+        <w:tc>
+          <w:tcPr/>
+          <w:p>
+            <w:pPr>
+              <w:pStyle w:val="Compact"/>
+              <w:jc w:val="left"/>
+            </w:pPr>
+            <w:r>
+              <w:rPr>
+                <w:bCs/>
+                <w:b/>
+              </w:rPr>
+              <w:t xml:space="preserve">~$2.50</w:t>
+            </w:r>
+          </w:p>
+        </w:tc>
+        <w:tc>
+          <w:tcPr/>
+          <w:p>
+            <w:pPr>
+              <w:pStyle w:val="Compact"/>
+              <w:jc w:val="left"/>
+            </w:pPr>
+            <w:r>
+              <w:t xml:space="preserve">$4</w:t>
+            </w:r>
+          </w:p>
+        </w:tc>
+        <w:tc>
+          <w:tcPr/>
+          <w:p>
+            <w:pPr>
+              <w:pStyle w:val="Compact"/>
+              <w:jc w:val="left"/>
+            </w:pPr>
+            <w:r>
+              <w:t xml:space="preserve">$15</w:t>
+            </w:r>
+          </w:p>
+        </w:tc>
+      </w:tr>
+      <w:tr>
+        <w:tc>
+          <w:tcPr/>
+          <w:p>
+            <w:pPr>
+              <w:pStyle w:val="Compact"/>
+              <w:jc w:val="left"/>
+            </w:pPr>
+            <w:r>
+              <w:t xml:space="preserve">150</w:t>
+            </w:r>
+          </w:p>
+        </w:tc>
+        <w:tc>
+          <w:tcPr/>
+          <w:p>
+            <w:pPr>
+              <w:pStyle w:val="Compact"/>
+              <w:jc w:val="left"/>
+            </w:pPr>
+            <w:r>
+              <w:rPr>
+                <w:bCs/>
+                <w:b/>
+              </w:rPr>
+              <w:t xml:space="preserve">~$3.75</w:t>
+            </w:r>
+          </w:p>
+        </w:tc>
+        <w:tc>
+          <w:tcPr/>
+          <w:p>
+            <w:pPr>
+              <w:pStyle w:val="Compact"/>
+              <w:jc w:val="left"/>
+            </w:pPr>
+            <w:r>
+              <w:t xml:space="preserve">$6</w:t>
+            </w:r>
+          </w:p>
+        </w:tc>
+        <w:tc>
+          <w:tcPr/>
+          <w:p>
+            <w:pPr>
+              <w:pStyle w:val="Compact"/>
+              <w:jc w:val="left"/>
+            </w:pPr>
+            <w:r>
+              <w:t xml:space="preserve">$23</w:t>
+            </w:r>
+          </w:p>
+        </w:tc>
+      </w:tr>
+      <w:tr>
+        <w:tc>
+          <w:tcPr/>
+          <w:p>
+            <w:pPr>
+              <w:pStyle w:val="Compact"/>
+              <w:jc w:val="left"/>
+            </w:pPr>
+            <w:r>
+              <w:t xml:space="preserve">200</w:t>
             </w:r>
           </w:p>
         </w:tc>
@@ -11555,69 +11612,87 @@
               <w:jc w:val="left"/>
             </w:pPr>
             <w:r>
-              <w:t xml:space="preserve">$9</w:t>
-            </w:r>
-          </w:p>
-        </w:tc>
-        <w:tc>
-          <w:tcPr/>
-          <w:p>
-            <w:pPr>
-              <w:pStyle w:val="Compact"/>
-              <w:jc w:val="left"/>
-            </w:pPr>
-            <w:r>
-              <w:t xml:space="preserve">$32</w:t>
-            </w:r>
-          </w:p>
-        </w:tc>
-        <w:tc>
-          <w:tcPr/>
-          <w:p>
-            <w:pPr>
-              <w:pStyle w:val="Compact"/>
-              <w:jc w:val="left"/>
-            </w:pPr>
-            <w:r>
-              <w:t xml:space="preserve">$64</w:t>
-            </w:r>
-          </w:p>
-        </w:tc>
-        <w:tc>
-          <w:tcPr/>
-          <w:p>
-            <w:pPr>
-              <w:pStyle w:val="Compact"/>
-              <w:jc w:val="left"/>
-            </w:pPr>
-            <w:r>
-              <w:t xml:space="preserve">$10</w:t>
-            </w:r>
-          </w:p>
-        </w:tc>
-      </w:tr>
-      <w:tr>
-        <w:tc>
-          <w:tcPr/>
-          <w:p>
-            <w:pPr>
-              <w:pStyle w:val="Compact"/>
-              <w:jc w:val="left"/>
-            </w:pPr>
-            <w:r>
-              <w:t xml:space="preserve">500</w:t>
-            </w:r>
-          </w:p>
-        </w:tc>
-        <w:tc>
-          <w:tcPr/>
-          <w:p>
-            <w:pPr>
-              <w:pStyle w:val="Compact"/>
-              <w:jc w:val="left"/>
-            </w:pPr>
-            <w:r>
-              <w:t xml:space="preserve">425</w:t>
+              <w:t xml:space="preserve">$8</w:t>
+            </w:r>
+          </w:p>
+        </w:tc>
+        <w:tc>
+          <w:tcPr/>
+          <w:p>
+            <w:pPr>
+              <w:pStyle w:val="Compact"/>
+              <w:jc w:val="left"/>
+            </w:pPr>
+            <w:r>
+              <w:t xml:space="preserve">$30</w:t>
+            </w:r>
+          </w:p>
+        </w:tc>
+      </w:tr>
+      <w:tr>
+        <w:tc>
+          <w:tcPr/>
+          <w:p>
+            <w:pPr>
+              <w:pStyle w:val="Compact"/>
+              <w:jc w:val="left"/>
+            </w:pPr>
+            <w:r>
+              <w:t xml:space="preserve">300</w:t>
+            </w:r>
+          </w:p>
+        </w:tc>
+        <w:tc>
+          <w:tcPr/>
+          <w:p>
+            <w:pPr>
+              <w:pStyle w:val="Compact"/>
+              <w:jc w:val="left"/>
+            </w:pPr>
+            <w:r>
+              <w:rPr>
+                <w:bCs/>
+                <w:b/>
+              </w:rPr>
+              <w:t xml:space="preserve">~$7.50</w:t>
+            </w:r>
+          </w:p>
+        </w:tc>
+        <w:tc>
+          <w:tcPr/>
+          <w:p>
+            <w:pPr>
+              <w:pStyle w:val="Compact"/>
+              <w:jc w:val="left"/>
+            </w:pPr>
+            <w:r>
+              <w:t xml:space="preserve">$12</w:t>
+            </w:r>
+          </w:p>
+        </w:tc>
+        <w:tc>
+          <w:tcPr/>
+          <w:p>
+            <w:pPr>
+              <w:pStyle w:val="Compact"/>
+              <w:jc w:val="left"/>
+            </w:pPr>
+            <w:r>
+              <w:t xml:space="preserve">$45</w:t>
+            </w:r>
+          </w:p>
+        </w:tc>
+      </w:tr>
+      <w:tr>
+        <w:tc>
+          <w:tcPr/>
+          <w:p>
+            <w:pPr>
+              <w:pStyle w:val="Compact"/>
+              <w:jc w:val="left"/>
+            </w:pPr>
+            <w:r>
+              <w:t xml:space="preserve">400</w:t>
             </w:r>
           </w:p>
         </w:tc>
@@ -11645,69 +11720,33 @@
               <w:jc w:val="left"/>
             </w:pPr>
             <w:r>
-              <w:t xml:space="preserve">$17</w:t>
-            </w:r>
-          </w:p>
-        </w:tc>
-        <w:tc>
-          <w:tcPr/>
-          <w:p>
-            <w:pPr>
-              <w:pStyle w:val="Compact"/>
-              <w:jc w:val="left"/>
-            </w:pPr>
-            <w:r>
-              <w:t xml:space="preserve">$64</w:t>
-            </w:r>
-          </w:p>
-        </w:tc>
-        <w:tc>
-          <w:tcPr/>
-          <w:p>
-            <w:pPr>
-              <w:pStyle w:val="Compact"/>
-              <w:jc w:val="left"/>
-            </w:pPr>
-            <w:r>
-              <w:t xml:space="preserve">$128</w:t>
-            </w:r>
-          </w:p>
-        </w:tc>
-        <w:tc>
-          <w:tcPr/>
-          <w:p>
-            <w:pPr>
-              <w:pStyle w:val="Compact"/>
-              <w:jc w:val="left"/>
-            </w:pPr>
-            <w:r>
-              <w:t xml:space="preserve">$20</w:t>
-            </w:r>
-          </w:p>
-        </w:tc>
-      </w:tr>
-      <w:tr>
-        <w:tc>
-          <w:tcPr/>
-          <w:p>
-            <w:pPr>
-              <w:pStyle w:val="Compact"/>
-              <w:jc w:val="left"/>
-            </w:pPr>
-            <w:r>
-              <w:t xml:space="preserve">1,000</w:t>
-            </w:r>
-          </w:p>
-        </w:tc>
-        <w:tc>
-          <w:tcPr/>
-          <w:p>
-            <w:pPr>
-              <w:pStyle w:val="Compact"/>
-              <w:jc w:val="left"/>
-            </w:pPr>
-            <w:r>
-              <w:t xml:space="preserve">850</w:t>
+              <w:t xml:space="preserve">$16</w:t>
+            </w:r>
+          </w:p>
+        </w:tc>
+        <w:tc>
+          <w:tcPr/>
+          <w:p>
+            <w:pPr>
+              <w:pStyle w:val="Compact"/>
+              <w:jc w:val="left"/>
+            </w:pPr>
+            <w:r>
+              <w:t xml:space="preserve">$60</w:t>
+            </w:r>
+          </w:p>
+        </w:tc>
+      </w:tr>
+      <w:tr>
+        <w:tc>
+          <w:tcPr/>
+          <w:p>
+            <w:pPr>
+              <w:pStyle w:val="Compact"/>
+              <w:jc w:val="left"/>
+            </w:pPr>
+            <w:r>
+              <w:t xml:space="preserve">500</w:t>
             </w:r>
           </w:p>
         </w:tc>
@@ -11723,235 +11762,31 @@
                 <w:bCs/>
                 <w:b/>
               </w:rPr>
-              <w:t xml:space="preserve">~$20</w:t>
-            </w:r>
-          </w:p>
-        </w:tc>
-        <w:tc>
-          <w:tcPr/>
-          <w:p>
-            <w:pPr>
-              <w:pStyle w:val="Compact"/>
-              <w:jc w:val="left"/>
-            </w:pPr>
-            <w:r>
-              <w:t xml:space="preserve">$34</w:t>
-            </w:r>
-          </w:p>
-        </w:tc>
-        <w:tc>
-          <w:tcPr/>
-          <w:p>
-            <w:pPr>
-              <w:pStyle w:val="Compact"/>
-              <w:jc w:val="left"/>
-            </w:pPr>
-            <w:r>
-              <w:t xml:space="preserve">$128</w:t>
-            </w:r>
-          </w:p>
-        </w:tc>
-        <w:tc>
-          <w:tcPr/>
-          <w:p>
-            <w:pPr>
-              <w:pStyle w:val="Compact"/>
-              <w:jc w:val="left"/>
-            </w:pPr>
-            <w:r>
-              <w:t xml:space="preserve">$255</w:t>
-            </w:r>
-          </w:p>
-        </w:tc>
-        <w:tc>
-          <w:tcPr/>
-          <w:p>
-            <w:pPr>
-              <w:pStyle w:val="Compact"/>
-              <w:jc w:val="left"/>
-            </w:pPr>
-            <w:r>
-              <w:t xml:space="preserve">$40</w:t>
-            </w:r>
-          </w:p>
-        </w:tc>
-      </w:tr>
-      <w:tr>
-        <w:tc>
-          <w:tcPr/>
-          <w:p>
-            <w:pPr>
-              <w:pStyle w:val="Compact"/>
-              <w:jc w:val="left"/>
-            </w:pPr>
-            <w:r>
-              <w:t xml:space="preserve">2,500</w:t>
-            </w:r>
-          </w:p>
-        </w:tc>
-        <w:tc>
-          <w:tcPr/>
-          <w:p>
-            <w:pPr>
-              <w:pStyle w:val="Compact"/>
-              <w:jc w:val="left"/>
-            </w:pPr>
-            <w:r>
-              <w:t xml:space="preserve">2,125</w:t>
-            </w:r>
-          </w:p>
-        </w:tc>
-        <w:tc>
-          <w:tcPr/>
-          <w:p>
-            <w:pPr>
-              <w:pStyle w:val="Compact"/>
-              <w:jc w:val="left"/>
-            </w:pPr>
-            <w:r>
-              <w:rPr>
-                <w:bCs/>
-                <w:b/>
-              </w:rPr>
-              <w:t xml:space="preserve">~$51</w:t>
-            </w:r>
-          </w:p>
-        </w:tc>
-        <w:tc>
-          <w:tcPr/>
-          <w:p>
-            <w:pPr>
-              <w:pStyle w:val="Compact"/>
-              <w:jc w:val="left"/>
-            </w:pPr>
-            <w:r>
-              <w:t xml:space="preserve">$85</w:t>
-            </w:r>
-          </w:p>
-        </w:tc>
-        <w:tc>
-          <w:tcPr/>
-          <w:p>
-            <w:pPr>
-              <w:pStyle w:val="Compact"/>
-              <w:jc w:val="left"/>
-            </w:pPr>
-            <w:r>
-              <w:t xml:space="preserve">$319</w:t>
-            </w:r>
-          </w:p>
-        </w:tc>
-        <w:tc>
-          <w:tcPr/>
-          <w:p>
-            <w:pPr>
-              <w:pStyle w:val="Compact"/>
-              <w:jc w:val="left"/>
-            </w:pPr>
-            <w:r>
-              <w:t xml:space="preserve">$638</w:t>
-            </w:r>
-          </w:p>
-        </w:tc>
-        <w:tc>
-          <w:tcPr/>
-          <w:p>
-            <w:pPr>
-              <w:pStyle w:val="Compact"/>
-              <w:jc w:val="left"/>
-            </w:pPr>
-            <w:r>
-              <w:t xml:space="preserve">$100</w:t>
-            </w:r>
-          </w:p>
-        </w:tc>
-      </w:tr>
-      <w:tr>
-        <w:tc>
-          <w:tcPr/>
-          <w:p>
-            <w:pPr>
-              <w:pStyle w:val="Compact"/>
-              <w:jc w:val="left"/>
-            </w:pPr>
-            <w:r>
-              <w:t xml:space="preserve">5,000</w:t>
-            </w:r>
-          </w:p>
-        </w:tc>
-        <w:tc>
-          <w:tcPr/>
-          <w:p>
-            <w:pPr>
-              <w:pStyle w:val="Compact"/>
-              <w:jc w:val="left"/>
-            </w:pPr>
-            <w:r>
-              <w:t xml:space="preserve">4,250</w:t>
-            </w:r>
-          </w:p>
-        </w:tc>
-        <w:tc>
-          <w:tcPr/>
-          <w:p>
-            <w:pPr>
-              <w:pStyle w:val="Compact"/>
-              <w:jc w:val="left"/>
-            </w:pPr>
-            <w:r>
-              <w:rPr>
-                <w:bCs/>
-                <w:b/>
-              </w:rPr>
-              <w:t xml:space="preserve">~$102</w:t>
-            </w:r>
-          </w:p>
-        </w:tc>
-        <w:tc>
-          <w:tcPr/>
-          <w:p>
-            <w:pPr>
-              <w:pStyle w:val="Compact"/>
-              <w:jc w:val="left"/>
-            </w:pPr>
-            <w:r>
-              <w:t xml:space="preserve">$170</w:t>
-            </w:r>
-          </w:p>
-        </w:tc>
-        <w:tc>
-          <w:tcPr/>
-          <w:p>
-            <w:pPr>
-              <w:pStyle w:val="Compact"/>
-              <w:jc w:val="left"/>
-            </w:pPr>
-            <w:r>
-              <w:t xml:space="preserve">$638</w:t>
-            </w:r>
-          </w:p>
-        </w:tc>
-        <w:tc>
-          <w:tcPr/>
-          <w:p>
-            <w:pPr>
-              <w:pStyle w:val="Compact"/>
-              <w:jc w:val="left"/>
-            </w:pPr>
-            <w:r>
-              <w:t xml:space="preserve">$1,275</w:t>
-            </w:r>
-          </w:p>
-        </w:tc>
-        <w:tc>
-          <w:tcPr/>
-          <w:p>
-            <w:pPr>
-              <w:pStyle w:val="Compact"/>
-              <w:jc w:val="left"/>
-            </w:pPr>
-            <w:r>
-              <w:t xml:space="preserve">$200</w:t>
+              <w:t xml:space="preserve">~$12.50</w:t>
+            </w:r>
+          </w:p>
+        </w:tc>
+        <w:tc>
+          <w:tcPr/>
+          <w:p>
+            <w:pPr>
+              <w:pStyle w:val="Compact"/>
+              <w:jc w:val="left"/>
+            </w:pPr>
+            <w:r>
+              <w:t xml:space="preserve">$20</w:t>
+            </w:r>
+          </w:p>
+        </w:tc>
+        <w:tc>
+          <w:tcPr/>
+          <w:p>
+            <w:pPr>
+              <w:pStyle w:val="Compact"/>
+              <w:jc w:val="left"/>
+            </w:pPr>
+            <w:r>
+              <w:t xml:space="preserve">$75</w:t>
             </w:r>
           </w:p>
         </w:tc>
@@ -11978,13 +11813,13 @@
           <w:bCs/>
           <w:b/>
         </w:rPr>
-        <w:t xml:space="preserve">The fit check is basically free</w:t>
-      </w:r>
-      <w:r>
-        <w:t xml:space="preserve"> </w:t>
-      </w:r>
-      <w:r>
-        <w:t xml:space="preserve">at any volume.</w:t>
+        <w:t xml:space="preserve">Expect a few dollars a month.</w:t>
+      </w:r>
+      <w:r>
+        <w:t xml:space="preserve"> </w:t>
+      </w:r>
+      <w:r>
+        <w:t xml:space="preserve">At normal volume (under 500 submissions), research on Haiku stays under about $12.50 a month, and usually much less.</w:t>
       </w:r>
     </w:p>
     <w:p>
@@ -12000,13 +11835,13 @@
           <w:bCs/>
           <w:b/>
         </w:rPr>
-        <w:t xml:space="preserve">On Haiku, budget about $0.02 per submission.</w:t>
-      </w:r>
-      <w:r>
-        <w:t xml:space="preserve"> </w:t>
-      </w:r>
-      <w:r>
-        <w:t xml:space="preserve">On Opus it's about $0.13.</w:t>
+        <w:t xml:space="preserve">The fit check is basically free.</w:t>
+      </w:r>
+      <w:r>
+        <w:t xml:space="preserve"> </w:t>
+      </w:r>
+      <w:r>
+        <w:t xml:space="preserve">500 leads is about 5 cents.</w:t>
       </w:r>
     </w:p>
     <w:p>
@@ -12022,13 +11857,13 @@
           <w:bCs/>
           <w:b/>
         </w:rPr>
-        <w:t xml:space="preserve">Suggested spend limit</w:t>
-      </w:r>
-      <w:r>
-        <w:t xml:space="preserve"> </w:t>
-      </w:r>
-      <w:r>
-        <w:t xml:space="preserve">is about 2× the typical month (a bit over the heavy column), so a spam wave or a run of hard leads doesn't stop the system mid-month. If you switch research to Opus, raise the limit to about the Opus heavy column. If the limit is hit, the API refuses calls: the fit check fails open (leads still reach a calendar), but research stops until the limit resets or is raised.</w:t>
+        <w:t xml:space="preserve">Suggested monthly spend limit: $25.</w:t>
+      </w:r>
+      <w:r>
+        <w:t xml:space="preserve"> </w:t>
+      </w:r>
+      <w:r>
+        <w:t xml:space="preserve">It covers a busy month at 500 submissions with room to spare. If you switch research to Opus, raise it to about $150. If the limit is ever hit, the API refuses calls: the fit check fails open (leads still reach a calendar), but research stops until the limit resets or is raised.</w:t>
       </w:r>
     </w:p>
     <w:p>
@@ -12040,7 +11875,17 @@
         <w:pStyle w:val="Compact"/>
       </w:pPr>
       <w:r>
-        <w:t xml:space="preserve">If spam is higher than 15%, costs go down (spam is free). If the share of not-fit leads is high, costs stay the same, because not-fits are still researched.</w:t>
+        <w:rPr>
+          <w:bCs/>
+          <w:b/>
+        </w:rPr>
+        <w:t xml:space="preserve">If volume ever grows</w:t>
+      </w:r>
+      <w:r>
+        <w:t xml:space="preserve"> </w:t>
+      </w:r>
+      <w:r>
+        <w:t xml:space="preserve">past 500: budget about $0.025 per submission on Haiku (1,000 ≈ $25, 5,000 ≈ $125).</w:t>
       </w:r>
     </w:p>
     <w:bookmarkEnd w:id="53"/>

</xml_diff>

<commit_message>
Searchable country picker with every country, styled like the form
Replaces the native select with a combobox (type to filter, arrow keys,
pinned top markets). The Worker's EMEA and APAC lists now cover every
country in the form; Latin America routes by time zone.

Co-Authored-By: Claude Opus 5.5 <noreply@anthropic.com>
Claude-Session: https://claude.ai/code/session_016MSitiN4QkJHe8WqEGz9RU
</commit_message>
<xml_diff>
--- a/lead-routing/Momos Lead Routing - Technical Documentation.docx
+++ b/lead-routing/Momos Lead Routing - Technical Documentation.docx
@@ -1949,7 +1949,7 @@
               <w:jc w:val="left"/>
             </w:pPr>
             <w:r>
-              <w:t xml:space="preserve">UK, Ireland, Europe, Turkey, UAE, Saudi, Qatar, Kuwait, etc.</w:t>
+              <w:t xml:space="preserve">All of Europe, the Middle East, Africa, the Caucasus and Central Asia (e.g. UK, Germany, UAE, Saudi, Turkey, Kenya, South Africa, Kazakhstan)</w:t>
             </w:r>
           </w:p>
         </w:tc>
@@ -2003,7 +2003,7 @@
               <w:jc w:val="left"/>
             </w:pPr>
             <w:r>
-              <w:t xml:space="preserve">Australia, NZ, Singapore, Malaysia, Thailand, Vietnam, Philippines, Indonesia, Japan, Korea, HK, India, etc.</w:t>
+              <w:t xml:space="preserve">All of Asia-Pacific and South Asia (e.g. Australia, NZ, Singapore, Japan, Korea, HK, China, India, Pakistan, Pacific islands)</w:t>
             </w:r>
           </w:p>
         </w:tc>
@@ -2044,6 +2044,71 @@
                 <w:b/>
               </w:rPr>
               <w:t xml:space="preserve">James</w:t>
+            </w:r>
+          </w:p>
+        </w:tc>
+      </w:tr>
+      <w:tr>
+        <w:tc>
+          <w:tcPr/>
+          <w:p>
+            <w:pPr>
+              <w:pStyle w:val="Compact"/>
+              <w:jc w:val="left"/>
+            </w:pPr>
+            <w:r>
+              <w:t xml:space="preserve">Latin America and the Caribbean (e.g. Brazil, Colombia, Argentina, Puerto Rico)</w:t>
+            </w:r>
+          </w:p>
+        </w:tc>
+        <w:tc>
+          <w:tcPr/>
+          <w:p>
+            <w:pPr>
+              <w:pStyle w:val="Compact"/>
+              <w:jc w:val="left"/>
+            </w:pPr>
+            <w:r>
+              <w:t xml:space="preserve">Browser time zone: Pacific/Mountain → West, any other</w:t>
+            </w:r>
+            <w:r>
+              <w:t xml:space="preserve"> </w:t>
+            </w:r>
+            <w:r>
+              <w:rPr>
+                <w:rStyle w:val="VerbatimChar"/>
+              </w:rPr>
+              <w:t xml:space="preserve">America/…</w:t>
+            </w:r>
+            <w:r>
+              <w:t xml:space="preserve"> </w:t>
+            </w:r>
+            <w:r>
+              <w:t xml:space="preserve">zone → East</w:t>
+            </w:r>
+          </w:p>
+        </w:tc>
+        <w:tc>
+          <w:tcPr/>
+          <w:p>
+            <w:pPr>
+              <w:pStyle w:val="Compact"/>
+              <w:jc w:val="left"/>
+            </w:pPr>
+            <w:r>
+              <w:t xml:space="preserve">us_west / us_east</w:t>
+            </w:r>
+          </w:p>
+        </w:tc>
+        <w:tc>
+          <w:tcPr/>
+          <w:p>
+            <w:pPr>
+              <w:pStyle w:val="Compact"/>
+              <w:jc w:val="left"/>
+            </w:pPr>
+            <w:r>
+              <w:t xml:space="preserve">James / Jill</w:t>
             </w:r>
           </w:p>
         </w:tc>
@@ -5862,7 +5927,40 @@
               <w:jc w:val="left"/>
             </w:pPr>
             <w:r>
-              <w:t xml:space="preserve">Dropdown, default US. Codes: US, CA, MX, AU, FR, DE, HK, IN, ID, IE, IT, JP, KW, MY, NL, NZ, PH, QA, SA, SG, KR, ES, TH, TR, AE, GB, VN, OTHER</w:t>
+              <w:t xml:space="preserve">Searchable list styled like the other fields (not the browser's dropdown). About 210 countries plus "Other", default US. US, Canada, UK, Australia, Singapore and UAE are pinned at the top. Type to filter (also matches "UK", "UAE", "USA", "KSA", "Korea", "Holland"); arrow keys + Enter or click to pick. Sends the 2-letter ISO code, e.g.</w:t>
+            </w:r>
+            <w:r>
+              <w:t xml:space="preserve"> </w:t>
+            </w:r>
+            <w:r>
+              <w:rPr>
+                <w:rStyle w:val="VerbatimChar"/>
+              </w:rPr>
+              <w:t xml:space="preserve">GB</w:t>
+            </w:r>
+            <w:r>
+              <w:t xml:space="preserve">. Names and flags come from the browser (</w:t>
+            </w:r>
+            <w:r>
+              <w:rPr>
+                <w:rStyle w:val="VerbatimChar"/>
+              </w:rPr>
+              <w:t xml:space="preserve">Intl.DisplayNames</w:t>
+            </w:r>
+            <w:r>
+              <w:t xml:space="preserve">), so the code only lists codes (</w:t>
+            </w:r>
+            <w:r>
+              <w:rPr>
+                <w:rStyle w:val="VerbatimChar"/>
+              </w:rPr>
+              <w:t xml:space="preserve">CODES</w:t>
+            </w:r>
+            <w:r>
+              <w:t xml:space="preserve"> </w:t>
+            </w:r>
+            <w:r>
+              <w:t xml:space="preserve">in the form).</w:t>
             </w:r>
           </w:p>
         </w:tc>
@@ -8262,7 +8360,7 @@
               <w:jc w:val="left"/>
             </w:pPr>
             <w:r>
-              <w:t xml:space="preserve">Add a country to EMEA or APAC</w:t>
+              <w:t xml:space="preserve">Add a country, or move one between regions</w:t>
             </w:r>
           </w:p>
         </w:tc>
@@ -8277,6 +8375,36 @@
               <w:rPr>
                 <w:rStyle w:val="VerbatimChar"/>
               </w:rPr>
+              <w:t xml:space="preserve">CODES</w:t>
+            </w:r>
+            <w:r>
+              <w:t xml:space="preserve"> </w:t>
+            </w:r>
+            <w:r>
+              <w:t xml:space="preserve">in</w:t>
+            </w:r>
+            <w:r>
+              <w:t xml:space="preserve"> </w:t>
+            </w:r>
+            <w:r>
+              <w:rPr>
+                <w:rStyle w:val="VerbatimChar"/>
+              </w:rPr>
+              <w:t xml:space="preserve">framer/LeadForm.tsx</w:t>
+            </w:r>
+            <w:r>
+              <w:t xml:space="preserve"> </w:t>
+            </w:r>
+            <w:r>
+              <w:t xml:space="preserve">(what visitors can pick) and</w:t>
+            </w:r>
+            <w:r>
+              <w:t xml:space="preserve"> </w:t>
+            </w:r>
+            <w:r>
+              <w:rPr>
+                <w:rStyle w:val="VerbatimChar"/>
+              </w:rPr>
               <w:t xml:space="preserve">EMEA</w:t>
             </w:r>
             <w:r>
@@ -8313,22 +8441,51 @@
               <w:t xml:space="preserve"> </w:t>
             </w:r>
             <w:r>
-              <w:t xml:space="preserve">(and add it to</w:t>
+              <w:t xml:space="preserve">(where it routes). A code in neither region list routes by time zone.</w:t>
+            </w:r>
+          </w:p>
+        </w:tc>
+      </w:tr>
+      <w:tr>
+        <w:tc>
+          <w:tcPr/>
+          <w:p>
+            <w:pPr>
+              <w:pStyle w:val="Compact"/>
+              <w:jc w:val="left"/>
+            </w:pPr>
+            <w:r>
+              <w:t xml:space="preserve">Change the countries pinned at the top</w:t>
+            </w:r>
+          </w:p>
+        </w:tc>
+        <w:tc>
+          <w:tcPr/>
+          <w:p>
+            <w:pPr>
+              <w:pStyle w:val="Compact"/>
+              <w:jc w:val="left"/>
+            </w:pPr>
+            <w:r>
+              <w:rPr>
+                <w:rStyle w:val="VerbatimChar"/>
+              </w:rPr>
+              <w:t xml:space="preserve">TOP</w:t>
             </w:r>
             <w:r>
               <w:t xml:space="preserve"> </w:t>
             </w:r>
             <w:r>
+              <w:t xml:space="preserve">in</w:t>
+            </w:r>
+            <w:r>
+              <w:t xml:space="preserve"> </w:t>
+            </w:r>
+            <w:r>
               <w:rPr>
                 <w:rStyle w:val="VerbatimChar"/>
               </w:rPr>
-              <w:t xml:space="preserve">COUNTRIES</w:t>
-            </w:r>
-            <w:r>
-              <w:t xml:space="preserve"> </w:t>
-            </w:r>
-            <w:r>
-              <w:t xml:space="preserve">in the form)</w:t>
+              <w:t xml:space="preserve">framer/LeadForm.tsx</w:t>
             </w:r>
           </w:p>
         </w:tc>

</xml_diff>

<commit_message>
Drop the done 'form code on main' open item
Co-Authored-By: Claude Opus 5.5 <noreply@anthropic.com>
Claude-Session: https://claude.ai/code/session_016MSitiN4QkJHe8WqEGz9RU
</commit_message>
<xml_diff>
--- a/lead-routing/Momos Lead Routing - Technical Documentation.docx
+++ b/lead-routing/Momos Lead Routing - Technical Documentation.docx
@@ -10045,92 +10045,6 @@
       </w:r>
       <w:r>
         <w:t xml:space="preserve">is the right inbox.</w:t>
-      </w:r>
-    </w:p>
-    <w:p>
-      <w:pPr>
-        <w:numPr>
-          <w:ilvl w:val="0"/>
-          <w:numId w:val="1017"/>
-        </w:numPr>
-        <w:pStyle w:val="Compact"/>
-      </w:pPr>
-      <w:r>
-        <w:rPr>
-          <w:bCs/>
-          <w:b/>
-        </w:rPr>
-        <w:t xml:space="preserve">Form code on</w:t>
-      </w:r>
-      <w:r>
-        <w:rPr>
-          <w:bCs/>
-          <w:b/>
-        </w:rPr>
-        <w:t xml:space="preserve"> </w:t>
-      </w:r>
-      <w:r>
-        <w:rPr>
-          <w:rStyle w:val="VerbatimChar"/>
-          <w:bCs/>
-          <w:b/>
-        </w:rPr>
-        <w:t xml:space="preserve">main</w:t>
-      </w:r>
-      <w:r>
-        <w:rPr>
-          <w:bCs/>
-          <w:b/>
-        </w:rPr>
-        <w:t xml:space="preserve">.</w:t>
-      </w:r>
-      <w:r>
-        <w:t xml:space="preserve"> </w:t>
-      </w:r>
-      <w:r>
-        <w:t xml:space="preserve">The latest</w:t>
-      </w:r>
-      <w:r>
-        <w:t xml:space="preserve"> </w:t>
-      </w:r>
-      <w:r>
-        <w:rPr>
-          <w:rStyle w:val="VerbatimChar"/>
-        </w:rPr>
-        <w:t xml:space="preserve">LeadForm.tsx</w:t>
-      </w:r>
-      <w:r>
-        <w:t xml:space="preserve"> </w:t>
-      </w:r>
-      <w:r>
-        <w:t xml:space="preserve">is on branch</w:t>
-      </w:r>
-      <w:r>
-        <w:t xml:space="preserve"> </w:t>
-      </w:r>
-      <w:r>
-        <w:rPr>
-          <w:rStyle w:val="VerbatimChar"/>
-        </w:rPr>
-        <w:t xml:space="preserve">claude/sleepy-fermat-jjhvup</w:t>
-      </w:r>
-      <w:r>
-        <w:t xml:space="preserve">. Merge it so</w:t>
-      </w:r>
-      <w:r>
-        <w:t xml:space="preserve"> </w:t>
-      </w:r>
-      <w:r>
-        <w:rPr>
-          <w:rStyle w:val="VerbatimChar"/>
-        </w:rPr>
-        <w:t xml:space="preserve">main</w:t>
-      </w:r>
-      <w:r>
-        <w:t xml:space="preserve"> </w:t>
-      </w:r>
-      <w:r>
-        <w:t xml:space="preserve">matches what's live in Framer.</w:t>
       </w:r>
     </w:p>
     <w:p>

</xml_diff>

<commit_message>
Add a plain-English troubleshooting guide for the demo form
Co-Authored-By: Claude Opus 5.5 <noreply@anthropic.com>
Claude-Session: https://claude.ai/code/session_016MSitiN4QkJHe8WqEGz9RU
</commit_message>
<xml_diff>
--- a/lead-routing/Momos Lead Routing - Technical Documentation.docx
+++ b/lead-routing/Momos Lead Routing - Technical Documentation.docx
@@ -32,6 +32,30 @@
     <w:p>
       <w:pPr>
         <w:pStyle w:val="FirstParagraph"/>
+      </w:pPr>
+      <w:r>
+        <w:t xml:space="preserve">Non-technical? Start with</w:t>
+      </w:r>
+      <w:r>
+        <w:t xml:space="preserve"> </w:t>
+      </w:r>
+      <w:r>
+        <w:rPr>
+          <w:bCs/>
+          <w:b/>
+        </w:rPr>
+        <w:t xml:space="preserve">TROUBLESHOOTING.md</w:t>
+      </w:r>
+      <w:r>
+        <w:t xml:space="preserve"> </w:t>
+      </w:r>
+      <w:r>
+        <w:t xml:space="preserve">(the plain-English "what to do if something breaks" guide).</w:t>
+      </w:r>
+    </w:p>
+    <w:p>
+      <w:pPr>
+        <w:pStyle w:val="BodyText"/>
       </w:pPr>
       <w:r>
         <w:t xml:space="preserve">Owner: Marketing (Vincent) · Shared account:</w:t>

</xml_diff>

<commit_message>
Log why each lead was routed, and add a ?tz= test switch to the form
Testing US leads from outside North America always lands on Jill, because
East/West comes from the browser time zone. The log line now shows the
form country, time zone and IP location, the Worker reply includes ae and
region, and ?tz=America/Los_Angeles on the page lets testers act as a
West Coast visitor.

Co-Authored-By: Claude Opus 5.5 <noreply@anthropic.com>
Claude-Session: https://claude.ai/code/session_016MSitiN4QkJHe8WqEGz9RU
</commit_message>
<xml_diff>
--- a/lead-routing/Momos Lead Routing - Technical Documentation.docx
+++ b/lead-routing/Momos Lead Routing - Technical Documentation.docx
@@ -7428,7 +7428,91 @@
         <w:t xml:space="preserve"> </w:t>
       </w:r>
       <w:r>
-        <w:t xml:space="preserve">(no names or emails): company, status, reason, region, ae, icp_fit, confidence, fit_reason, fit_error, total_ms, claude_ms.</w:t>
+        <w:t xml:space="preserve">(no names or emails): company, status, reason, region, form_country, timezone, ip_country, ip_region, ae, icp_fit, confidence, fit_reason, fit_error, total_ms, claude_ms.</w:t>
+      </w:r>
+    </w:p>
+    <w:p>
+      <w:pPr>
+        <w:pStyle w:val="BodyText"/>
+      </w:pPr>
+      <w:r>
+        <w:rPr>
+          <w:bCs/>
+          <w:b/>
+        </w:rPr>
+        <w:t xml:space="preserve">Reply to the form:</w:t>
+      </w:r>
+      <w:r>
+        <w:t xml:space="preserve"> </w:t>
+      </w:r>
+      <w:r>
+        <w:rPr>
+          <w:rStyle w:val="VerbatimChar"/>
+        </w:rPr>
+        <w:t xml:space="preserve">{ url, ae, region }</w:t>
+      </w:r>
+      <w:r>
+        <w:t xml:space="preserve">. The form only uses</w:t>
+      </w:r>
+      <w:r>
+        <w:t xml:space="preserve"> </w:t>
+      </w:r>
+      <w:r>
+        <w:rPr>
+          <w:rStyle w:val="VerbatimChar"/>
+        </w:rPr>
+        <w:t xml:space="preserve">url</w:t>
+      </w:r>
+      <w:r>
+        <w:t xml:space="preserve">. It prints</w:t>
+      </w:r>
+      <w:r>
+        <w:t xml:space="preserve"> </w:t>
+      </w:r>
+      <w:r>
+        <w:rPr>
+          <w:rStyle w:val="VerbatimChar"/>
+        </w:rPr>
+        <w:t xml:space="preserve">[Momos form] routed to …</w:t>
+      </w:r>
+      <w:r>
+        <w:t xml:space="preserve"> </w:t>
+      </w:r>
+      <w:r>
+        <w:t xml:space="preserve">in the browser console for testing.</w:t>
+      </w:r>
+    </w:p>
+    <w:p>
+      <w:pPr>
+        <w:pStyle w:val="BodyText"/>
+      </w:pPr>
+      <w:r>
+        <w:rPr>
+          <w:bCs/>
+          <w:b/>
+        </w:rPr>
+        <w:t xml:space="preserve">Testing from outside North America:</w:t>
+      </w:r>
+      <w:r>
+        <w:t xml:space="preserve"> </w:t>
+      </w:r>
+      <w:r>
+        <w:t xml:space="preserve">add</w:t>
+      </w:r>
+      <w:r>
+        <w:t xml:space="preserve"> </w:t>
+      </w:r>
+      <w:r>
+        <w:rPr>
+          <w:rStyle w:val="VerbatimChar"/>
+        </w:rPr>
+        <w:t xml:space="preserve">?tz=America/Los_Angeles</w:t>
+      </w:r>
+      <w:r>
+        <w:t xml:space="preserve"> </w:t>
+      </w:r>
+      <w:r>
+        <w:t xml:space="preserve">(or any time zone) to the page URL. The form sends that instead of the browser's time zone. A VPN alone doesn't change the time zone, so from Asia every US lead goes to Jill.</w:t>
       </w:r>
     </w:p>
     <w:p>

</xml_diff>

<commit_message>
Send Jill's leads to her Google Calendar
book-a-demo-us stays as the form's fallback, so landing there now means
the Worker wasn't reached.

Co-Authored-By: Claude Opus 5.5 <noreply@anthropic.com>
Claude-Session: https://claude.ai/code/session_016MSitiN4QkJHe8WqEGz9RU
</commit_message>
<xml_diff>
--- a/lead-routing/Momos Lead Routing - Technical Documentation.docx
+++ b/lead-routing/Momos Lead Routing - Technical Documentation.docx
@@ -156,7 +156,7 @@
         <w:rPr>
           <w:rStyle w:val="VerbatimChar"/>
         </w:rPr>
-        <w:t xml:space="preserve">        ├─ fit / maybe, East US / Europe / Middle East ──► Jill: momos.com/book-a-demo-us</w:t>
+        <w:t xml:space="preserve">        ├─ fit / maybe, East US / Europe / Middle East ──► Jill: Google Calendar</w:t>
       </w:r>
       <w:r>
         <w:br/>
@@ -1351,7 +1351,7 @@
         <w:rPr>
           <w:rStyle w:val="VerbatimChar"/>
         </w:rPr>
-        <w:t xml:space="preserve">https://www.momos.com/book-a-demo-us</w:t>
+        <w:t xml:space="preserve">https://calendar.app.google/RgDyFpMoE46wfyFv9</w:t>
       </w:r>
     </w:p>
     <w:p>
@@ -6217,7 +6217,7 @@
               <w:jc w:val="left"/>
             </w:pPr>
             <w:r>
-              <w:t xml:space="preserve">Used if the Worker is unreachable</w:t>
+              <w:t xml:space="preserve">Used if the Worker is unreachable. Since Jill moved to Google Calendar (Oct 2026), landing here always means the fallback was used.</w:t>
             </w:r>
           </w:p>
         </w:tc>
@@ -7022,7 +7022,7 @@
                 <w:rPr>
                   <w:rStyle w:val="Hyperlink"/>
                 </w:rPr>
-                <w:t xml:space="preserve">https://www.momos.com/book-a-demo-us</w:t>
+                <w:t xml:space="preserve">https://calendar.app.google/RgDyFpMoE46wfyFv9</w:t>
               </w:r>
             </w:hyperlink>
           </w:p>
@@ -7035,7 +7035,7 @@
               <w:jc w:val="left"/>
             </w:pPr>
             <w:r>
-              <w:t xml:space="preserve">Jill's booking page</w:t>
+              <w:t xml:space="preserve">Jill's Google Calendar</w:t>
             </w:r>
           </w:p>
         </w:tc>
@@ -8226,7 +8226,22 @@
         <w:t xml:space="preserve"> </w:t>
       </w:r>
       <w:r>
-        <w:t xml:space="preserve">Jill's page is also the fallback. A lead landing there doesn't prove the Worker answered. James's calendar and the popup only appear when it did. Check Cloudflare Logs to be sure.</w:t>
+        <w:t xml:space="preserve">both AEs now use Google Calendar links, so landing on</w:t>
+      </w:r>
+      <w:r>
+        <w:t xml:space="preserve"> </w:t>
+      </w:r>
+      <w:r>
+        <w:rPr>
+          <w:rStyle w:val="VerbatimChar"/>
+        </w:rPr>
+        <w:t xml:space="preserve">momos.com/book-a-demo-us</w:t>
+      </w:r>
+      <w:r>
+        <w:t xml:space="preserve"> </w:t>
+      </w:r>
+      <w:r>
+        <w:t xml:space="preserve">always means the form's fallback was used (the Worker wasn't reached).</w:t>
       </w:r>
     </w:p>
     <w:p>

</xml_diff>

<commit_message>
Add the previews block Cloudflare builds now require
Workers Builds failed with 'missing a previews block'. Previews get the
same links and placement as production; they hold no secrets.

Co-Authored-By: Claude Opus 5.5 <noreply@anthropic.com>
Claude-Session: https://claude.ai/code/session_016MSitiN4QkJHe8WqEGz9RU
</commit_message>
<xml_diff>
--- a/lead-routing/Momos Lead Routing - Technical Documentation.docx
+++ b/lead-routing/Momos Lead Routing - Technical Documentation.docx
@@ -7283,6 +7283,95 @@
               <w:rPr>
                 <w:rStyle w:val="VerbatimChar"/>
               </w:rPr>
+              <w:t xml:space="preserve">[previews.vars]</w:t>
+            </w:r>
+            <w:r>
+              <w:t xml:space="preserve">,</w:t>
+            </w:r>
+            <w:r>
+              <w:t xml:space="preserve"> </w:t>
+            </w:r>
+            <w:r>
+              <w:rPr>
+                <w:rStyle w:val="VerbatimChar"/>
+              </w:rPr>
+              <w:t xml:space="preserve">[previews.placement]</w:t>
+            </w:r>
+          </w:p>
+        </w:tc>
+        <w:tc>
+          <w:tcPr/>
+          <w:p>
+            <w:pPr>
+              <w:pStyle w:val="Compact"/>
+              <w:jc w:val="left"/>
+            </w:pPr>
+            <w:r>
+              <w:t xml:space="preserve">Same values as</w:t>
+            </w:r>
+            <w:r>
+              <w:t xml:space="preserve"> </w:t>
+            </w:r>
+            <w:r>
+              <w:rPr>
+                <w:rStyle w:val="VerbatimChar"/>
+              </w:rPr>
+              <w:t xml:space="preserve">[vars]</w:t>
+            </w:r>
+            <w:r>
+              <w:t xml:space="preserve"> </w:t>
+            </w:r>
+            <w:r>
+              <w:t xml:space="preserve">/</w:t>
+            </w:r>
+            <w:r>
+              <w:t xml:space="preserve"> </w:t>
+            </w:r>
+            <w:r>
+              <w:rPr>
+                <w:rStyle w:val="VerbatimChar"/>
+              </w:rPr>
+              <w:t xml:space="preserve">[placement]</w:t>
+            </w:r>
+          </w:p>
+        </w:tc>
+        <w:tc>
+          <w:tcPr/>
+          <w:p>
+            <w:pPr>
+              <w:pStyle w:val="Compact"/>
+              <w:jc w:val="left"/>
+            </w:pPr>
+            <w:r>
+              <w:t xml:space="preserve">Required by Cloudflare's builds since Oct 2026 (for Preview deployments). Keep in step with</w:t>
+            </w:r>
+            <w:r>
+              <w:t xml:space="preserve"> </w:t>
+            </w:r>
+            <w:r>
+              <w:rPr>
+                <w:rStyle w:val="VerbatimChar"/>
+              </w:rPr>
+              <w:t xml:space="preserve">[vars]</w:t>
+            </w:r>
+            <w:r>
+              <w:t xml:space="preserve">, or the build fails.</w:t>
+            </w:r>
+          </w:p>
+        </w:tc>
+      </w:tr>
+      <w:tr>
+        <w:tc>
+          <w:tcPr/>
+          <w:p>
+            <w:pPr>
+              <w:pStyle w:val="Compact"/>
+              <w:jc w:val="left"/>
+            </w:pPr>
+            <w:r>
+              <w:rPr>
+                <w:rStyle w:val="VerbatimChar"/>
+              </w:rPr>
               <w:t xml:space="preserve">[observability] enabled = true</w:t>
             </w:r>
           </w:p>
@@ -8364,6 +8453,33 @@
                 <w:rStyle w:val="VerbatimChar"/>
               </w:rPr>
               <w:t xml:space="preserve">worker/wrangler.toml</w:t>
+            </w:r>
+            <w:r>
+              <w:t xml:space="preserve">, in both</w:t>
+            </w:r>
+            <w:r>
+              <w:t xml:space="preserve"> </w:t>
+            </w:r>
+            <w:r>
+              <w:rPr>
+                <w:rStyle w:val="VerbatimChar"/>
+              </w:rPr>
+              <w:t xml:space="preserve">[vars]</w:t>
+            </w:r>
+            <w:r>
+              <w:t xml:space="preserve"> </w:t>
+            </w:r>
+            <w:r>
+              <w:t xml:space="preserve">and</w:t>
+            </w:r>
+            <w:r>
+              <w:t xml:space="preserve"> </w:t>
+            </w:r>
+            <w:r>
+              <w:rPr>
+                <w:rStyle w:val="VerbatimChar"/>
+              </w:rPr>
+              <w:t xml:space="preserve">[previews.vars]</w:t>
             </w:r>
             <w:r>
               <w:t xml:space="preserve">, then push to main</w:t>

</xml_diff>

<commit_message>
Pre-select country from time zone, rate-limit submissions per IP
Form: the country starts on the visitor's country (time zone, then browser
language) or empty and required, instead of always US. The Back button no
longer leaves the submit button stuck.

Worker: more than 5 submissions a minute from one IP get the popup without
calling Claude or Zapier (Workers rate limiting binding, works on
workers.dev).

Co-Authored-By: Claude Opus 5.5 <noreply@anthropic.com>
Claude-Session: https://claude.ai/code/session_016MSitiN4QkJHe8WqEGz9RU
</commit_message>
<xml_diff>
--- a/lead-routing/Momos Lead Routing - Technical Documentation.docx
+++ b/lead-routing/Momos Lead Routing - Technical Documentation.docx
@@ -5951,7 +5951,23 @@
               <w:jc w:val="left"/>
             </w:pPr>
             <w:r>
-              <w:t xml:space="preserve">Searchable list styled like the other fields (not the browser's dropdown). About 210 countries plus "Other", default US. US, Canada, UK, Australia, Singapore and UAE are pinned at the top. Type to filter (also matches "UK", "UAE", "USA", "KSA", "Korea", "Holland"); arrow keys + Enter or click to pick. Sends the 2-letter ISO code, e.g.</w:t>
+              <w:t xml:space="preserve">Searchable list styled like the other fields (not the browser's dropdown). About 210 countries plus "Other".</w:t>
+            </w:r>
+            <w:r>
+              <w:t xml:space="preserve"> </w:t>
+            </w:r>
+            <w:r>
+              <w:rPr>
+                <w:bCs/>
+                <w:b/>
+              </w:rPr>
+              <w:t xml:space="preserve">Pre-selected</w:t>
+            </w:r>
+            <w:r>
+              <w:t xml:space="preserve"> </w:t>
+            </w:r>
+            <w:r>
+              <w:t xml:space="preserve">from the visitor's time zone (e.g.</w:t>
             </w:r>
             <w:r>
               <w:t xml:space="preserve"> </w:t>
@@ -5960,31 +5976,80 @@
               <w:rPr>
                 <w:rStyle w:val="VerbatimChar"/>
               </w:rPr>
+              <w:t xml:space="preserve">Australia/Sydney</w:t>
+            </w:r>
+            <w:r>
+              <w:t xml:space="preserve"> </w:t>
+            </w:r>
+            <w:r>
+              <w:t xml:space="preserve">→ Australia), then their browser language (e.g.</w:t>
+            </w:r>
+            <w:r>
+              <w:t xml:space="preserve"> </w:t>
+            </w:r>
+            <w:r>
+              <w:rPr>
+                <w:rStyle w:val="VerbatimChar"/>
+              </w:rPr>
+              <w:t xml:space="preserve">en-AU</w:t>
+            </w:r>
+            <w:r>
+              <w:t xml:space="preserve">;</w:t>
+            </w:r>
+            <w:r>
+              <w:t xml:space="preserve"> </w:t>
+            </w:r>
+            <w:r>
+              <w:rPr>
+                <w:rStyle w:val="VerbatimChar"/>
+              </w:rPr>
+              <w:t xml:space="preserve">en-US</w:t>
+            </w:r>
+            <w:r>
+              <w:t xml:space="preserve"> </w:t>
+            </w:r>
+            <w:r>
+              <w:t xml:space="preserve">is ignored because many non-US visitors use it). If neither gives a match it starts empty ("Select your country") and is</w:t>
+            </w:r>
+            <w:r>
+              <w:t xml:space="preserve"> </w:t>
+            </w:r>
+            <w:r>
+              <w:rPr>
+                <w:bCs/>
+                <w:b/>
+              </w:rPr>
+              <w:t xml:space="preserve">required</w:t>
+            </w:r>
+            <w:r>
+              <w:t xml:space="preserve">. US, Canada, UK, Australia, Singapore and UAE are pinned at the top. Type to filter (also matches "UK", "UAE", "USA", "KSA", "Korea", "Holland"). Sends the 2-letter ISO code, e.g.</w:t>
+            </w:r>
+            <w:r>
+              <w:t xml:space="preserve"> </w:t>
+            </w:r>
+            <w:r>
+              <w:rPr>
+                <w:rStyle w:val="VerbatimChar"/>
+              </w:rPr>
               <w:t xml:space="preserve">GB</w:t>
             </w:r>
             <w:r>
-              <w:t xml:space="preserve">. Names and flags come from the browser (</w:t>
+              <w:t xml:space="preserve">. Time zone map:</w:t>
+            </w:r>
+            <w:r>
+              <w:t xml:space="preserve"> </w:t>
             </w:r>
             <w:r>
               <w:rPr>
                 <w:rStyle w:val="VerbatimChar"/>
               </w:rPr>
-              <w:t xml:space="preserve">Intl.DisplayNames</w:t>
-            </w:r>
-            <w:r>
-              <w:t xml:space="preserve">), so the code only lists codes (</w:t>
-            </w:r>
-            <w:r>
-              <w:rPr>
-                <w:rStyle w:val="VerbatimChar"/>
-              </w:rPr>
-              <w:t xml:space="preserve">CODES</w:t>
-            </w:r>
-            <w:r>
-              <w:t xml:space="preserve"> </w:t>
-            </w:r>
-            <w:r>
-              <w:t xml:space="preserve">in the form).</w:t>
+              <w:t xml:space="preserve">TZ_COUNTRY</w:t>
+            </w:r>
+            <w:r>
+              <w:t xml:space="preserve"> </w:t>
+            </w:r>
+            <w:r>
+              <w:t xml:space="preserve">in the form.</w:t>
             </w:r>
           </w:p>
         </w:tc>
@@ -7356,6 +7421,89 @@
             </w:r>
             <w:r>
               <w:t xml:space="preserve">, or the build fails.</w:t>
+            </w:r>
+          </w:p>
+        </w:tc>
+      </w:tr>
+      <w:tr>
+        <w:tc>
+          <w:tcPr/>
+          <w:p>
+            <w:pPr>
+              <w:pStyle w:val="Compact"/>
+              <w:jc w:val="left"/>
+            </w:pPr>
+            <w:r>
+              <w:rPr>
+                <w:rStyle w:val="VerbatimChar"/>
+              </w:rPr>
+              <w:t xml:space="preserve">[[ratelimits]] SUBMIT_LIMIT</w:t>
+            </w:r>
+          </w:p>
+        </w:tc>
+        <w:tc>
+          <w:tcPr/>
+          <w:p>
+            <w:pPr>
+              <w:pStyle w:val="Compact"/>
+              <w:jc w:val="left"/>
+            </w:pPr>
+            <w:r>
+              <w:t xml:space="preserve">5 per 60 s, per IP address</w:t>
+            </w:r>
+          </w:p>
+        </w:tc>
+        <w:tc>
+          <w:tcPr/>
+          <w:p>
+            <w:pPr>
+              <w:pStyle w:val="Compact"/>
+              <w:jc w:val="left"/>
+            </w:pPr>
+            <w:r>
+              <w:t xml:space="preserve">Spam-flood guard. The 6th submission in a minute from one IP gets the popup, with no Claude call and nothing sent to Zapier. Logged as</w:t>
+            </w:r>
+            <w:r>
+              <w:t xml:space="preserve"> </w:t>
+            </w:r>
+            <w:r>
+              <w:rPr>
+                <w:rStyle w:val="VerbatimChar"/>
+              </w:rPr>
+              <w:t xml:space="preserve">reason: "rate limited"</w:t>
+            </w:r>
+            <w:r>
+              <w:t xml:space="preserve">. Change</w:t>
+            </w:r>
+            <w:r>
+              <w:t xml:space="preserve"> </w:t>
+            </w:r>
+            <w:r>
+              <w:rPr>
+                <w:rStyle w:val="VerbatimChar"/>
+              </w:rPr>
+              <w:t xml:space="preserve">limit</w:t>
+            </w:r>
+            <w:r>
+              <w:t xml:space="preserve"> </w:t>
+            </w:r>
+            <w:r>
+              <w:t xml:space="preserve">(period must be 10 or 60), in both the top-level and</w:t>
+            </w:r>
+            <w:r>
+              <w:t xml:space="preserve"> </w:t>
+            </w:r>
+            <w:r>
+              <w:rPr>
+                <w:rStyle w:val="VerbatimChar"/>
+              </w:rPr>
+              <w:t xml:space="preserve">[[previews.ratelimits]]</w:t>
+            </w:r>
+            <w:r>
+              <w:t xml:space="preserve"> </w:t>
+            </w:r>
+            <w:r>
+              <w:t xml:space="preserve">blocks.</w:t>
             </w:r>
           </w:p>
         </w:tc>

</xml_diff>

<commit_message>
Only a confident ICP fit books a demo; 1-5 locations and uncertain leads go to AE follow-up
- New routing status follow_up: thank-you popup, still sent to Zapier with the
  region's AE so they can follow up. Research still runs for these leads.
- 1-5 locations go straight to follow_up without the Claude gate.
- The gate now routes only fit with confidence >= 0.7. Confident not_fit (>= 0.8)
  is turned away; maybe, unsure answers and gate failures become follow_up instead
  of booking blind.
- Stricter fit prompt: needs a buyer-type title as well as 6+ F&B locations.

Co-Authored-By: Claude Opus 5.5 <noreply@anthropic.com>
Claude-Session: https://claude.ai/code/session_016MSitiN4QkJHe8WqEGz9RU
</commit_message>
<xml_diff>
--- a/lead-routing/Momos Lead Routing - Technical Documentation.docx
+++ b/lead-routing/Momos Lead Routing - Technical Documentation.docx
@@ -156,7 +156,7 @@
         <w:rPr>
           <w:rStyle w:val="VerbatimChar"/>
         </w:rPr>
-        <w:t xml:space="preserve">        ├─ fit / maybe, East US / Europe / Middle East ──► Jill: Google Calendar</w:t>
+        <w:t xml:space="preserve">        ├─ confident fit, East US / Europe / Middle East ──► Jill: Google Calendar</w:t>
       </w:r>
       <w:r>
         <w:br/>
@@ -165,7 +165,7 @@
         <w:rPr>
           <w:rStyle w:val="VerbatimChar"/>
         </w:rPr>
-        <w:t xml:space="preserve">        ├─ fit / maybe, West US / APAC                 ──► James: Google Calendar</w:t>
+        <w:t xml:space="preserve">        ├─ confident fit, West US / APAC                 ──► James: Google Calendar</w:t>
       </w:r>
       <w:r>
         <w:br/>
@@ -174,7 +174,16 @@
         <w:rPr>
           <w:rStyle w:val="VerbatimChar"/>
         </w:rPr>
-        <w:t xml:space="preserve">        └─ confident not-fit or spam                   ──► Thank-you popup (stays on page)</w:t>
+        <w:t xml:space="preserve">        ├─ 1-5 locations, maybe, unsure, AI no answer    ──► Thank-you popup + AE follows up (Slack/Salesforce)</w:t>
+      </w:r>
+      <w:r>
+        <w:br/>
+      </w:r>
+      <w:r>
+        <w:rPr>
+          <w:rStyle w:val="VerbatimChar"/>
+        </w:rPr>
+        <w:t xml:space="preserve">        └─ confident not-fit or spam                     ──► Thank-you popup (no follow-up)</w:t>
       </w:r>
       <w:r>
         <w:br/>
@@ -303,7 +312,7 @@
               <w:jc w:val="left"/>
             </w:pPr>
             <w:r>
-              <w:t xml:space="preserve">The visitor still lands on a calendar. A real lead is never blocked.</w:t>
+              <w:t xml:space="preserve">If the AI can't answer, the visitor gets the thank-you popup and the lead goes to Slack/Salesforce for the AE to follow up. If the Worker can't be reached, the visitor lands on the backup booking page. No lead is lost.</w:t>
             </w:r>
           </w:p>
         </w:tc>
@@ -1305,7 +1314,7 @@
         <w:t xml:space="preserve"> </w:t>
       </w:r>
       <w:r>
-        <w:t xml:space="preserve">Fit, maybe or not_fit, with a confidence score (see section 5).</w:t>
+        <w:t xml:space="preserve">Fit, maybe or not_fit, with a confidence score (see section 5). Skipped for 1–5 locations, which always go to follow-up.</w:t>
       </w:r>
     </w:p>
     <w:p>
@@ -1455,7 +1464,7 @@
         <w:t xml:space="preserve"> </w:t>
       </w:r>
       <w:r>
-        <w:t xml:space="preserve">The Filter lets only</w:t>
+        <w:t xml:space="preserve">The Filter lets</w:t>
       </w:r>
       <w:r>
         <w:t xml:space="preserve"> </w:t>
@@ -1464,7 +1473,41 @@
         <w:rPr>
           <w:rStyle w:val="VerbatimChar"/>
         </w:rPr>
-        <w:t xml:space="preserve">routing__status = routed</w:t>
+        <w:t xml:space="preserve">routing__status</w:t>
+      </w:r>
+      <w:r>
+        <w:t xml:space="preserve"> </w:t>
+      </w:r>
+      <w:r>
+        <w:t xml:space="preserve">=</w:t>
+      </w:r>
+      <w:r>
+        <w:t xml:space="preserve"> </w:t>
+      </w:r>
+      <w:r>
+        <w:rPr>
+          <w:rStyle w:val="VerbatimChar"/>
+        </w:rPr>
+        <w:t xml:space="preserve">routed</w:t>
+      </w:r>
+      <w:r>
+        <w:t xml:space="preserve"> </w:t>
+      </w:r>
+      <w:r>
+        <w:rPr>
+          <w:bCs/>
+          <w:b/>
+        </w:rPr>
+        <w:t xml:space="preserve">or</w:t>
+      </w:r>
+      <w:r>
+        <w:t xml:space="preserve"> </w:t>
+      </w:r>
+      <w:r>
+        <w:rPr>
+          <w:rStyle w:val="VerbatimChar"/>
+        </w:rPr>
+        <w:t xml:space="preserve">follow_up</w:t>
       </w:r>
       <w:r>
         <w:t xml:space="preserve"> </w:t>
@@ -1546,16 +1589,31 @@
               <w:jc w:val="left"/>
             </w:pPr>
             <w:r>
-              <w:t xml:space="preserve">The lead is let through to their AE's calendar (</w:t>
+              <w:t xml:space="preserve">No blind booking: thank-you popup,</w:t>
+            </w:r>
+            <w:r>
+              <w:t xml:space="preserve"> </w:t>
             </w:r>
             <w:r>
               <w:rPr>
                 <w:rStyle w:val="VerbatimChar"/>
               </w:rPr>
+              <w:t xml:space="preserve">status: follow_up</w:t>
+            </w:r>
+            <w:r>
+              <w:t xml:space="preserve">,</w:t>
+            </w:r>
+            <w:r>
+              <w:t xml:space="preserve"> </w:t>
+            </w:r>
+            <w:r>
+              <w:rPr>
+                <w:rStyle w:val="VerbatimChar"/>
+              </w:rPr>
               <w:t xml:space="preserve">icp_fit: unavailable</w:t>
             </w:r>
             <w:r>
-              <w:t xml:space="preserve">).</w:t>
+              <w:t xml:space="preserve">. The region's AE follows up from Slack/Salesforce.</w:t>
             </w:r>
           </w:p>
         </w:tc>
@@ -2495,92 +2553,108 @@
               <w:jc w:val="left"/>
             </w:pPr>
             <w:r>
-              <w:t xml:space="preserve">Restaurant, cafe, bar, QSR, bakery, F&amp;B franchise, food hall or hospitality group with 6+ locations, or a franchisor / brand HQ</w:t>
-            </w:r>
-          </w:p>
-        </w:tc>
-      </w:tr>
-      <w:tr>
-        <w:tc>
-          <w:tcPr/>
-          <w:p>
-            <w:pPr>
-              <w:pStyle w:val="Compact"/>
-              <w:jc w:val="left"/>
-            </w:pPr>
+              <w:t xml:space="preserve">Confidently a restaurant, cafe, bar, QSR, bakery, F&amp;B franchise, food hall or hospitality group with 6+ locations, or a franchisor / brand HQ,</w:t>
+            </w:r>
+            <w:r>
+              <w:t xml:space="preserve"> </w:t>
+            </w:r>
             <w:r>
               <w:rPr>
                 <w:bCs/>
                 <w:b/>
               </w:rPr>
-              <w:t xml:space="preserve">maybe</w:t>
-            </w:r>
-          </w:p>
-        </w:tc>
-        <w:tc>
-          <w:tcPr/>
-          <w:p>
-            <w:pPr>
-              <w:pStyle w:val="Compact"/>
-              <w:jc w:val="left"/>
-            </w:pPr>
-            <w:r>
-              <w:t xml:space="preserve">F&amp;B with 1–5 locations, size unclear, or can't tell what the company does.</w:t>
-            </w:r>
-            <w:r>
-              <w:t xml:space="preserve"> </w:t>
-            </w:r>
+              <w:t xml:space="preserve">and</w:t>
+            </w:r>
+            <w:r>
+              <w:t xml:space="preserve"> </w:t>
+            </w:r>
+            <w:r>
+              <w:t xml:space="preserve">a buyer-type job title (owner, founder, executive, marketing, ops, CX, digital, IT, franchise)</w:t>
+            </w:r>
+          </w:p>
+        </w:tc>
+      </w:tr>
+      <w:tr>
+        <w:tc>
+          <w:tcPr/>
+          <w:p>
+            <w:pPr>
+              <w:pStyle w:val="Compact"/>
+              <w:jc w:val="left"/>
+            </w:pPr>
             <w:r>
               <w:rPr>
                 <w:bCs/>
                 <w:b/>
               </w:rPr>
-              <w:t xml:space="preserve">Restaurant-focused marketing agencies</w:t>
-            </w:r>
-            <w:r>
-              <w:t xml:space="preserve"> </w:t>
-            </w:r>
-            <w:r>
-              <w:t xml:space="preserve">are also maybe, because they often run Momos for several brands.</w:t>
-            </w:r>
-          </w:p>
-        </w:tc>
-      </w:tr>
-      <w:tr>
-        <w:tc>
-          <w:tcPr/>
-          <w:p>
-            <w:pPr>
-              <w:pStyle w:val="Compact"/>
-              <w:jc w:val="left"/>
-            </w:pPr>
+              <w:t xml:space="preserve">maybe</w:t>
+            </w:r>
+          </w:p>
+        </w:tc>
+        <w:tc>
+          <w:tcPr/>
+          <w:p>
+            <w:pPr>
+              <w:pStyle w:val="Compact"/>
+              <w:jc w:val="left"/>
+            </w:pPr>
+            <w:r>
+              <w:t xml:space="preserve">F&amp;B but size unclear, a non-buyer title, or can't tell what the company does.</w:t>
+            </w:r>
+            <w:r>
+              <w:t xml:space="preserve"> </w:t>
+            </w:r>
             <w:r>
               <w:rPr>
                 <w:bCs/>
                 <w:b/>
               </w:rPr>
-              <w:t xml:space="preserve">not_fit</w:t>
-            </w:r>
-          </w:p>
-        </w:tc>
-        <w:tc>
-          <w:tcPr/>
-          <w:p>
-            <w:pPr>
-              <w:pStyle w:val="Compact"/>
-              <w:jc w:val="left"/>
-            </w:pPr>
-            <w:r>
-              <w:t xml:space="preserve">Clearly not F&amp;B (general agencies, consultancies, software vendors, investors, recruiters, schools), job seekers, students, journalists, people selling to Momos. Also</w:t>
-            </w:r>
-            <w:r>
-              <w:t xml:space="preserve"> </w:t>
-            </w:r>
+              <w:t xml:space="preserve">Restaurant-focused marketing agencies</w:t>
+            </w:r>
+            <w:r>
+              <w:t xml:space="preserve"> </w:t>
+            </w:r>
+            <w:r>
+              <w:t xml:space="preserve">are also maybe, because they often run Momos for several brands.</w:t>
+            </w:r>
+          </w:p>
+        </w:tc>
+      </w:tr>
+      <w:tr>
+        <w:tc>
+          <w:tcPr/>
+          <w:p>
+            <w:pPr>
+              <w:pStyle w:val="Compact"/>
+              <w:jc w:val="left"/>
+            </w:pPr>
             <w:r>
               <w:rPr>
                 <w:bCs/>
                 <w:b/>
               </w:rPr>
+              <w:t xml:space="preserve">not_fit</w:t>
+            </w:r>
+          </w:p>
+        </w:tc>
+        <w:tc>
+          <w:tcPr/>
+          <w:p>
+            <w:pPr>
+              <w:pStyle w:val="Compact"/>
+              <w:jc w:val="left"/>
+            </w:pPr>
+            <w:r>
+              <w:t xml:space="preserve">Clearly not F&amp;B (general agencies, consultancies, software vendors, investors, recruiters, schools), job seekers, students, journalists, people selling to Momos. Also</w:t>
+            </w:r>
+            <w:r>
+              <w:t xml:space="preserve"> </w:t>
+            </w:r>
+            <w:r>
+              <w:rPr>
+                <w:bCs/>
+                <w:b/>
+              </w:rPr>
               <w:t xml:space="preserve">companies that sell to restaurants</w:t>
             </w:r>
             <w:r>
@@ -2599,61 +2673,354 @@
           <w:bCs/>
           <w:b/>
         </w:rPr>
-        <w:t xml:space="preserve">Only a confident not_fit turns someone away:</w:t>
-      </w:r>
-      <w:r>
-        <w:t xml:space="preserve"> </w:t>
-      </w:r>
-      <w:r>
-        <w:rPr>
-          <w:rStyle w:val="VerbatimChar"/>
-        </w:rPr>
-        <w:t xml:space="preserve">NOT_FIT_MIN_CONFIDENCE = 0.8</w:t>
-      </w:r>
-      <w:r>
-        <w:t xml:space="preserve">. Fit, maybe and unsure not_fit all go to a calendar. Small brands (1–5 locations) are let through by default. To always turn them away, add</w:t>
-      </w:r>
-      <w:r>
-        <w:t xml:space="preserve"> </w:t>
-      </w:r>
-      <w:r>
-        <w:rPr>
-          <w:rStyle w:val="VerbatimChar"/>
-        </w:rPr>
-        <w:t xml:space="preserve">"1-5"</w:t>
-      </w:r>
-      <w:r>
-        <w:t xml:space="preserve"> </w:t>
-      </w:r>
-      <w:r>
-        <w:t xml:space="preserve">to</w:t>
-      </w:r>
-      <w:r>
-        <w:t xml:space="preserve"> </w:t>
-      </w:r>
-      <w:r>
-        <w:rPr>
-          <w:rStyle w:val="VerbatimChar"/>
-        </w:rPr>
-        <w:t xml:space="preserve">NOT_FIT_BUCKETS</w:t>
-      </w:r>
-      <w:r>
-        <w:t xml:space="preserve"> </w:t>
-      </w:r>
-      <w:r>
-        <w:t xml:space="preserve">in</w:t>
-      </w:r>
-      <w:r>
-        <w:t xml:space="preserve"> </w:t>
-      </w:r>
-      <w:r>
-        <w:rPr>
-          <w:rStyle w:val="VerbatimChar"/>
-        </w:rPr>
-        <w:t xml:space="preserve">worker/src/route.ts</w:t>
-      </w:r>
-      <w:r>
-        <w:t xml:space="preserve">.</w:t>
+        <w:t xml:space="preserve">Only a confident fit books a demo</w:t>
+      </w:r>
+      <w:r>
+        <w:t xml:space="preserve"> </w:t>
+      </w:r>
+      <w:r>
+        <w:t xml:space="preserve">(since Oct 2026). What happens to each answer:</w:t>
+      </w:r>
+    </w:p>
+    <w:tbl>
+      <w:tblPr>
+        <w:tblStyle w:val="Table"/>
+        <w:tblW w:type="auto" w:w="0"/>
+        <w:tblLook w:firstRow="1" w:lastRow="0" w:firstColumn="0" w:lastColumn="0" w:noHBand="0" w:noVBand="0" w:val="0020"/>
+        <w:jc w:val="start"/>
+      </w:tblPr>
+      <w:tblGrid>
+        <w:gridCol w:w="1980"/>
+        <w:gridCol w:w="1980"/>
+        <w:gridCol w:w="1980"/>
+        <w:gridCol w:w="1980"/>
+      </w:tblGrid>
+      <w:tr>
+        <w:trPr>
+          <w:tblHeader w:val="true"/>
+        </w:trPr>
+        <w:tc>
+          <w:tcPr/>
+          <w:p>
+            <w:pPr>
+              <w:pStyle w:val="Compact"/>
+              <w:jc w:val="left"/>
+            </w:pPr>
+            <w:r>
+              <w:t xml:space="preserve">Claude's answer</w:t>
+            </w:r>
+          </w:p>
+        </w:tc>
+        <w:tc>
+          <w:tcPr/>
+          <w:p>
+            <w:pPr>
+              <w:pStyle w:val="Compact"/>
+              <w:jc w:val="left"/>
+            </w:pPr>
+            <w:r>
+              <w:t xml:space="preserve">Visitor sees</w:t>
+            </w:r>
+          </w:p>
+        </w:tc>
+        <w:tc>
+          <w:tcPr/>
+          <w:p>
+            <w:pPr>
+              <w:pStyle w:val="Compact"/>
+              <w:jc w:val="left"/>
+            </w:pPr>
+            <w:r>
+              <w:rPr>
+                <w:rStyle w:val="VerbatimChar"/>
+              </w:rPr>
+              <w:t xml:space="preserve">routing.status</w:t>
+            </w:r>
+          </w:p>
+        </w:tc>
+        <w:tc>
+          <w:tcPr/>
+          <w:p>
+            <w:pPr>
+              <w:pStyle w:val="Compact"/>
+              <w:jc w:val="left"/>
+            </w:pPr>
+            <w:r>
+              <w:t xml:space="preserve">Follow-up</w:t>
+            </w:r>
+          </w:p>
+        </w:tc>
+      </w:tr>
+      <w:tr>
+        <w:tc>
+          <w:tcPr/>
+          <w:p>
+            <w:pPr>
+              <w:pStyle w:val="Compact"/>
+              <w:jc w:val="left"/>
+            </w:pPr>
+            <w:r>
+              <w:t xml:space="preserve">fit, confidence ≥ 0.7 (</w:t>
+            </w:r>
+            <w:r>
+              <w:rPr>
+                <w:rStyle w:val="VerbatimChar"/>
+              </w:rPr>
+              <w:t xml:space="preserve">FIT_MIN_CONFIDENCE</w:t>
+            </w:r>
+            <w:r>
+              <w:t xml:space="preserve">)</w:t>
+            </w:r>
+          </w:p>
+        </w:tc>
+        <w:tc>
+          <w:tcPr/>
+          <w:p>
+            <w:pPr>
+              <w:pStyle w:val="Compact"/>
+              <w:jc w:val="left"/>
+            </w:pPr>
+            <w:r>
+              <w:t xml:space="preserve">Their AE's calendar</w:t>
+            </w:r>
+          </w:p>
+        </w:tc>
+        <w:tc>
+          <w:tcPr/>
+          <w:p>
+            <w:pPr>
+              <w:pStyle w:val="Compact"/>
+              <w:jc w:val="left"/>
+            </w:pPr>
+            <w:r>
+              <w:rPr>
+                <w:rStyle w:val="VerbatimChar"/>
+              </w:rPr>
+              <w:t xml:space="preserve">routed</w:t>
+            </w:r>
+          </w:p>
+        </w:tc>
+        <w:tc>
+          <w:tcPr/>
+          <w:p>
+            <w:pPr>
+              <w:pStyle w:val="Compact"/>
+              <w:jc w:val="left"/>
+            </w:pPr>
+            <w:r>
+              <w:t xml:space="preserve">—</w:t>
+            </w:r>
+          </w:p>
+        </w:tc>
+      </w:tr>
+      <w:tr>
+        <w:tc>
+          <w:tcPr/>
+          <w:p>
+            <w:pPr>
+              <w:pStyle w:val="Compact"/>
+              <w:jc w:val="left"/>
+            </w:pPr>
+            <w:r>
+              <w:t xml:space="preserve">not_fit, confidence ≥ 0.8 (</w:t>
+            </w:r>
+            <w:r>
+              <w:rPr>
+                <w:rStyle w:val="VerbatimChar"/>
+              </w:rPr>
+              <w:t xml:space="preserve">NOT_FIT_MIN_CONFIDENCE</w:t>
+            </w:r>
+            <w:r>
+              <w:t xml:space="preserve">)</w:t>
+            </w:r>
+          </w:p>
+        </w:tc>
+        <w:tc>
+          <w:tcPr/>
+          <w:p>
+            <w:pPr>
+              <w:pStyle w:val="Compact"/>
+              <w:jc w:val="left"/>
+            </w:pPr>
+            <w:r>
+              <w:t xml:space="preserve">Thank-you popup</w:t>
+            </w:r>
+          </w:p>
+        </w:tc>
+        <w:tc>
+          <w:tcPr/>
+          <w:p>
+            <w:pPr>
+              <w:pStyle w:val="Compact"/>
+              <w:jc w:val="left"/>
+            </w:pPr>
+            <w:r>
+              <w:rPr>
+                <w:rStyle w:val="VerbatimChar"/>
+              </w:rPr>
+              <w:t xml:space="preserve">not_fit</w:t>
+            </w:r>
+          </w:p>
+        </w:tc>
+        <w:tc>
+          <w:tcPr/>
+          <w:p>
+            <w:pPr>
+              <w:pStyle w:val="Compact"/>
+              <w:jc w:val="left"/>
+            </w:pPr>
+            <w:r>
+              <w:t xml:space="preserve">None</w:t>
+            </w:r>
+          </w:p>
+        </w:tc>
+      </w:tr>
+      <w:tr>
+        <w:tc>
+          <w:tcPr/>
+          <w:p>
+            <w:pPr>
+              <w:pStyle w:val="Compact"/>
+              <w:jc w:val="left"/>
+            </w:pPr>
+            <w:r>
+              <w:t xml:space="preserve">maybe, low-confidence fit or not_fit, or no answer within 3 s</w:t>
+            </w:r>
+          </w:p>
+        </w:tc>
+        <w:tc>
+          <w:tcPr/>
+          <w:p>
+            <w:pPr>
+              <w:pStyle w:val="Compact"/>
+              <w:jc w:val="left"/>
+            </w:pPr>
+            <w:r>
+              <w:t xml:space="preserve">Thank-you popup</w:t>
+            </w:r>
+          </w:p>
+        </w:tc>
+        <w:tc>
+          <w:tcPr/>
+          <w:p>
+            <w:pPr>
+              <w:pStyle w:val="Compact"/>
+              <w:jc w:val="left"/>
+            </w:pPr>
+            <w:r>
+              <w:rPr>
+                <w:rStyle w:val="VerbatimChar"/>
+              </w:rPr>
+              <w:t xml:space="preserve">follow_up</w:t>
+            </w:r>
+          </w:p>
+        </w:tc>
+        <w:tc>
+          <w:tcPr/>
+          <w:p>
+            <w:pPr>
+              <w:pStyle w:val="Compact"/>
+              <w:jc w:val="left"/>
+            </w:pPr>
+            <w:r>
+              <w:t xml:space="preserve">The region's AE (</w:t>
+            </w:r>
+            <w:r>
+              <w:rPr>
+                <w:rStyle w:val="VerbatimChar"/>
+              </w:rPr>
+              <w:t xml:space="preserve">routing.ae</w:t>
+            </w:r>
+            <w:r>
+              <w:t xml:space="preserve">)</w:t>
+            </w:r>
+          </w:p>
+        </w:tc>
+      </w:tr>
+      <w:tr>
+        <w:tc>
+          <w:tcPr/>
+          <w:p>
+            <w:pPr>
+              <w:pStyle w:val="Compact"/>
+              <w:jc w:val="left"/>
+            </w:pPr>
+            <w:r>
+              <w:t xml:space="preserve">1–5 locations (</w:t>
+            </w:r>
+            <w:r>
+              <w:rPr>
+                <w:rStyle w:val="VerbatimChar"/>
+              </w:rPr>
+              <w:t xml:space="preserve">FOLLOW_UP_BUCKETS</w:t>
+            </w:r>
+            <w:r>
+              <w:t xml:space="preserve"> </w:t>
+            </w:r>
+            <w:r>
+              <w:t xml:space="preserve">in</w:t>
+            </w:r>
+            <w:r>
+              <w:t xml:space="preserve"> </w:t>
+            </w:r>
+            <w:r>
+              <w:rPr>
+                <w:rStyle w:val="VerbatimChar"/>
+              </w:rPr>
+              <w:t xml:space="preserve">worker/src/route.ts</w:t>
+            </w:r>
+            <w:r>
+              <w:t xml:space="preserve">, Claude not asked)</w:t>
+            </w:r>
+          </w:p>
+        </w:tc>
+        <w:tc>
+          <w:tcPr/>
+          <w:p>
+            <w:pPr>
+              <w:pStyle w:val="Compact"/>
+              <w:jc w:val="left"/>
+            </w:pPr>
+            <w:r>
+              <w:t xml:space="preserve">Thank-you popup</w:t>
+            </w:r>
+          </w:p>
+        </w:tc>
+        <w:tc>
+          <w:tcPr/>
+          <w:p>
+            <w:pPr>
+              <w:pStyle w:val="Compact"/>
+              <w:jc w:val="left"/>
+            </w:pPr>
+            <w:r>
+              <w:rPr>
+                <w:rStyle w:val="VerbatimChar"/>
+              </w:rPr>
+              <w:t xml:space="preserve">follow_up</w:t>
+            </w:r>
+          </w:p>
+        </w:tc>
+        <w:tc>
+          <w:tcPr/>
+          <w:p>
+            <w:pPr>
+              <w:pStyle w:val="Compact"/>
+              <w:jc w:val="left"/>
+            </w:pPr>
+            <w:r>
+              <w:t xml:space="preserve">The region's AE</w:t>
+            </w:r>
+          </w:p>
+        </w:tc>
+      </w:tr>
+    </w:tbl>
+    <w:p>
+      <w:pPr>
+        <w:pStyle w:val="BodyText"/>
+      </w:pPr>
+      <w:r>
+        <w:t xml:space="preserve">Follow-up leads still get the background research, so the Slack message has the context the AE needs.</w:t>
       </w:r>
     </w:p>
     <w:p>
@@ -3863,7 +4230,7 @@
         <w:rPr>
           <w:rStyle w:val="StringTok"/>
         </w:rPr>
-        <w:t xml:space="preserve">"routed | not_fit | spam"</w:t>
+        <w:t xml:space="preserve">"routed | follow_up | not_fit | spam"</w:t>
       </w:r>
       <w:r>
         <w:rPr>
@@ -5339,6 +5706,77 @@
           <w:rStyle w:val="VerbatimChar"/>
         </w:rPr>
         <w:t xml:space="preserve">routed</w:t>
+      </w:r>
+      <w:r>
+        <w:t xml:space="preserve">,</w:t>
+      </w:r>
+      <w:r>
+        <w:t xml:space="preserve"> </w:t>
+      </w:r>
+      <w:r>
+        <w:rPr>
+          <w:bCs/>
+          <w:b/>
+        </w:rPr>
+        <w:t xml:space="preserve">OR</w:t>
+      </w:r>
+      <w:r>
+        <w:t xml:space="preserve"> </w:t>
+      </w:r>
+      <w:r>
+        <w:rPr>
+          <w:rStyle w:val="VerbatimChar"/>
+        </w:rPr>
+        <w:t xml:space="preserve">routing__status</w:t>
+      </w:r>
+      <w:r>
+        <w:t xml:space="preserve"> </w:t>
+      </w:r>
+      <w:r>
+        <w:t xml:space="preserve">exactly matches</w:t>
+      </w:r>
+      <w:r>
+        <w:t xml:space="preserve"> </w:t>
+      </w:r>
+      <w:r>
+        <w:rPr>
+          <w:rStyle w:val="VerbatimChar"/>
+        </w:rPr>
+        <w:t xml:space="preserve">follow_up</w:t>
+      </w:r>
+      <w:r>
+        <w:t xml:space="preserve"> </w:t>
+      </w:r>
+      <w:r>
+        <w:t xml:space="preserve">(two conditions joined with</w:t>
+      </w:r>
+      <w:r>
+        <w:t xml:space="preserve"> </w:t>
+      </w:r>
+      <w:r>
+        <w:rPr>
+          <w:bCs/>
+          <w:b/>
+        </w:rPr>
+        <w:t xml:space="preserve">+ OR</w:t>
+      </w:r>
+      <w:r>
+        <w:t xml:space="preserve">). Add</w:t>
+      </w:r>
+      <w:r>
+        <w:t xml:space="preserve"> </w:t>
+      </w:r>
+      <w:r>
+        <w:rPr>
+          <w:rStyle w:val="VerbatimChar"/>
+        </w:rPr>
+        <w:t xml:space="preserve">{{routing__status}}</w:t>
+      </w:r>
+      <w:r>
+        <w:t xml:space="preserve"> </w:t>
+      </w:r>
+      <w:r>
+        <w:t xml:space="preserve">to the Slack message so AEs can tell "booked" from "follow up".</w:t>
       </w:r>
     </w:p>
     <w:p>
@@ -8091,7 +8529,7 @@
         <w:pStyle w:val="FirstParagraph"/>
       </w:pPr>
       <w:r>
-        <w:t xml:space="preserve">It covers East/EMEA → Jill, West/APAC → James, small/unclear → still a calendar, vendors/students/recruiters/banks/prompt injection → not fit, and spam. Expect about 24/24.</w:t>
+        <w:t xml:space="preserve">It covers East/EMEA → Jill, West/APAC → James, small (1–5) or unclear → thank-you (follow-up), vendors/students/recruiters/banks/prompt injection → not fit, and spam. Expect about 24/24.</w:t>
       </w:r>
     </w:p>
     <w:p>
@@ -8945,13 +9383,28 @@
               <w:rPr>
                 <w:rStyle w:val="VerbatimChar"/>
               </w:rPr>
+              <w:t xml:space="preserve">FIT_MIN_CONFIDENCE</w:t>
+            </w:r>
+            <w:r>
+              <w:t xml:space="preserve"> </w:t>
+            </w:r>
+            <w:r>
+              <w:t xml:space="preserve">(higher = fewer instant bookings) and</w:t>
+            </w:r>
+            <w:r>
+              <w:t xml:space="preserve"> </w:t>
+            </w:r>
+            <w:r>
+              <w:rPr>
+                <w:rStyle w:val="VerbatimChar"/>
+              </w:rPr>
               <w:t xml:space="preserve">NOT_FIT_MIN_CONFIDENCE</w:t>
             </w:r>
             <w:r>
               <w:t xml:space="preserve"> </w:t>
             </w:r>
             <w:r>
-              <w:t xml:space="preserve">in</w:t>
+              <w:t xml:space="preserve">(higher = fewer turned away) in</w:t>
             </w:r>
             <w:r>
               <w:t xml:space="preserve"> </w:t>
@@ -8962,12 +9415,6 @@
               </w:rPr>
               <w:t xml:space="preserve">worker/src/fit.ts</w:t>
             </w:r>
-            <w:r>
-              <w:t xml:space="preserve"> </w:t>
-            </w:r>
-            <w:r>
-              <w:t xml:space="preserve">(higher = turn fewer away)</w:t>
-            </w:r>
           </w:p>
         </w:tc>
       </w:tr>
@@ -9051,19 +9498,19 @@
               <w:jc w:val="left"/>
             </w:pPr>
             <w:r>
-              <w:t xml:space="preserve">Always turn away 1–5 locations</w:t>
-            </w:r>
-          </w:p>
-        </w:tc>
-        <w:tc>
-          <w:tcPr/>
-          <w:p>
-            <w:pPr>
-              <w:pStyle w:val="Compact"/>
-              <w:jc w:val="left"/>
-            </w:pPr>
-            <w:r>
-              <w:t xml:space="preserve">Add</w:t>
+              <w:t xml:space="preserve">Let 1–5 locations book directly again</w:t>
+            </w:r>
+          </w:p>
+        </w:tc>
+        <w:tc>
+          <w:tcPr/>
+          <w:p>
+            <w:pPr>
+              <w:pStyle w:val="Compact"/>
+              <w:jc w:val="left"/>
+            </w:pPr>
+            <w:r>
+              <w:t xml:space="preserve">Remove</w:t>
             </w:r>
             <w:r>
               <w:t xml:space="preserve"> </w:t>
@@ -9078,7 +9525,7 @@
               <w:t xml:space="preserve"> </w:t>
             </w:r>
             <w:r>
-              <w:t xml:space="preserve">to</w:t>
+              <w:t xml:space="preserve">from</w:t>
             </w:r>
             <w:r>
               <w:t xml:space="preserve"> </w:t>
@@ -9087,7 +9534,7 @@
               <w:rPr>
                 <w:rStyle w:val="VerbatimChar"/>
               </w:rPr>
-              <w:t xml:space="preserve">NOT_FIT_BUCKETS</w:t>
+              <w:t xml:space="preserve">FOLLOW_UP_BUCKETS</w:t>
             </w:r>
             <w:r>
               <w:t xml:space="preserve"> </w:t>
@@ -9883,7 +10330,31 @@
               <w:jc w:val="left"/>
             </w:pPr>
             <w:r>
-              <w:t xml:space="preserve">The gate was over-confident</w:t>
+              <w:t xml:space="preserve">Expected for follow-ups (1–5 locations, maybe, AI timeout); they're in Slack/Salesforce as</w:t>
+            </w:r>
+            <w:r>
+              <w:t xml:space="preserve"> </w:t>
+            </w:r>
+            <w:r>
+              <w:rPr>
+                <w:rStyle w:val="VerbatimChar"/>
+              </w:rPr>
+              <w:t xml:space="preserve">follow_up</w:t>
+            </w:r>
+            <w:r>
+              <w:t xml:space="preserve">. If it was</w:t>
+            </w:r>
+            <w:r>
+              <w:t xml:space="preserve"> </w:t>
+            </w:r>
+            <w:r>
+              <w:rPr>
+                <w:rStyle w:val="VerbatimChar"/>
+              </w:rPr>
+              <w:t xml:space="preserve">not_fit</w:t>
+            </w:r>
+            <w:r>
+              <w:t xml:space="preserve">, the gate was over-confident</w:t>
             </w:r>
           </w:p>
         </w:tc>
@@ -9907,7 +10378,7 @@
               <w:t xml:space="preserve">NOT_FIT_MIN_CONFIDENCE</w:t>
             </w:r>
             <w:r>
-              <w:t xml:space="preserve">. The popup gives them the sales email in the meantime.</w:t>
+              <w:t xml:space="preserve">.</w:t>
             </w:r>
           </w:p>
         </w:tc>
@@ -10195,19 +10666,45 @@
               <w:jc w:val="left"/>
             </w:pPr>
             <w:r>
-              <w:t xml:space="preserve">Only confident not-fits are turned away (≥ 0.8)</w:t>
-            </w:r>
-          </w:p>
-        </w:tc>
-        <w:tc>
-          <w:tcPr/>
-          <w:p>
-            <w:pPr>
-              <w:pStyle w:val="Compact"/>
-              <w:jc w:val="left"/>
-            </w:pPr>
-            <w:r>
-              <w:t xml:space="preserve">A missed real lead costs more than a vendor booking a call.</w:t>
+              <w:t xml:space="preserve">Only confident fits book a demo (≥ 0.7); everything uncertain is followed up by the AE (Oct 2026)</w:t>
+            </w:r>
+          </w:p>
+        </w:tc>
+        <w:tc>
+          <w:tcPr/>
+          <w:p>
+            <w:pPr>
+              <w:pStyle w:val="Compact"/>
+              <w:jc w:val="left"/>
+            </w:pPr>
+            <w:r>
+              <w:t xml:space="preserve">AE time is spent only on clear ICP. Uncertain leads aren't lost, they're followed up. Replaced the earlier "only turn away confident not-fits" rule.</w:t>
+            </w:r>
+          </w:p>
+        </w:tc>
+      </w:tr>
+      <w:tr>
+        <w:tc>
+          <w:tcPr/>
+          <w:p>
+            <w:pPr>
+              <w:pStyle w:val="Compact"/>
+              <w:jc w:val="left"/>
+            </w:pPr>
+            <w:r>
+              <w:t xml:space="preserve">1–5 locations always go to follow-up</w:t>
+            </w:r>
+          </w:p>
+        </w:tc>
+        <w:tc>
+          <w:tcPr/>
+          <w:p>
+            <w:pPr>
+              <w:pStyle w:val="Compact"/>
+              <w:jc w:val="left"/>
+            </w:pPr>
+            <w:r>
+              <w:t xml:space="preserve">Small brands are rarely ICP; the AE decides after seeing the research.</w:t>
             </w:r>
           </w:p>
         </w:tc>

</xml_diff>

<commit_message>
Decide in order spam, ICP, region; unknown region means follow-up
Spam checks run before the region is worked out, and a confident ICP fit
only books a calendar when its region is known. Otherwise it goes to
follow-up with Jill.

Co-Authored-By: Claude Opus 5.5 <noreply@anthropic.com>
Claude-Session: https://claude.ai/code/session_016MSitiN4QkJHe8WqEGz9RU
</commit_message>
<xml_diff>
--- a/lead-routing/Momos Lead Routing - Technical Documentation.docx
+++ b/lead-routing/Momos Lead Routing - Technical Documentation.docx
@@ -1190,6 +1190,25 @@
       <w:r>
         <w:t xml:space="preserve">, which skips the browser's extra CORS round trip. The button shows "Matching you with the right person...".</w:t>
       </w:r>
+      <w:r>
+        <w:t xml:space="preserve"> </w:t>
+      </w:r>
+      <w:r>
+        <w:t xml:space="preserve">The Worker decides in a fixed priority order:</w:t>
+      </w:r>
+      <w:r>
+        <w:t xml:space="preserve"> </w:t>
+      </w:r>
+      <w:r>
+        <w:rPr>
+          <w:bCs/>
+          <w:b/>
+        </w:rPr>
+        <w:t xml:space="preserve">spam → ICP → region</w:t>
+      </w:r>
+      <w:r>
+        <w:t xml:space="preserve">. A lead only books a calendar if it passes all three.</w:t>
+      </w:r>
     </w:p>
     <w:p>
       <w:pPr>
@@ -1209,7 +1228,7 @@
         <w:t xml:space="preserve"> </w:t>
       </w:r>
       <w:r>
-        <w:t xml:space="preserve">Any of these marks the lead as spam, and Claude never sees it:</w:t>
+        <w:t xml:space="preserve">First, more than 5 submissions a minute from one IP get the popup straight away. Then any of these marks the lead as spam, and Claude never sees it:</w:t>
       </w:r>
     </w:p>
     <w:p>
@@ -1287,13 +1306,13 @@
           <w:bCs/>
           <w:b/>
         </w:rPr>
-        <w:t xml:space="preserve">Region (Worker, instant).</w:t>
-      </w:r>
-      <w:r>
-        <w:t xml:space="preserve"> </w:t>
-      </w:r>
-      <w:r>
-        <w:t xml:space="preserve">Country plus browser time zone, with Cloudflare's IP lookup as a backup (see section 4).</w:t>
+        <w:t xml:space="preserve">ICP check.</w:t>
+      </w:r>
+      <w:r>
+        <w:t xml:space="preserve"> </w:t>
+      </w:r>
+      <w:r>
+        <w:t xml:space="preserve">First the instant rule: 1–5 locations always go to follow-up. Then Claude Haiku 5.5 (max 3 s) answers fit, maybe or not_fit with a confidence score (see section 5). Only a confident fit continues.</w:t>
       </w:r>
     </w:p>
     <w:p>
@@ -1308,13 +1327,13 @@
           <w:bCs/>
           <w:b/>
         </w:rPr>
-        <w:t xml:space="preserve">ICP gate (Claude Haiku 5.5, max 3 s).</w:t>
-      </w:r>
-      <w:r>
-        <w:t xml:space="preserve"> </w:t>
-      </w:r>
-      <w:r>
-        <w:t xml:space="preserve">Fit, maybe or not_fit, with a confidence score (see section 5). Skipped for 1–5 locations, which always go to follow-up.</w:t>
+        <w:t xml:space="preserve">Region → AE.</w:t>
+      </w:r>
+      <w:r>
+        <w:t xml:space="preserve"> </w:t>
+      </w:r>
+      <w:r>
+        <w:t xml:space="preserve">Country plus browser time zone, with Cloudflare's IP lookup as a backup (see section 4). A known region picks the AE's calendar. If the region can't be determined, the lead goes to follow-up (Jill) instead of being routed.</w:t>
       </w:r>
     </w:p>
     <w:p>
@@ -3010,6 +3029,74 @@
             </w:pPr>
             <w:r>
               <w:t xml:space="preserve">The region's AE</w:t>
+            </w:r>
+          </w:p>
+        </w:tc>
+      </w:tr>
+      <w:tr>
+        <w:tc>
+          <w:tcPr/>
+          <w:p>
+            <w:pPr>
+              <w:pStyle w:val="Compact"/>
+              <w:jc w:val="left"/>
+            </w:pPr>
+            <w:r>
+              <w:t xml:space="preserve">Confident fit, but the region can't be determined</w:t>
+            </w:r>
+          </w:p>
+        </w:tc>
+        <w:tc>
+          <w:tcPr/>
+          <w:p>
+            <w:pPr>
+              <w:pStyle w:val="Compact"/>
+              <w:jc w:val="left"/>
+            </w:pPr>
+            <w:r>
+              <w:t xml:space="preserve">Thank-you popup</w:t>
+            </w:r>
+          </w:p>
+        </w:tc>
+        <w:tc>
+          <w:tcPr/>
+          <w:p>
+            <w:pPr>
+              <w:pStyle w:val="Compact"/>
+              <w:jc w:val="left"/>
+            </w:pPr>
+            <w:r>
+              <w:rPr>
+                <w:rStyle w:val="VerbatimChar"/>
+              </w:rPr>
+              <w:t xml:space="preserve">follow_up</w:t>
+            </w:r>
+            <w:r>
+              <w:t xml:space="preserve"> </w:t>
+            </w:r>
+            <w:r>
+              <w:t xml:space="preserve">(</w:t>
+            </w:r>
+            <w:r>
+              <w:rPr>
+                <w:rStyle w:val="VerbatimChar"/>
+              </w:rPr>
+              <w:t xml:space="preserve">reason: region unknown</w:t>
+            </w:r>
+            <w:r>
+              <w:t xml:space="preserve">)</w:t>
+            </w:r>
+          </w:p>
+        </w:tc>
+        <w:tc>
+          <w:tcPr/>
+          <w:p>
+            <w:pPr>
+              <w:pStyle w:val="Compact"/>
+              <w:jc w:val="left"/>
+            </w:pPr>
+            <w:r>
+              <w:t xml:space="preserve">Jill</w:t>
             </w:r>
           </w:p>
         </w:tc>

</xml_diff>

<commit_message>
Always route a confident ICP fit: guess an unclear region
When the form's country, time zone and IP don't settle the region, guess it
from the IP country, then Claude's guess of the company's HQ (new hq_region
field in the existing ICP check), then East. Replaces the 'unknown region
means follow-up' rule. Guessed regions are flagged region_guessed in Zapier
and the logs.

Co-Authored-By: Claude Opus 5.5 <noreply@anthropic.com>
Claude-Session: https://claude.ai/code/session_016MSitiN4QkJHe8WqEGz9RU
</commit_message>
<xml_diff>
--- a/lead-routing/Momos Lead Routing - Technical Documentation.docx
+++ b/lead-routing/Momos Lead Routing - Technical Documentation.docx
@@ -1333,7 +1333,47 @@
         <w:t xml:space="preserve"> </w:t>
       </w:r>
       <w:r>
-        <w:t xml:space="preserve">Country plus browser time zone, with Cloudflare's IP lookup as a backup (see section 4). A known region picks the AE's calendar. If the region can't be determined, the lead goes to follow-up (Jill) instead of being routed.</w:t>
+        <w:t xml:space="preserve">Country plus browser time zone, with Cloudflare's IP lookup as a backup (see section 4).</w:t>
+      </w:r>
+      <w:r>
+        <w:t xml:space="preserve"> </w:t>
+      </w:r>
+      <w:r>
+        <w:rPr>
+          <w:bCs/>
+          <w:b/>
+        </w:rPr>
+        <w:t xml:space="preserve">A confident fit is always routed.</w:t>
+      </w:r>
+      <w:r>
+        <w:t xml:space="preserve"> </w:t>
+      </w:r>
+      <w:r>
+        <w:t xml:space="preserve">If those clues don't settle the region (e.g. country "Other" with no usable time zone, or a US lead whose computer is on a non-US time zone), the Worker guesses it in this order: the visitor's IP location (country, and the state in North America), then Claude's guess of the company's HQ (</w:t>
+      </w:r>
+      <w:r>
+        <w:rPr>
+          <w:rStyle w:val="VerbatimChar"/>
+        </w:rPr>
+        <w:t xml:space="preserve">hq_region</w:t>
+      </w:r>
+      <w:r>
+        <w:t xml:space="preserve"> </w:t>
+      </w:r>
+      <w:r>
+        <w:t xml:space="preserve">from the ICP check), then East (Jill). Guessed regions are flagged</w:t>
+      </w:r>
+      <w:r>
+        <w:t xml:space="preserve"> </w:t>
+      </w:r>
+      <w:r>
+        <w:rPr>
+          <w:rStyle w:val="VerbatimChar"/>
+        </w:rPr>
+        <w:t xml:space="preserve">routing.region_guessed = true</w:t>
+      </w:r>
+      <w:r>
+        <w:t xml:space="preserve">.</w:t>
       </w:r>
     </w:p>
     <w:p>
@@ -3033,74 +3073,6 @@
           </w:p>
         </w:tc>
       </w:tr>
-      <w:tr>
-        <w:tc>
-          <w:tcPr/>
-          <w:p>
-            <w:pPr>
-              <w:pStyle w:val="Compact"/>
-              <w:jc w:val="left"/>
-            </w:pPr>
-            <w:r>
-              <w:t xml:space="preserve">Confident fit, but the region can't be determined</w:t>
-            </w:r>
-          </w:p>
-        </w:tc>
-        <w:tc>
-          <w:tcPr/>
-          <w:p>
-            <w:pPr>
-              <w:pStyle w:val="Compact"/>
-              <w:jc w:val="left"/>
-            </w:pPr>
-            <w:r>
-              <w:t xml:space="preserve">Thank-you popup</w:t>
-            </w:r>
-          </w:p>
-        </w:tc>
-        <w:tc>
-          <w:tcPr/>
-          <w:p>
-            <w:pPr>
-              <w:pStyle w:val="Compact"/>
-              <w:jc w:val="left"/>
-            </w:pPr>
-            <w:r>
-              <w:rPr>
-                <w:rStyle w:val="VerbatimChar"/>
-              </w:rPr>
-              <w:t xml:space="preserve">follow_up</w:t>
-            </w:r>
-            <w:r>
-              <w:t xml:space="preserve"> </w:t>
-            </w:r>
-            <w:r>
-              <w:t xml:space="preserve">(</w:t>
-            </w:r>
-            <w:r>
-              <w:rPr>
-                <w:rStyle w:val="VerbatimChar"/>
-              </w:rPr>
-              <w:t xml:space="preserve">reason: region unknown</w:t>
-            </w:r>
-            <w:r>
-              <w:t xml:space="preserve">)</w:t>
-            </w:r>
-          </w:p>
-        </w:tc>
-        <w:tc>
-          <w:tcPr/>
-          <w:p>
-            <w:pPr>
-              <w:pStyle w:val="Compact"/>
-              <w:jc w:val="left"/>
-            </w:pPr>
-            <w:r>
-              <w:t xml:space="preserve">Jill</w:t>
-            </w:r>
-          </w:p>
-        </w:tc>
-      </w:tr>
     </w:tbl>
     <w:p>
       <w:pPr>
@@ -4426,6 +4398,42 @@
           <w:rStyle w:val="StringTok"/>
         </w:rPr>
         <w:t xml:space="preserve">"us_west | us_east | emea | apac | unknown"</w:t>
+      </w:r>
+      <w:r>
+        <w:rPr>
+          <w:rStyle w:val="FunctionTok"/>
+        </w:rPr>
+        <w:t xml:space="preserve">,</w:t>
+      </w:r>
+      <w:r>
+        <w:rPr>
+          <w:rStyle w:val="NormalTok"/>
+        </w:rPr>
+        <w:t xml:space="preserve"> </w:t>
+      </w:r>
+      <w:r>
+        <w:rPr>
+          <w:rStyle w:val="DataTypeTok"/>
+        </w:rPr>
+        <w:t xml:space="preserve">"region_guessed"</w:t>
+      </w:r>
+      <w:r>
+        <w:rPr>
+          <w:rStyle w:val="FunctionTok"/>
+        </w:rPr>
+        <w:t xml:space="preserve">:</w:t>
+      </w:r>
+      <w:r>
+        <w:rPr>
+          <w:rStyle w:val="NormalTok"/>
+        </w:rPr>
+        <w:t xml:space="preserve"> </w:t>
+      </w:r>
+      <w:r>
+        <w:rPr>
+          <w:rStyle w:val="KeywordTok"/>
+        </w:rPr>
+        <w:t xml:space="preserve">false</w:t>
       </w:r>
       <w:r>
         <w:rPr>
@@ -8190,7 +8198,7 @@
         <w:t xml:space="preserve"> </w:t>
       </w:r>
       <w:r>
-        <w:t xml:space="preserve">(no names or emails): company, status, reason, region, form_country, timezone, ip_country, ip_region, ae, icp_fit, confidence, fit_reason, fit_error, total_ms, claude_ms.</w:t>
+        <w:t xml:space="preserve">(no names or emails): company, status, reason, region, form_country, timezone, ip_country, ip_region, region_guessed, ae, icp_fit, confidence, fit_reason, fit_error, total_ms, claude_ms.</w:t>
       </w:r>
     </w:p>
     <w:p>

</xml_diff>